<commit_message>
docs: agregar evidencias de pruebas tecnicas de SOL3, TAR2 y TAR3
</commit_message>
<xml_diff>
--- a/Pruebas Tecnicas/1. Documento_de_Evidencia_de_Pruebas_Tecnicas_Primer_Sprint.docx
+++ b/Pruebas Tecnicas/1. Documento_de_Evidencia_de_Pruebas_Tecnicas_Primer_Sprint.docx
@@ -12960,6 +12960,40 @@
                 <w:lang w:val="es-US"/>
               </w:rPr>
             </w:pPr>
+            <w:r>
+              <w:drawing>
+                <wp:inline xmlns:a="http://schemas.openxmlformats.org/drawingml/2006/main" xmlns:pic="http://schemas.openxmlformats.org/drawingml/2006/picture">
+                  <wp:extent cx="3204000" cy="1376484"/>
+                  <wp:docPr id="6" name="Picture 6"/>
+                  <wp:cNvGraphicFramePr>
+                    <a:graphicFrameLocks noChangeAspect="1"/>
+                  </wp:cNvGraphicFramePr>
+                  <a:graphic>
+                    <a:graphicData uri="http://schemas.openxmlformats.org/drawingml/2006/picture">
+                      <pic:pic>
+                        <pic:nvPicPr>
+                          <pic:cNvPr id="0" name="sol3_listar.png"/>
+                          <pic:cNvPicPr/>
+                        </pic:nvPicPr>
+                        <pic:blipFill>
+                          <a:blip r:embed="rId15"/>
+                          <a:stretch>
+                            <a:fillRect/>
+                          </a:stretch>
+                        </pic:blipFill>
+                        <pic:spPr>
+                          <a:xfrm>
+                            <a:off x="0" y="0"/>
+                            <a:ext cx="3204000" cy="1376484"/>
+                          </a:xfrm>
+                          <a:prstGeom prst="rect"/>
+                        </pic:spPr>
+                      </pic:pic>
+                    </a:graphicData>
+                  </a:graphic>
+                </wp:inline>
+              </w:drawing>
+            </w:r>
           </w:p>
         </w:tc>
       </w:tr>
@@ -13055,6 +13089,76 @@
                 <w:lang w:val="es-US"/>
               </w:rPr>
             </w:pPr>
+            <w:r>
+              <w:drawing>
+                <wp:inline xmlns:a="http://schemas.openxmlformats.org/drawingml/2006/main" xmlns:pic="http://schemas.openxmlformats.org/drawingml/2006/picture">
+                  <wp:extent cx="3204000" cy="1376484"/>
+                  <wp:docPr id="7" name="Picture 7"/>
+                  <wp:cNvGraphicFramePr>
+                    <a:graphicFrameLocks noChangeAspect="1"/>
+                  </wp:cNvGraphicFramePr>
+                  <a:graphic>
+                    <a:graphicData uri="http://schemas.openxmlformats.org/drawingml/2006/picture">
+                      <pic:pic>
+                        <pic:nvPicPr>
+                          <pic:cNvPr id="0" name="sol3_crear_form.png"/>
+                          <pic:cNvPicPr/>
+                        </pic:nvPicPr>
+                        <pic:blipFill>
+                          <a:blip r:embed="rId16"/>
+                          <a:stretch>
+                            <a:fillRect/>
+                          </a:stretch>
+                        </pic:blipFill>
+                        <pic:spPr>
+                          <a:xfrm>
+                            <a:off x="0" y="0"/>
+                            <a:ext cx="3204000" cy="1376484"/>
+                          </a:xfrm>
+                          <a:prstGeom prst="rect"/>
+                        </pic:spPr>
+                      </pic:pic>
+                    </a:graphicData>
+                  </a:graphic>
+                </wp:inline>
+              </w:drawing>
+            </w:r>
+          </w:p>
+          <w:p>
+            <w:r>
+              <w:drawing>
+                <wp:inline xmlns:a="http://schemas.openxmlformats.org/drawingml/2006/main" xmlns:pic="http://schemas.openxmlformats.org/drawingml/2006/picture">
+                  <wp:extent cx="3204000" cy="1376484"/>
+                  <wp:docPr id="8" name="Picture 8"/>
+                  <wp:cNvGraphicFramePr>
+                    <a:graphicFrameLocks noChangeAspect="1"/>
+                  </wp:cNvGraphicFramePr>
+                  <a:graphic>
+                    <a:graphicData uri="http://schemas.openxmlformats.org/drawingml/2006/picture">
+                      <pic:pic>
+                        <pic:nvPicPr>
+                          <pic:cNvPr id="0" name="sol3_crear.png"/>
+                          <pic:cNvPicPr/>
+                        </pic:nvPicPr>
+                        <pic:blipFill>
+                          <a:blip r:embed="rId17"/>
+                          <a:stretch>
+                            <a:fillRect/>
+                          </a:stretch>
+                        </pic:blipFill>
+                        <pic:spPr>
+                          <a:xfrm>
+                            <a:off x="0" y="0"/>
+                            <a:ext cx="3204000" cy="1376484"/>
+                          </a:xfrm>
+                          <a:prstGeom prst="rect"/>
+                        </pic:spPr>
+                      </pic:pic>
+                    </a:graphicData>
+                  </a:graphic>
+                </wp:inline>
+              </w:drawing>
+            </w:r>
           </w:p>
         </w:tc>
       </w:tr>
@@ -13158,6 +13262,40 @@
                 <w:lang w:val="es-US"/>
               </w:rPr>
             </w:pPr>
+            <w:r>
+              <w:drawing>
+                <wp:inline xmlns:a="http://schemas.openxmlformats.org/drawingml/2006/main" xmlns:pic="http://schemas.openxmlformats.org/drawingml/2006/picture">
+                  <wp:extent cx="3204000" cy="1376484"/>
+                  <wp:docPr id="9" name="Picture 9"/>
+                  <wp:cNvGraphicFramePr>
+                    <a:graphicFrameLocks noChangeAspect="1"/>
+                  </wp:cNvGraphicFramePr>
+                  <a:graphic>
+                    <a:graphicData uri="http://schemas.openxmlformats.org/drawingml/2006/picture">
+                      <pic:pic>
+                        <pic:nvPicPr>
+                          <pic:cNvPr id="0" name="sol3_editar_ok.png"/>
+                          <pic:cNvPicPr/>
+                        </pic:nvPicPr>
+                        <pic:blipFill>
+                          <a:blip r:embed="rId18"/>
+                          <a:stretch>
+                            <a:fillRect/>
+                          </a:stretch>
+                        </pic:blipFill>
+                        <pic:spPr>
+                          <a:xfrm>
+                            <a:off x="0" y="0"/>
+                            <a:ext cx="3204000" cy="1376484"/>
+                          </a:xfrm>
+                          <a:prstGeom prst="rect"/>
+                        </pic:spPr>
+                      </pic:pic>
+                    </a:graphicData>
+                  </a:graphic>
+                </wp:inline>
+              </w:drawing>
+            </w:r>
           </w:p>
         </w:tc>
       </w:tr>
@@ -13261,6 +13399,76 @@
                 <w:lang w:val="es-US"/>
               </w:rPr>
             </w:pPr>
+            <w:r>
+              <w:drawing>
+                <wp:inline xmlns:a="http://schemas.openxmlformats.org/drawingml/2006/main" xmlns:pic="http://schemas.openxmlformats.org/drawingml/2006/picture">
+                  <wp:extent cx="3204000" cy="1376484"/>
+                  <wp:docPr id="10" name="Picture 10"/>
+                  <wp:cNvGraphicFramePr>
+                    <a:graphicFrameLocks noChangeAspect="1"/>
+                  </wp:cNvGraphicFramePr>
+                  <a:graphic>
+                    <a:graphicData uri="http://schemas.openxmlformats.org/drawingml/2006/picture">
+                      <pic:pic>
+                        <pic:nvPicPr>
+                          <pic:cNvPr id="0" name="sol3_eliminar_dialogo.png"/>
+                          <pic:cNvPicPr/>
+                        </pic:nvPicPr>
+                        <pic:blipFill>
+                          <a:blip r:embed="rId19"/>
+                          <a:stretch>
+                            <a:fillRect/>
+                          </a:stretch>
+                        </pic:blipFill>
+                        <pic:spPr>
+                          <a:xfrm>
+                            <a:off x="0" y="0"/>
+                            <a:ext cx="3204000" cy="1376484"/>
+                          </a:xfrm>
+                          <a:prstGeom prst="rect"/>
+                        </pic:spPr>
+                      </pic:pic>
+                    </a:graphicData>
+                  </a:graphic>
+                </wp:inline>
+              </w:drawing>
+            </w:r>
+          </w:p>
+          <w:p>
+            <w:r>
+              <w:drawing>
+                <wp:inline xmlns:a="http://schemas.openxmlformats.org/drawingml/2006/main" xmlns:pic="http://schemas.openxmlformats.org/drawingml/2006/picture">
+                  <wp:extent cx="3204000" cy="1377202"/>
+                  <wp:docPr id="11" name="Picture 11"/>
+                  <wp:cNvGraphicFramePr>
+                    <a:graphicFrameLocks noChangeAspect="1"/>
+                  </wp:cNvGraphicFramePr>
+                  <a:graphic>
+                    <a:graphicData uri="http://schemas.openxmlformats.org/drawingml/2006/picture">
+                      <pic:pic>
+                        <pic:nvPicPr>
+                          <pic:cNvPr id="0" name="sol3_eliminar_ok.png"/>
+                          <pic:cNvPicPr/>
+                        </pic:nvPicPr>
+                        <pic:blipFill>
+                          <a:blip r:embed="rId20"/>
+                          <a:stretch>
+                            <a:fillRect/>
+                          </a:stretch>
+                        </pic:blipFill>
+                        <pic:spPr>
+                          <a:xfrm>
+                            <a:off x="0" y="0"/>
+                            <a:ext cx="3204000" cy="1377202"/>
+                          </a:xfrm>
+                          <a:prstGeom prst="rect"/>
+                        </pic:spPr>
+                      </pic:pic>
+                    </a:graphicData>
+                  </a:graphic>
+                </wp:inline>
+              </w:drawing>
+            </w:r>
           </w:p>
         </w:tc>
       </w:tr>
@@ -13356,6 +13564,40 @@
                 <w:lang w:val="es-US"/>
               </w:rPr>
             </w:pPr>
+            <w:r>
+              <w:drawing>
+                <wp:inline xmlns:a="http://schemas.openxmlformats.org/drawingml/2006/main" xmlns:pic="http://schemas.openxmlformats.org/drawingml/2006/picture">
+                  <wp:extent cx="3204000" cy="1376484"/>
+                  <wp:docPr id="12" name="Picture 12"/>
+                  <wp:cNvGraphicFramePr>
+                    <a:graphicFrameLocks noChangeAspect="1"/>
+                  </wp:cNvGraphicFramePr>
+                  <a:graphic>
+                    <a:graphicData uri="http://schemas.openxmlformats.org/drawingml/2006/picture">
+                      <pic:pic>
+                        <pic:nvPicPr>
+                          <pic:cNvPr id="0" name="sol3_crear_form.png"/>
+                          <pic:cNvPicPr/>
+                        </pic:nvPicPr>
+                        <pic:blipFill>
+                          <a:blip r:embed="rId16"/>
+                          <a:stretch>
+                            <a:fillRect/>
+                          </a:stretch>
+                        </pic:blipFill>
+                        <pic:spPr>
+                          <a:xfrm>
+                            <a:off x="0" y="0"/>
+                            <a:ext cx="3204000" cy="1376484"/>
+                          </a:xfrm>
+                          <a:prstGeom prst="rect"/>
+                        </pic:spPr>
+                      </pic:pic>
+                    </a:graphicData>
+                  </a:graphic>
+                </wp:inline>
+              </w:drawing>
+            </w:r>
           </w:p>
         </w:tc>
       </w:tr>
@@ -13452,6 +13694,40 @@
                 <w:lang w:val="es-US"/>
               </w:rPr>
             </w:pPr>
+            <w:r>
+              <w:drawing>
+                <wp:inline xmlns:a="http://schemas.openxmlformats.org/drawingml/2006/main" xmlns:pic="http://schemas.openxmlformats.org/drawingml/2006/picture">
+                  <wp:extent cx="3204000" cy="2747238"/>
+                  <wp:docPr id="13" name="Picture 13"/>
+                  <wp:cNvGraphicFramePr>
+                    <a:graphicFrameLocks noChangeAspect="1"/>
+                  </wp:cNvGraphicFramePr>
+                  <a:graphic>
+                    <a:graphicData uri="http://schemas.openxmlformats.org/drawingml/2006/picture">
+                      <pic:pic>
+                        <pic:nvPicPr>
+                          <pic:cNvPr id="0" name="sol3_paginacion.png"/>
+                          <pic:cNvPicPr/>
+                        </pic:nvPicPr>
+                        <pic:blipFill>
+                          <a:blip r:embed="rId21"/>
+                          <a:stretch>
+                            <a:fillRect/>
+                          </a:stretch>
+                        </pic:blipFill>
+                        <pic:spPr>
+                          <a:xfrm>
+                            <a:off x="0" y="0"/>
+                            <a:ext cx="3204000" cy="2747238"/>
+                          </a:xfrm>
+                          <a:prstGeom prst="rect"/>
+                        </pic:spPr>
+                      </pic:pic>
+                    </a:graphicData>
+                  </a:graphic>
+                </wp:inline>
+              </w:drawing>
+            </w:r>
           </w:p>
         </w:tc>
       </w:tr>
@@ -13547,6 +13823,40 @@
                 <w:lang w:val="es-US"/>
               </w:rPr>
             </w:pPr>
+            <w:r>
+              <w:drawing>
+                <wp:inline xmlns:a="http://schemas.openxmlformats.org/drawingml/2006/main" xmlns:pic="http://schemas.openxmlformats.org/drawingml/2006/picture">
+                  <wp:extent cx="3204000" cy="2022693"/>
+                  <wp:docPr id="14" name="Picture 14"/>
+                  <wp:cNvGraphicFramePr>
+                    <a:graphicFrameLocks noChangeAspect="1"/>
+                  </wp:cNvGraphicFramePr>
+                  <a:graphic>
+                    <a:graphicData uri="http://schemas.openxmlformats.org/drawingml/2006/picture">
+                      <pic:pic>
+                        <pic:nvPicPr>
+                          <pic:cNvPr id="0" name="sol3_relacionados.png"/>
+                          <pic:cNvPicPr/>
+                        </pic:nvPicPr>
+                        <pic:blipFill>
+                          <a:blip r:embed="rId22"/>
+                          <a:stretch>
+                            <a:fillRect/>
+                          </a:stretch>
+                        </pic:blipFill>
+                        <pic:spPr>
+                          <a:xfrm>
+                            <a:off x="0" y="0"/>
+                            <a:ext cx="3204000" cy="2022693"/>
+                          </a:xfrm>
+                          <a:prstGeom prst="rect"/>
+                        </pic:spPr>
+                      </pic:pic>
+                    </a:graphicData>
+                  </a:graphic>
+                </wp:inline>
+              </w:drawing>
+            </w:r>
           </w:p>
         </w:tc>
       </w:tr>
@@ -20610,6 +20920,40 @@
                 <w:lang w:val="es-US"/>
               </w:rPr>
             </w:pPr>
+            <w:r>
+              <w:drawing>
+                <wp:inline xmlns:a="http://schemas.openxmlformats.org/drawingml/2006/main" xmlns:pic="http://schemas.openxmlformats.org/drawingml/2006/picture">
+                  <wp:extent cx="3204000" cy="1377202"/>
+                  <wp:docPr id="15" name="Picture 15"/>
+                  <wp:cNvGraphicFramePr>
+                    <a:graphicFrameLocks noChangeAspect="1"/>
+                  </wp:cNvGraphicFramePr>
+                  <a:graphic>
+                    <a:graphicData uri="http://schemas.openxmlformats.org/drawingml/2006/picture">
+                      <pic:pic>
+                        <pic:nvPicPr>
+                          <pic:cNvPr id="0" name="tar2_reporte.png"/>
+                          <pic:cNvPicPr/>
+                        </pic:nvPicPr>
+                        <pic:blipFill>
+                          <a:blip r:embed="rId23"/>
+                          <a:stretch>
+                            <a:fillRect/>
+                          </a:stretch>
+                        </pic:blipFill>
+                        <pic:spPr>
+                          <a:xfrm>
+                            <a:off x="0" y="0"/>
+                            <a:ext cx="3204000" cy="1377202"/>
+                          </a:xfrm>
+                          <a:prstGeom prst="rect"/>
+                        </pic:spPr>
+                      </pic:pic>
+                    </a:graphicData>
+                  </a:graphic>
+                </wp:inline>
+              </w:drawing>
+            </w:r>
           </w:p>
         </w:tc>
       </w:tr>
@@ -20705,6 +21049,40 @@
                 <w:lang w:val="es-US"/>
               </w:rPr>
             </w:pPr>
+            <w:r>
+              <w:drawing>
+                <wp:inline xmlns:a="http://schemas.openxmlformats.org/drawingml/2006/main" xmlns:pic="http://schemas.openxmlformats.org/drawingml/2006/picture">
+                  <wp:extent cx="3204000" cy="1377202"/>
+                  <wp:docPr id="16" name="Picture 16"/>
+                  <wp:cNvGraphicFramePr>
+                    <a:graphicFrameLocks noChangeAspect="1"/>
+                  </wp:cNvGraphicFramePr>
+                  <a:graphic>
+                    <a:graphicData uri="http://schemas.openxmlformats.org/drawingml/2006/picture">
+                      <pic:pic>
+                        <pic:nvPicPr>
+                          <pic:cNvPr id="0" name="tar2_reporte.png"/>
+                          <pic:cNvPicPr/>
+                        </pic:nvPicPr>
+                        <pic:blipFill>
+                          <a:blip r:embed="rId23"/>
+                          <a:stretch>
+                            <a:fillRect/>
+                          </a:stretch>
+                        </pic:blipFill>
+                        <pic:spPr>
+                          <a:xfrm>
+                            <a:off x="0" y="0"/>
+                            <a:ext cx="3204000" cy="1377202"/>
+                          </a:xfrm>
+                          <a:prstGeom prst="rect"/>
+                        </pic:spPr>
+                      </pic:pic>
+                    </a:graphicData>
+                  </a:graphic>
+                </wp:inline>
+              </w:drawing>
+            </w:r>
           </w:p>
         </w:tc>
       </w:tr>
@@ -20800,6 +21178,40 @@
                 <w:lang w:val="es-US"/>
               </w:rPr>
             </w:pPr>
+            <w:r>
+              <w:drawing>
+                <wp:inline xmlns:a="http://schemas.openxmlformats.org/drawingml/2006/main" xmlns:pic="http://schemas.openxmlformats.org/drawingml/2006/picture">
+                  <wp:extent cx="3204000" cy="1377202"/>
+                  <wp:docPr id="17" name="Picture 17"/>
+                  <wp:cNvGraphicFramePr>
+                    <a:graphicFrameLocks noChangeAspect="1"/>
+                  </wp:cNvGraphicFramePr>
+                  <a:graphic>
+                    <a:graphicData uri="http://schemas.openxmlformats.org/drawingml/2006/picture">
+                      <pic:pic>
+                        <pic:nvPicPr>
+                          <pic:cNvPr id="0" name="tar2_reporte.png"/>
+                          <pic:cNvPicPr/>
+                        </pic:nvPicPr>
+                        <pic:blipFill>
+                          <a:blip r:embed="rId23"/>
+                          <a:stretch>
+                            <a:fillRect/>
+                          </a:stretch>
+                        </pic:blipFill>
+                        <pic:spPr>
+                          <a:xfrm>
+                            <a:off x="0" y="0"/>
+                            <a:ext cx="3204000" cy="1377202"/>
+                          </a:xfrm>
+                          <a:prstGeom prst="rect"/>
+                        </pic:spPr>
+                      </pic:pic>
+                    </a:graphicData>
+                  </a:graphic>
+                </wp:inline>
+              </w:drawing>
+            </w:r>
           </w:p>
         </w:tc>
       </w:tr>
@@ -20895,6 +21307,40 @@
                 <w:lang w:val="es-US"/>
               </w:rPr>
             </w:pPr>
+            <w:r>
+              <w:drawing>
+                <wp:inline xmlns:a="http://schemas.openxmlformats.org/drawingml/2006/main" xmlns:pic="http://schemas.openxmlformats.org/drawingml/2006/picture">
+                  <wp:extent cx="3204000" cy="1377202"/>
+                  <wp:docPr id="18" name="Picture 18"/>
+                  <wp:cNvGraphicFramePr>
+                    <a:graphicFrameLocks noChangeAspect="1"/>
+                  </wp:cNvGraphicFramePr>
+                  <a:graphic>
+                    <a:graphicData uri="http://schemas.openxmlformats.org/drawingml/2006/picture">
+                      <pic:pic>
+                        <pic:nvPicPr>
+                          <pic:cNvPr id="0" name="tar2_reporte.png"/>
+                          <pic:cNvPicPr/>
+                        </pic:nvPicPr>
+                        <pic:blipFill>
+                          <a:blip r:embed="rId23"/>
+                          <a:stretch>
+                            <a:fillRect/>
+                          </a:stretch>
+                        </pic:blipFill>
+                        <pic:spPr>
+                          <a:xfrm>
+                            <a:off x="0" y="0"/>
+                            <a:ext cx="3204000" cy="1377202"/>
+                          </a:xfrm>
+                          <a:prstGeom prst="rect"/>
+                        </pic:spPr>
+                      </pic:pic>
+                    </a:graphicData>
+                  </a:graphic>
+                </wp:inline>
+              </w:drawing>
+            </w:r>
           </w:p>
         </w:tc>
       </w:tr>
@@ -21703,6 +22149,40 @@
                 <w:lang w:val="es-US"/>
               </w:rPr>
             </w:pPr>
+            <w:r>
+              <w:drawing>
+                <wp:inline xmlns:a="http://schemas.openxmlformats.org/drawingml/2006/main" xmlns:pic="http://schemas.openxmlformats.org/drawingml/2006/picture">
+                  <wp:extent cx="3204000" cy="1376484"/>
+                  <wp:docPr id="19" name="Picture 19"/>
+                  <wp:cNvGraphicFramePr>
+                    <a:graphicFrameLocks noChangeAspect="1"/>
+                  </wp:cNvGraphicFramePr>
+                  <a:graphic>
+                    <a:graphicData uri="http://schemas.openxmlformats.org/drawingml/2006/picture">
+                      <pic:pic>
+                        <pic:nvPicPr>
+                          <pic:cNvPr id="0" name="tar3_reporte.png"/>
+                          <pic:cNvPicPr/>
+                        </pic:nvPicPr>
+                        <pic:blipFill>
+                          <a:blip r:embed="rId24"/>
+                          <a:stretch>
+                            <a:fillRect/>
+                          </a:stretch>
+                        </pic:blipFill>
+                        <pic:spPr>
+                          <a:xfrm>
+                            <a:off x="0" y="0"/>
+                            <a:ext cx="3204000" cy="1376484"/>
+                          </a:xfrm>
+                          <a:prstGeom prst="rect"/>
+                        </pic:spPr>
+                      </pic:pic>
+                    </a:graphicData>
+                  </a:graphic>
+                </wp:inline>
+              </w:drawing>
+            </w:r>
           </w:p>
         </w:tc>
       </w:tr>
@@ -21798,6 +22278,40 @@
                 <w:lang w:val="es-US"/>
               </w:rPr>
             </w:pPr>
+            <w:r>
+              <w:drawing>
+                <wp:inline xmlns:a="http://schemas.openxmlformats.org/drawingml/2006/main" xmlns:pic="http://schemas.openxmlformats.org/drawingml/2006/picture">
+                  <wp:extent cx="3204000" cy="1376484"/>
+                  <wp:docPr id="20" name="Picture 20"/>
+                  <wp:cNvGraphicFramePr>
+                    <a:graphicFrameLocks noChangeAspect="1"/>
+                  </wp:cNvGraphicFramePr>
+                  <a:graphic>
+                    <a:graphicData uri="http://schemas.openxmlformats.org/drawingml/2006/picture">
+                      <pic:pic>
+                        <pic:nvPicPr>
+                          <pic:cNvPr id="0" name="tar3_reporte.png"/>
+                          <pic:cNvPicPr/>
+                        </pic:nvPicPr>
+                        <pic:blipFill>
+                          <a:blip r:embed="rId24"/>
+                          <a:stretch>
+                            <a:fillRect/>
+                          </a:stretch>
+                        </pic:blipFill>
+                        <pic:spPr>
+                          <a:xfrm>
+                            <a:off x="0" y="0"/>
+                            <a:ext cx="3204000" cy="1376484"/>
+                          </a:xfrm>
+                          <a:prstGeom prst="rect"/>
+                        </pic:spPr>
+                      </pic:pic>
+                    </a:graphicData>
+                  </a:graphic>
+                </wp:inline>
+              </w:drawing>
+            </w:r>
           </w:p>
         </w:tc>
       </w:tr>
@@ -21893,6 +22407,40 @@
                 <w:lang w:val="es-US"/>
               </w:rPr>
             </w:pPr>
+            <w:r>
+              <w:drawing>
+                <wp:inline xmlns:a="http://schemas.openxmlformats.org/drawingml/2006/main" xmlns:pic="http://schemas.openxmlformats.org/drawingml/2006/picture">
+                  <wp:extent cx="3204000" cy="1376484"/>
+                  <wp:docPr id="21" name="Picture 21"/>
+                  <wp:cNvGraphicFramePr>
+                    <a:graphicFrameLocks noChangeAspect="1"/>
+                  </wp:cNvGraphicFramePr>
+                  <a:graphic>
+                    <a:graphicData uri="http://schemas.openxmlformats.org/drawingml/2006/picture">
+                      <pic:pic>
+                        <pic:nvPicPr>
+                          <pic:cNvPr id="0" name="tar3_reporte.png"/>
+                          <pic:cNvPicPr/>
+                        </pic:nvPicPr>
+                        <pic:blipFill>
+                          <a:blip r:embed="rId24"/>
+                          <a:stretch>
+                            <a:fillRect/>
+                          </a:stretch>
+                        </pic:blipFill>
+                        <pic:spPr>
+                          <a:xfrm>
+                            <a:off x="0" y="0"/>
+                            <a:ext cx="3204000" cy="1376484"/>
+                          </a:xfrm>
+                          <a:prstGeom prst="rect"/>
+                        </pic:spPr>
+                      </pic:pic>
+                    </a:graphicData>
+                  </a:graphic>
+                </wp:inline>
+              </w:drawing>
+            </w:r>
           </w:p>
         </w:tc>
       </w:tr>
@@ -21997,6 +22545,40 @@
                 <w:lang w:val="es-US"/>
               </w:rPr>
             </w:pPr>
+            <w:r>
+              <w:drawing>
+                <wp:inline xmlns:a="http://schemas.openxmlformats.org/drawingml/2006/main" xmlns:pic="http://schemas.openxmlformats.org/drawingml/2006/picture">
+                  <wp:extent cx="3204000" cy="1376484"/>
+                  <wp:docPr id="22" name="Picture 22"/>
+                  <wp:cNvGraphicFramePr>
+                    <a:graphicFrameLocks noChangeAspect="1"/>
+                  </wp:cNvGraphicFramePr>
+                  <a:graphic>
+                    <a:graphicData uri="http://schemas.openxmlformats.org/drawingml/2006/picture">
+                      <pic:pic>
+                        <pic:nvPicPr>
+                          <pic:cNvPr id="0" name="tar3_reporte.png"/>
+                          <pic:cNvPicPr/>
+                        </pic:nvPicPr>
+                        <pic:blipFill>
+                          <a:blip r:embed="rId24"/>
+                          <a:stretch>
+                            <a:fillRect/>
+                          </a:stretch>
+                        </pic:blipFill>
+                        <pic:spPr>
+                          <a:xfrm>
+                            <a:off x="0" y="0"/>
+                            <a:ext cx="3204000" cy="1376484"/>
+                          </a:xfrm>
+                          <a:prstGeom prst="rect"/>
+                        </pic:spPr>
+                      </pic:pic>
+                    </a:graphicData>
+                  </a:graphic>
+                </wp:inline>
+              </w:drawing>
+            </w:r>
           </w:p>
         </w:tc>
       </w:tr>

</xml_diff>

<commit_message>
docs: Documentacion de pruebas técnicas de administración de usuarios
</commit_message>
<xml_diff>
--- a/Pruebas Tecnicas/1. Documento_de_Evidencia_de_Pruebas_Tecnicas_Primer_Sprint.docx
+++ b/Pruebas Tecnicas/1. Documento_de_Evidencia_de_Pruebas_Tecnicas_Primer_Sprint.docx
@@ -7515,6 +7515,80 @@
               </w:rPr>
             </w:r>
             <w:r>
+              <mc:AlternateContent>
+                <mc:Choice Requires="wpg">
+                  <w:drawing>
+                    <wp:inline xmlns:wp="http://schemas.openxmlformats.org/drawingml/2006/wordprocessingDrawing" distT="0" distB="0" distL="0" distR="0">
+                      <wp:extent cx="3387312" cy="1317401"/>
+                      <wp:effectExtent l="0" t="0" r="0" b="0"/>
+                      <wp:docPr id="5" name=""/>
+                      <wp:cNvGraphicFramePr>
+                        <a:graphicFrameLocks xmlns:a="http://schemas.openxmlformats.org/drawingml/2006/main" noChangeAspect="1"/>
+                      </wp:cNvGraphicFramePr>
+                      <a:graphic xmlns:a="http://schemas.openxmlformats.org/drawingml/2006/main">
+                        <a:graphicData uri="http://schemas.openxmlformats.org/drawingml/2006/picture">
+                          <pic:pic xmlns:pic="http://schemas.openxmlformats.org/drawingml/2006/picture">
+                            <pic:nvPicPr>
+                              <pic:cNvPr id="678721232" name=""/>
+                              <pic:cNvPicPr>
+                                <a:picLocks noChangeAspect="1"/>
+                              </pic:cNvPicPr>
+                              <pic:nvPr/>
+                            </pic:nvPicPr>
+                            <pic:blipFill rotWithShape="1">
+                              <a:blip r:embed="rId15"/>
+                              <a:stretch/>
+                            </pic:blipFill>
+                            <pic:spPr bwMode="auto">
+                              <a:xfrm flipH="0" flipV="0">
+                                <a:off x="0" y="0"/>
+                                <a:ext cx="3387312" cy="1317401"/>
+                              </a:xfrm>
+                              <a:prstGeom prst="rect">
+                                <a:avLst/>
+                              </a:prstGeom>
+                            </pic:spPr>
+                          </pic:pic>
+                        </a:graphicData>
+                      </a:graphic>
+                    </wp:inline>
+                  </w:drawing>
+                </mc:Choice>
+                <mc:Fallback>
+                  <w:pict>
+                    <v:shapetype id="_x0000_t75" coordsize="21600,21600" o:spt="75" o:preferrelative="t" path="m@4@5l@4@11@9@11@9@5xe" filled="f" stroked="f">
+                      <v:stroke joinstyle="miter"/>
+                      <v:formulas>
+                        <v:f eqn="if lineDrawn pixelLineWidth 0"/>
+                        <v:f eqn="sum @0 1 0"/>
+                        <v:f eqn="sum 0 0 @1"/>
+                        <v:f eqn="prod @2 1 2"/>
+                        <v:f eqn="prod @3 21600 pixelWidth"/>
+                        <v:f eqn="prod @3 21600 pixelHeight"/>
+                        <v:f eqn="sum @0 0 1"/>
+                        <v:f eqn="prod @6 1 2"/>
+                        <v:f eqn="prod @7 21600 pixelWidth"/>
+                        <v:f eqn="sum @8 21600 0"/>
+                        <v:f eqn="prod @7 21600 pixelHeight"/>
+                        <v:f eqn="sum @10 21600 0"/>
+                      </v:formulas>
+                      <v:path o:extrusionok="f" gradientshapeok="t" o:connecttype="rect"/>
+                      <o:lock v:ext="edit" aspectratio="t"/>
+                    </v:shapetype>
+                    <v:shape id="_x0000_i4" o:spid="_x0000_s4" type="#_x0000_t75" style="width:266.72pt;height:103.73pt;mso-wrap-distance-left:0.00pt;mso-wrap-distance-top:0.00pt;mso-wrap-distance-right:0.00pt;mso-wrap-distance-bottom:0.00pt;z-index:1;" stroked="false">
+                      <v:imagedata r:id="rId15" o:title=""/>
+                      <o:lock v:ext="edit" rotation="t"/>
+                    </v:shape>
+                  </w:pict>
+                </mc:Fallback>
+              </mc:AlternateContent>
+            </w:r>
+            <w:r>
+              <w:rPr>
+                <w:lang w:val="es-US"/>
+              </w:rPr>
+            </w:r>
+            <w:r>
               <w:rPr>
                 <w:lang w:val="es-US"/>
               </w:rPr>
@@ -7634,6 +7708,80 @@
               </w:rPr>
             </w:r>
             <w:r>
+              <mc:AlternateContent>
+                <mc:Choice Requires="wpg">
+                  <w:drawing>
+                    <wp:inline xmlns:wp="http://schemas.openxmlformats.org/drawingml/2006/wordprocessingDrawing" distT="0" distB="0" distL="0" distR="0">
+                      <wp:extent cx="3413218" cy="1345222"/>
+                      <wp:effectExtent l="0" t="0" r="0" b="0"/>
+                      <wp:docPr id="6" name=""/>
+                      <wp:cNvGraphicFramePr>
+                        <a:graphicFrameLocks xmlns:a="http://schemas.openxmlformats.org/drawingml/2006/main" noChangeAspect="1"/>
+                      </wp:cNvGraphicFramePr>
+                      <a:graphic xmlns:a="http://schemas.openxmlformats.org/drawingml/2006/main">
+                        <a:graphicData uri="http://schemas.openxmlformats.org/drawingml/2006/picture">
+                          <pic:pic xmlns:pic="http://schemas.openxmlformats.org/drawingml/2006/picture">
+                            <pic:nvPicPr>
+                              <pic:cNvPr id="1830923836" name=""/>
+                              <pic:cNvPicPr>
+                                <a:picLocks noChangeAspect="1"/>
+                              </pic:cNvPicPr>
+                              <pic:nvPr/>
+                            </pic:nvPicPr>
+                            <pic:blipFill rotWithShape="1">
+                              <a:blip r:embed="rId16"/>
+                              <a:stretch/>
+                            </pic:blipFill>
+                            <pic:spPr bwMode="auto">
+                              <a:xfrm flipH="0" flipV="0">
+                                <a:off x="0" y="0"/>
+                                <a:ext cx="3413218" cy="1345221"/>
+                              </a:xfrm>
+                              <a:prstGeom prst="rect">
+                                <a:avLst/>
+                              </a:prstGeom>
+                            </pic:spPr>
+                          </pic:pic>
+                        </a:graphicData>
+                      </a:graphic>
+                    </wp:inline>
+                  </w:drawing>
+                </mc:Choice>
+                <mc:Fallback>
+                  <w:pict>
+                    <v:shapetype id="_x0000_t75" coordsize="21600,21600" o:spt="75" o:preferrelative="t" path="m@4@5l@4@11@9@11@9@5xe" filled="f" stroked="f">
+                      <v:stroke joinstyle="miter"/>
+                      <v:formulas>
+                        <v:f eqn="if lineDrawn pixelLineWidth 0"/>
+                        <v:f eqn="sum @0 1 0"/>
+                        <v:f eqn="sum 0 0 @1"/>
+                        <v:f eqn="prod @2 1 2"/>
+                        <v:f eqn="prod @3 21600 pixelWidth"/>
+                        <v:f eqn="prod @3 21600 pixelHeight"/>
+                        <v:f eqn="sum @0 0 1"/>
+                        <v:f eqn="prod @6 1 2"/>
+                        <v:f eqn="prod @7 21600 pixelWidth"/>
+                        <v:f eqn="sum @8 21600 0"/>
+                        <v:f eqn="prod @7 21600 pixelHeight"/>
+                        <v:f eqn="sum @10 21600 0"/>
+                      </v:formulas>
+                      <v:path o:extrusionok="f" gradientshapeok="t" o:connecttype="rect"/>
+                      <o:lock v:ext="edit" aspectratio="t"/>
+                    </v:shapetype>
+                    <v:shape id="_x0000_i5" o:spid="_x0000_s5" type="#_x0000_t75" style="width:268.76pt;height:105.92pt;mso-wrap-distance-left:0.00pt;mso-wrap-distance-top:0.00pt;mso-wrap-distance-right:0.00pt;mso-wrap-distance-bottom:0.00pt;z-index:1;" stroked="false">
+                      <v:imagedata r:id="rId16" o:title=""/>
+                      <o:lock v:ext="edit" rotation="t"/>
+                    </v:shape>
+                  </w:pict>
+                </mc:Fallback>
+              </mc:AlternateContent>
+            </w:r>
+            <w:r>
+              <w:rPr>
+                <w:lang w:val="es-US"/>
+              </w:rPr>
+            </w:r>
+            <w:r>
               <w:rPr>
                 <w:lang w:val="es-US"/>
               </w:rPr>
@@ -7761,6 +7909,80 @@
               </w:rPr>
             </w:r>
             <w:r>
+              <mc:AlternateContent>
+                <mc:Choice Requires="wpg">
+                  <w:drawing>
+                    <wp:inline xmlns:wp="http://schemas.openxmlformats.org/drawingml/2006/wordprocessingDrawing" distT="0" distB="0" distL="0" distR="0">
+                      <wp:extent cx="3413218" cy="1341126"/>
+                      <wp:effectExtent l="0" t="0" r="0" b="0"/>
+                      <wp:docPr id="7" name=""/>
+                      <wp:cNvGraphicFramePr>
+                        <a:graphicFrameLocks xmlns:a="http://schemas.openxmlformats.org/drawingml/2006/main" noChangeAspect="1"/>
+                      </wp:cNvGraphicFramePr>
+                      <a:graphic xmlns:a="http://schemas.openxmlformats.org/drawingml/2006/main">
+                        <a:graphicData uri="http://schemas.openxmlformats.org/drawingml/2006/picture">
+                          <pic:pic xmlns:pic="http://schemas.openxmlformats.org/drawingml/2006/picture">
+                            <pic:nvPicPr>
+                              <pic:cNvPr id="1142816657" name=""/>
+                              <pic:cNvPicPr>
+                                <a:picLocks noChangeAspect="1"/>
+                              </pic:cNvPicPr>
+                              <pic:nvPr/>
+                            </pic:nvPicPr>
+                            <pic:blipFill rotWithShape="1">
+                              <a:blip r:embed="rId17"/>
+                              <a:stretch/>
+                            </pic:blipFill>
+                            <pic:spPr bwMode="auto">
+                              <a:xfrm flipH="0" flipV="0">
+                                <a:off x="0" y="0"/>
+                                <a:ext cx="3413218" cy="1341126"/>
+                              </a:xfrm>
+                              <a:prstGeom prst="rect">
+                                <a:avLst/>
+                              </a:prstGeom>
+                            </pic:spPr>
+                          </pic:pic>
+                        </a:graphicData>
+                      </a:graphic>
+                    </wp:inline>
+                  </w:drawing>
+                </mc:Choice>
+                <mc:Fallback>
+                  <w:pict>
+                    <v:shapetype id="_x0000_t75" coordsize="21600,21600" o:spt="75" o:preferrelative="t" path="m@4@5l@4@11@9@11@9@5xe" filled="f" stroked="f">
+                      <v:stroke joinstyle="miter"/>
+                      <v:formulas>
+                        <v:f eqn="if lineDrawn pixelLineWidth 0"/>
+                        <v:f eqn="sum @0 1 0"/>
+                        <v:f eqn="sum 0 0 @1"/>
+                        <v:f eqn="prod @2 1 2"/>
+                        <v:f eqn="prod @3 21600 pixelWidth"/>
+                        <v:f eqn="prod @3 21600 pixelHeight"/>
+                        <v:f eqn="sum @0 0 1"/>
+                        <v:f eqn="prod @6 1 2"/>
+                        <v:f eqn="prod @7 21600 pixelWidth"/>
+                        <v:f eqn="sum @8 21600 0"/>
+                        <v:f eqn="prod @7 21600 pixelHeight"/>
+                        <v:f eqn="sum @10 21600 0"/>
+                      </v:formulas>
+                      <v:path o:extrusionok="f" gradientshapeok="t" o:connecttype="rect"/>
+                      <o:lock v:ext="edit" aspectratio="t"/>
+                    </v:shapetype>
+                    <v:shape id="_x0000_i6" o:spid="_x0000_s6" type="#_x0000_t75" style="width:268.76pt;height:105.60pt;mso-wrap-distance-left:0.00pt;mso-wrap-distance-top:0.00pt;mso-wrap-distance-right:0.00pt;mso-wrap-distance-bottom:0.00pt;z-index:1;" stroked="false">
+                      <v:imagedata r:id="rId17" o:title=""/>
+                      <o:lock v:ext="edit" rotation="t"/>
+                    </v:shape>
+                  </w:pict>
+                </mc:Fallback>
+              </mc:AlternateContent>
+            </w:r>
+            <w:r>
+              <w:rPr>
+                <w:lang w:val="es-US"/>
+              </w:rPr>
+            </w:r>
+            <w:r>
               <w:rPr>
                 <w:lang w:val="es-US"/>
               </w:rPr>
@@ -7880,6 +8102,80 @@
               </w:rPr>
             </w:r>
             <w:r>
+              <mc:AlternateContent>
+                <mc:Choice Requires="wpg">
+                  <w:drawing>
+                    <wp:inline xmlns:wp="http://schemas.openxmlformats.org/drawingml/2006/wordprocessingDrawing" distT="0" distB="0" distL="0" distR="0">
+                      <wp:extent cx="3387312" cy="1782796"/>
+                      <wp:effectExtent l="0" t="0" r="0" b="0"/>
+                      <wp:docPr id="8" name=""/>
+                      <wp:cNvGraphicFramePr>
+                        <a:graphicFrameLocks xmlns:a="http://schemas.openxmlformats.org/drawingml/2006/main" noChangeAspect="1"/>
+                      </wp:cNvGraphicFramePr>
+                      <a:graphic xmlns:a="http://schemas.openxmlformats.org/drawingml/2006/main">
+                        <a:graphicData uri="http://schemas.openxmlformats.org/drawingml/2006/picture">
+                          <pic:pic xmlns:pic="http://schemas.openxmlformats.org/drawingml/2006/picture">
+                            <pic:nvPicPr>
+                              <pic:cNvPr id="294696044" name=""/>
+                              <pic:cNvPicPr>
+                                <a:picLocks noChangeAspect="1"/>
+                              </pic:cNvPicPr>
+                              <pic:nvPr/>
+                            </pic:nvPicPr>
+                            <pic:blipFill rotWithShape="1">
+                              <a:blip r:embed="rId18"/>
+                              <a:stretch/>
+                            </pic:blipFill>
+                            <pic:spPr bwMode="auto">
+                              <a:xfrm flipH="0" flipV="0">
+                                <a:off x="0" y="0"/>
+                                <a:ext cx="3387312" cy="1782795"/>
+                              </a:xfrm>
+                              <a:prstGeom prst="rect">
+                                <a:avLst/>
+                              </a:prstGeom>
+                            </pic:spPr>
+                          </pic:pic>
+                        </a:graphicData>
+                      </a:graphic>
+                    </wp:inline>
+                  </w:drawing>
+                </mc:Choice>
+                <mc:Fallback>
+                  <w:pict>
+                    <v:shapetype id="_x0000_t75" coordsize="21600,21600" o:spt="75" o:preferrelative="t" path="m@4@5l@4@11@9@11@9@5xe" filled="f" stroked="f">
+                      <v:stroke joinstyle="miter"/>
+                      <v:formulas>
+                        <v:f eqn="if lineDrawn pixelLineWidth 0"/>
+                        <v:f eqn="sum @0 1 0"/>
+                        <v:f eqn="sum 0 0 @1"/>
+                        <v:f eqn="prod @2 1 2"/>
+                        <v:f eqn="prod @3 21600 pixelWidth"/>
+                        <v:f eqn="prod @3 21600 pixelHeight"/>
+                        <v:f eqn="sum @0 0 1"/>
+                        <v:f eqn="prod @6 1 2"/>
+                        <v:f eqn="prod @7 21600 pixelWidth"/>
+                        <v:f eqn="sum @8 21600 0"/>
+                        <v:f eqn="prod @7 21600 pixelHeight"/>
+                        <v:f eqn="sum @10 21600 0"/>
+                      </v:formulas>
+                      <v:path o:extrusionok="f" gradientshapeok="t" o:connecttype="rect"/>
+                      <o:lock v:ext="edit" aspectratio="t"/>
+                    </v:shapetype>
+                    <v:shape id="_x0000_i7" o:spid="_x0000_s7" type="#_x0000_t75" style="width:266.72pt;height:140.38pt;mso-wrap-distance-left:0.00pt;mso-wrap-distance-top:0.00pt;mso-wrap-distance-right:0.00pt;mso-wrap-distance-bottom:0.00pt;z-index:1;" stroked="false">
+                      <v:imagedata r:id="rId18" o:title=""/>
+                      <o:lock v:ext="edit" rotation="t"/>
+                    </v:shape>
+                  </w:pict>
+                </mc:Fallback>
+              </mc:AlternateContent>
+            </w:r>
+            <w:r>
+              <w:rPr>
+                <w:lang w:val="es-US"/>
+              </w:rPr>
+            </w:r>
+            <w:r>
               <w:rPr>
                 <w:lang w:val="es-US"/>
               </w:rPr>
@@ -7999,6 +8295,80 @@
               </w:rPr>
             </w:r>
             <w:r>
+              <mc:AlternateContent>
+                <mc:Choice Requires="wpg">
+                  <w:drawing>
+                    <wp:inline xmlns:wp="http://schemas.openxmlformats.org/drawingml/2006/wordprocessingDrawing" distT="0" distB="0" distL="0" distR="0">
+                      <wp:extent cx="3444792" cy="1349314"/>
+                      <wp:effectExtent l="0" t="0" r="0" b="0"/>
+                      <wp:docPr id="9" name=""/>
+                      <wp:cNvGraphicFramePr>
+                        <a:graphicFrameLocks xmlns:a="http://schemas.openxmlformats.org/drawingml/2006/main" noChangeAspect="1"/>
+                      </wp:cNvGraphicFramePr>
+                      <a:graphic xmlns:a="http://schemas.openxmlformats.org/drawingml/2006/main">
+                        <a:graphicData uri="http://schemas.openxmlformats.org/drawingml/2006/picture">
+                          <pic:pic xmlns:pic="http://schemas.openxmlformats.org/drawingml/2006/picture">
+                            <pic:nvPicPr>
+                              <pic:cNvPr id="258157669" name=""/>
+                              <pic:cNvPicPr>
+                                <a:picLocks noChangeAspect="1"/>
+                              </pic:cNvPicPr>
+                              <pic:nvPr/>
+                            </pic:nvPicPr>
+                            <pic:blipFill rotWithShape="1">
+                              <a:blip r:embed="rId19"/>
+                              <a:stretch/>
+                            </pic:blipFill>
+                            <pic:spPr bwMode="auto">
+                              <a:xfrm flipH="0" flipV="0">
+                                <a:off x="0" y="0"/>
+                                <a:ext cx="3444792" cy="1349313"/>
+                              </a:xfrm>
+                              <a:prstGeom prst="rect">
+                                <a:avLst/>
+                              </a:prstGeom>
+                            </pic:spPr>
+                          </pic:pic>
+                        </a:graphicData>
+                      </a:graphic>
+                    </wp:inline>
+                  </w:drawing>
+                </mc:Choice>
+                <mc:Fallback>
+                  <w:pict>
+                    <v:shapetype id="_x0000_t75" coordsize="21600,21600" o:spt="75" o:preferrelative="t" path="m@4@5l@4@11@9@11@9@5xe" filled="f" stroked="f">
+                      <v:stroke joinstyle="miter"/>
+                      <v:formulas>
+                        <v:f eqn="if lineDrawn pixelLineWidth 0"/>
+                        <v:f eqn="sum @0 1 0"/>
+                        <v:f eqn="sum 0 0 @1"/>
+                        <v:f eqn="prod @2 1 2"/>
+                        <v:f eqn="prod @3 21600 pixelWidth"/>
+                        <v:f eqn="prod @3 21600 pixelHeight"/>
+                        <v:f eqn="sum @0 0 1"/>
+                        <v:f eqn="prod @6 1 2"/>
+                        <v:f eqn="prod @7 21600 pixelWidth"/>
+                        <v:f eqn="sum @8 21600 0"/>
+                        <v:f eqn="prod @7 21600 pixelHeight"/>
+                        <v:f eqn="sum @10 21600 0"/>
+                      </v:formulas>
+                      <v:path o:extrusionok="f" gradientshapeok="t" o:connecttype="rect"/>
+                      <o:lock v:ext="edit" aspectratio="t"/>
+                    </v:shapetype>
+                    <v:shape id="_x0000_i8" o:spid="_x0000_s8" type="#_x0000_t75" style="width:271.24pt;height:106.25pt;mso-wrap-distance-left:0.00pt;mso-wrap-distance-top:0.00pt;mso-wrap-distance-right:0.00pt;mso-wrap-distance-bottom:0.00pt;z-index:1;" stroked="false">
+                      <v:imagedata r:id="rId19" o:title=""/>
+                      <o:lock v:ext="edit" rotation="t"/>
+                    </v:shape>
+                  </w:pict>
+                </mc:Fallback>
+              </mc:AlternateContent>
+            </w:r>
+            <w:r>
+              <w:rPr>
+                <w:lang w:val="es-US"/>
+              </w:rPr>
+            </w:r>
+            <w:r>
               <w:rPr>
                 <w:lang w:val="es-US"/>
               </w:rPr>
@@ -8118,6 +8488,80 @@
               </w:rPr>
             </w:r>
             <w:r>
+              <mc:AlternateContent>
+                <mc:Choice Requires="wpg">
+                  <w:drawing>
+                    <wp:inline xmlns:wp="http://schemas.openxmlformats.org/drawingml/2006/wordprocessingDrawing" distT="0" distB="0" distL="0" distR="0">
+                      <wp:extent cx="3444792" cy="1063742"/>
+                      <wp:effectExtent l="0" t="0" r="0" b="0"/>
+                      <wp:docPr id="10" name=""/>
+                      <wp:cNvGraphicFramePr>
+                        <a:graphicFrameLocks xmlns:a="http://schemas.openxmlformats.org/drawingml/2006/main" noChangeAspect="1"/>
+                      </wp:cNvGraphicFramePr>
+                      <a:graphic xmlns:a="http://schemas.openxmlformats.org/drawingml/2006/main">
+                        <a:graphicData uri="http://schemas.openxmlformats.org/drawingml/2006/picture">
+                          <pic:pic xmlns:pic="http://schemas.openxmlformats.org/drawingml/2006/picture">
+                            <pic:nvPicPr>
+                              <pic:cNvPr id="1932143096" name=""/>
+                              <pic:cNvPicPr>
+                                <a:picLocks noChangeAspect="1"/>
+                              </pic:cNvPicPr>
+                              <pic:nvPr/>
+                            </pic:nvPicPr>
+                            <pic:blipFill rotWithShape="1">
+                              <a:blip r:embed="rId20"/>
+                              <a:stretch/>
+                            </pic:blipFill>
+                            <pic:spPr bwMode="auto">
+                              <a:xfrm flipH="0" flipV="0">
+                                <a:off x="0" y="0"/>
+                                <a:ext cx="3444792" cy="1063741"/>
+                              </a:xfrm>
+                              <a:prstGeom prst="rect">
+                                <a:avLst/>
+                              </a:prstGeom>
+                            </pic:spPr>
+                          </pic:pic>
+                        </a:graphicData>
+                      </a:graphic>
+                    </wp:inline>
+                  </w:drawing>
+                </mc:Choice>
+                <mc:Fallback>
+                  <w:pict>
+                    <v:shapetype id="_x0000_t75" coordsize="21600,21600" o:spt="75" o:preferrelative="t" path="m@4@5l@4@11@9@11@9@5xe" filled="f" stroked="f">
+                      <v:stroke joinstyle="miter"/>
+                      <v:formulas>
+                        <v:f eqn="if lineDrawn pixelLineWidth 0"/>
+                        <v:f eqn="sum @0 1 0"/>
+                        <v:f eqn="sum 0 0 @1"/>
+                        <v:f eqn="prod @2 1 2"/>
+                        <v:f eqn="prod @3 21600 pixelWidth"/>
+                        <v:f eqn="prod @3 21600 pixelHeight"/>
+                        <v:f eqn="sum @0 0 1"/>
+                        <v:f eqn="prod @6 1 2"/>
+                        <v:f eqn="prod @7 21600 pixelWidth"/>
+                        <v:f eqn="sum @8 21600 0"/>
+                        <v:f eqn="prod @7 21600 pixelHeight"/>
+                        <v:f eqn="sum @10 21600 0"/>
+                      </v:formulas>
+                      <v:path o:extrusionok="f" gradientshapeok="t" o:connecttype="rect"/>
+                      <o:lock v:ext="edit" aspectratio="t"/>
+                    </v:shapetype>
+                    <v:shape id="_x0000_i9" o:spid="_x0000_s9" type="#_x0000_t75" style="width:271.24pt;height:83.76pt;mso-wrap-distance-left:0.00pt;mso-wrap-distance-top:0.00pt;mso-wrap-distance-right:0.00pt;mso-wrap-distance-bottom:0.00pt;z-index:1;" stroked="false">
+                      <v:imagedata r:id="rId20" o:title=""/>
+                      <o:lock v:ext="edit" rotation="t"/>
+                    </v:shape>
+                  </w:pict>
+                </mc:Fallback>
+              </mc:AlternateContent>
+            </w:r>
+            <w:r>
+              <w:rPr>
+                <w:lang w:val="es-US"/>
+              </w:rPr>
+            </w:r>
+            <w:r>
               <w:rPr>
                 <w:lang w:val="es-US"/>
               </w:rPr>
@@ -8237,6 +8681,80 @@
               </w:rPr>
             </w:r>
             <w:r>
+              <mc:AlternateContent>
+                <mc:Choice Requires="wpg">
+                  <w:drawing>
+                    <wp:inline xmlns:wp="http://schemas.openxmlformats.org/drawingml/2006/wordprocessingDrawing" distT="0" distB="0" distL="0" distR="0">
+                      <wp:extent cx="3444792" cy="1772369"/>
+                      <wp:effectExtent l="0" t="0" r="0" b="0"/>
+                      <wp:docPr id="11" name=""/>
+                      <wp:cNvGraphicFramePr>
+                        <a:graphicFrameLocks xmlns:a="http://schemas.openxmlformats.org/drawingml/2006/main" noChangeAspect="1"/>
+                      </wp:cNvGraphicFramePr>
+                      <a:graphic xmlns:a="http://schemas.openxmlformats.org/drawingml/2006/main">
+                        <a:graphicData uri="http://schemas.openxmlformats.org/drawingml/2006/picture">
+                          <pic:pic xmlns:pic="http://schemas.openxmlformats.org/drawingml/2006/picture">
+                            <pic:nvPicPr>
+                              <pic:cNvPr id="852362207" name=""/>
+                              <pic:cNvPicPr>
+                                <a:picLocks noChangeAspect="1"/>
+                              </pic:cNvPicPr>
+                              <pic:nvPr/>
+                            </pic:nvPicPr>
+                            <pic:blipFill rotWithShape="1">
+                              <a:blip r:embed="rId21"/>
+                              <a:stretch/>
+                            </pic:blipFill>
+                            <pic:spPr bwMode="auto">
+                              <a:xfrm flipH="0" flipV="0">
+                                <a:off x="0" y="0"/>
+                                <a:ext cx="3444792" cy="1772368"/>
+                              </a:xfrm>
+                              <a:prstGeom prst="rect">
+                                <a:avLst/>
+                              </a:prstGeom>
+                            </pic:spPr>
+                          </pic:pic>
+                        </a:graphicData>
+                      </a:graphic>
+                    </wp:inline>
+                  </w:drawing>
+                </mc:Choice>
+                <mc:Fallback>
+                  <w:pict>
+                    <v:shapetype id="_x0000_t75" coordsize="21600,21600" o:spt="75" o:preferrelative="t" path="m@4@5l@4@11@9@11@9@5xe" filled="f" stroked="f">
+                      <v:stroke joinstyle="miter"/>
+                      <v:formulas>
+                        <v:f eqn="if lineDrawn pixelLineWidth 0"/>
+                        <v:f eqn="sum @0 1 0"/>
+                        <v:f eqn="sum 0 0 @1"/>
+                        <v:f eqn="prod @2 1 2"/>
+                        <v:f eqn="prod @3 21600 pixelWidth"/>
+                        <v:f eqn="prod @3 21600 pixelHeight"/>
+                        <v:f eqn="sum @0 0 1"/>
+                        <v:f eqn="prod @6 1 2"/>
+                        <v:f eqn="prod @7 21600 pixelWidth"/>
+                        <v:f eqn="sum @8 21600 0"/>
+                        <v:f eqn="prod @7 21600 pixelHeight"/>
+                        <v:f eqn="sum @10 21600 0"/>
+                      </v:formulas>
+                      <v:path o:extrusionok="f" gradientshapeok="t" o:connecttype="rect"/>
+                      <o:lock v:ext="edit" aspectratio="t"/>
+                    </v:shapetype>
+                    <v:shape id="_x0000_i10" o:spid="_x0000_s10" type="#_x0000_t75" style="width:271.24pt;height:139.56pt;mso-wrap-distance-left:0.00pt;mso-wrap-distance-top:0.00pt;mso-wrap-distance-right:0.00pt;mso-wrap-distance-bottom:0.00pt;z-index:1;" stroked="false">
+                      <v:imagedata r:id="rId21" o:title=""/>
+                      <o:lock v:ext="edit" rotation="t"/>
+                    </v:shape>
+                  </w:pict>
+                </mc:Fallback>
+              </mc:AlternateContent>
+            </w:r>
+            <w:r>
+              <w:rPr>
+                <w:lang w:val="es-US"/>
+              </w:rPr>
+            </w:r>
+            <w:r>
               <w:rPr>
                 <w:lang w:val="es-US"/>
               </w:rPr>
@@ -8356,6 +8874,80 @@
               </w:rPr>
             </w:r>
             <w:r>
+              <mc:AlternateContent>
+                <mc:Choice Requires="wpg">
+                  <w:drawing>
+                    <wp:inline xmlns:wp="http://schemas.openxmlformats.org/drawingml/2006/wordprocessingDrawing" distT="0" distB="0" distL="0" distR="0">
+                      <wp:extent cx="3442309" cy="1987609"/>
+                      <wp:effectExtent l="0" t="0" r="0" b="0"/>
+                      <wp:docPr id="12" name=""/>
+                      <wp:cNvGraphicFramePr>
+                        <a:graphicFrameLocks xmlns:a="http://schemas.openxmlformats.org/drawingml/2006/main" noChangeAspect="1"/>
+                      </wp:cNvGraphicFramePr>
+                      <a:graphic xmlns:a="http://schemas.openxmlformats.org/drawingml/2006/main">
+                        <a:graphicData uri="http://schemas.openxmlformats.org/drawingml/2006/picture">
+                          <pic:pic xmlns:pic="http://schemas.openxmlformats.org/drawingml/2006/picture">
+                            <pic:nvPicPr>
+                              <pic:cNvPr id="1174523757" name=""/>
+                              <pic:cNvPicPr>
+                                <a:picLocks noChangeAspect="1"/>
+                              </pic:cNvPicPr>
+                              <pic:nvPr/>
+                            </pic:nvPicPr>
+                            <pic:blipFill rotWithShape="1">
+                              <a:blip r:embed="rId22"/>
+                              <a:stretch/>
+                            </pic:blipFill>
+                            <pic:spPr bwMode="auto">
+                              <a:xfrm flipH="0" flipV="0">
+                                <a:off x="0" y="0"/>
+                                <a:ext cx="3442309" cy="1987609"/>
+                              </a:xfrm>
+                              <a:prstGeom prst="rect">
+                                <a:avLst/>
+                              </a:prstGeom>
+                            </pic:spPr>
+                          </pic:pic>
+                        </a:graphicData>
+                      </a:graphic>
+                    </wp:inline>
+                  </w:drawing>
+                </mc:Choice>
+                <mc:Fallback>
+                  <w:pict>
+                    <v:shapetype id="_x0000_t75" coordsize="21600,21600" o:spt="75" o:preferrelative="t" path="m@4@5l@4@11@9@11@9@5xe" filled="f" stroked="f">
+                      <v:stroke joinstyle="miter"/>
+                      <v:formulas>
+                        <v:f eqn="if lineDrawn pixelLineWidth 0"/>
+                        <v:f eqn="sum @0 1 0"/>
+                        <v:f eqn="sum 0 0 @1"/>
+                        <v:f eqn="prod @2 1 2"/>
+                        <v:f eqn="prod @3 21600 pixelWidth"/>
+                        <v:f eqn="prod @3 21600 pixelHeight"/>
+                        <v:f eqn="sum @0 0 1"/>
+                        <v:f eqn="prod @6 1 2"/>
+                        <v:f eqn="prod @7 21600 pixelWidth"/>
+                        <v:f eqn="sum @8 21600 0"/>
+                        <v:f eqn="prod @7 21600 pixelHeight"/>
+                        <v:f eqn="sum @10 21600 0"/>
+                      </v:formulas>
+                      <v:path o:extrusionok="f" gradientshapeok="t" o:connecttype="rect"/>
+                      <o:lock v:ext="edit" aspectratio="t"/>
+                    </v:shapetype>
+                    <v:shape id="_x0000_i11" o:spid="_x0000_s11" type="#_x0000_t75" style="width:271.05pt;height:156.50pt;mso-wrap-distance-left:0.00pt;mso-wrap-distance-top:0.00pt;mso-wrap-distance-right:0.00pt;mso-wrap-distance-bottom:0.00pt;z-index:1;" stroked="false">
+                      <v:imagedata r:id="rId22" o:title=""/>
+                      <o:lock v:ext="edit" rotation="t"/>
+                    </v:shape>
+                  </w:pict>
+                </mc:Fallback>
+              </mc:AlternateContent>
+            </w:r>
+            <w:r>
+              <w:rPr>
+                <w:lang w:val="es-US"/>
+              </w:rPr>
+            </w:r>
+            <w:r>
               <w:rPr>
                 <w:lang w:val="es-US"/>
               </w:rPr>
@@ -8475,6 +9067,80 @@
               </w:rPr>
             </w:r>
             <w:r>
+              <mc:AlternateContent>
+                <mc:Choice Requires="wpg">
+                  <w:drawing>
+                    <wp:inline xmlns:wp="http://schemas.openxmlformats.org/drawingml/2006/wordprocessingDrawing" distT="0" distB="0" distL="0" distR="0">
+                      <wp:extent cx="3404609" cy="1412069"/>
+                      <wp:effectExtent l="0" t="0" r="0" b="0"/>
+                      <wp:docPr id="13" name=""/>
+                      <wp:cNvGraphicFramePr>
+                        <a:graphicFrameLocks xmlns:a="http://schemas.openxmlformats.org/drawingml/2006/main" noChangeAspect="1"/>
+                      </wp:cNvGraphicFramePr>
+                      <a:graphic xmlns:a="http://schemas.openxmlformats.org/drawingml/2006/main">
+                        <a:graphicData uri="http://schemas.openxmlformats.org/drawingml/2006/picture">
+                          <pic:pic xmlns:pic="http://schemas.openxmlformats.org/drawingml/2006/picture">
+                            <pic:nvPicPr>
+                              <pic:cNvPr id="1373811027" name=""/>
+                              <pic:cNvPicPr>
+                                <a:picLocks noChangeAspect="1"/>
+                              </pic:cNvPicPr>
+                              <pic:nvPr/>
+                            </pic:nvPicPr>
+                            <pic:blipFill rotWithShape="1">
+                              <a:blip r:embed="rId23"/>
+                              <a:stretch/>
+                            </pic:blipFill>
+                            <pic:spPr bwMode="auto">
+                              <a:xfrm flipH="0" flipV="0">
+                                <a:off x="0" y="0"/>
+                                <a:ext cx="3404608" cy="1412068"/>
+                              </a:xfrm>
+                              <a:prstGeom prst="rect">
+                                <a:avLst/>
+                              </a:prstGeom>
+                            </pic:spPr>
+                          </pic:pic>
+                        </a:graphicData>
+                      </a:graphic>
+                    </wp:inline>
+                  </w:drawing>
+                </mc:Choice>
+                <mc:Fallback>
+                  <w:pict>
+                    <v:shapetype id="_x0000_t75" coordsize="21600,21600" o:spt="75" o:preferrelative="t" path="m@4@5l@4@11@9@11@9@5xe" filled="f" stroked="f">
+                      <v:stroke joinstyle="miter"/>
+                      <v:formulas>
+                        <v:f eqn="if lineDrawn pixelLineWidth 0"/>
+                        <v:f eqn="sum @0 1 0"/>
+                        <v:f eqn="sum 0 0 @1"/>
+                        <v:f eqn="prod @2 1 2"/>
+                        <v:f eqn="prod @3 21600 pixelWidth"/>
+                        <v:f eqn="prod @3 21600 pixelHeight"/>
+                        <v:f eqn="sum @0 0 1"/>
+                        <v:f eqn="prod @6 1 2"/>
+                        <v:f eqn="prod @7 21600 pixelWidth"/>
+                        <v:f eqn="sum @8 21600 0"/>
+                        <v:f eqn="prod @7 21600 pixelHeight"/>
+                        <v:f eqn="sum @10 21600 0"/>
+                      </v:formulas>
+                      <v:path o:extrusionok="f" gradientshapeok="t" o:connecttype="rect"/>
+                      <o:lock v:ext="edit" aspectratio="t"/>
+                    </v:shapetype>
+                    <v:shape id="_x0000_i12" o:spid="_x0000_s12" type="#_x0000_t75" style="width:268.08pt;height:111.19pt;mso-wrap-distance-left:0.00pt;mso-wrap-distance-top:0.00pt;mso-wrap-distance-right:0.00pt;mso-wrap-distance-bottom:0.00pt;z-index:1;" stroked="false">
+                      <v:imagedata r:id="rId23" o:title=""/>
+                      <o:lock v:ext="edit" rotation="t"/>
+                    </v:shape>
+                  </w:pict>
+                </mc:Fallback>
+              </mc:AlternateContent>
+            </w:r>
+            <w:r>
+              <w:rPr>
+                <w:lang w:val="es-US"/>
+              </w:rPr>
+            </w:r>
+            <w:r>
               <w:rPr>
                 <w:lang w:val="es-US"/>
               </w:rPr>
@@ -8594,6 +9260,80 @@
               </w:rPr>
             </w:r>
             <w:r>
+              <mc:AlternateContent>
+                <mc:Choice Requires="wpg">
+                  <w:drawing>
+                    <wp:inline xmlns:wp="http://schemas.openxmlformats.org/drawingml/2006/wordprocessingDrawing" distT="0" distB="0" distL="0" distR="0">
+                      <wp:extent cx="3452353" cy="1815291"/>
+                      <wp:effectExtent l="0" t="0" r="0" b="0"/>
+                      <wp:docPr id="14" name=""/>
+                      <wp:cNvGraphicFramePr>
+                        <a:graphicFrameLocks xmlns:a="http://schemas.openxmlformats.org/drawingml/2006/main" noChangeAspect="1"/>
+                      </wp:cNvGraphicFramePr>
+                      <a:graphic xmlns:a="http://schemas.openxmlformats.org/drawingml/2006/main">
+                        <a:graphicData uri="http://schemas.openxmlformats.org/drawingml/2006/picture">
+                          <pic:pic xmlns:pic="http://schemas.openxmlformats.org/drawingml/2006/picture">
+                            <pic:nvPicPr>
+                              <pic:cNvPr id="256815056" name=""/>
+                              <pic:cNvPicPr>
+                                <a:picLocks noChangeAspect="1"/>
+                              </pic:cNvPicPr>
+                              <pic:nvPr/>
+                            </pic:nvPicPr>
+                            <pic:blipFill rotWithShape="1">
+                              <a:blip r:embed="rId24"/>
+                              <a:stretch/>
+                            </pic:blipFill>
+                            <pic:spPr bwMode="auto">
+                              <a:xfrm flipH="0" flipV="0">
+                                <a:off x="0" y="0"/>
+                                <a:ext cx="3452353" cy="1815291"/>
+                              </a:xfrm>
+                              <a:prstGeom prst="rect">
+                                <a:avLst/>
+                              </a:prstGeom>
+                            </pic:spPr>
+                          </pic:pic>
+                        </a:graphicData>
+                      </a:graphic>
+                    </wp:inline>
+                  </w:drawing>
+                </mc:Choice>
+                <mc:Fallback>
+                  <w:pict>
+                    <v:shapetype id="_x0000_t75" coordsize="21600,21600" o:spt="75" o:preferrelative="t" path="m@4@5l@4@11@9@11@9@5xe" filled="f" stroked="f">
+                      <v:stroke joinstyle="miter"/>
+                      <v:formulas>
+                        <v:f eqn="if lineDrawn pixelLineWidth 0"/>
+                        <v:f eqn="sum @0 1 0"/>
+                        <v:f eqn="sum 0 0 @1"/>
+                        <v:f eqn="prod @2 1 2"/>
+                        <v:f eqn="prod @3 21600 pixelWidth"/>
+                        <v:f eqn="prod @3 21600 pixelHeight"/>
+                        <v:f eqn="sum @0 0 1"/>
+                        <v:f eqn="prod @6 1 2"/>
+                        <v:f eqn="prod @7 21600 pixelWidth"/>
+                        <v:f eqn="sum @8 21600 0"/>
+                        <v:f eqn="prod @7 21600 pixelHeight"/>
+                        <v:f eqn="sum @10 21600 0"/>
+                      </v:formulas>
+                      <v:path o:extrusionok="f" gradientshapeok="t" o:connecttype="rect"/>
+                      <o:lock v:ext="edit" aspectratio="t"/>
+                    </v:shapetype>
+                    <v:shape id="_x0000_i13" o:spid="_x0000_s13" type="#_x0000_t75" style="width:271.84pt;height:142.94pt;mso-wrap-distance-left:0.00pt;mso-wrap-distance-top:0.00pt;mso-wrap-distance-right:0.00pt;mso-wrap-distance-bottom:0.00pt;z-index:1;" stroked="false">
+                      <v:imagedata r:id="rId24" o:title=""/>
+                      <o:lock v:ext="edit" rotation="t"/>
+                    </v:shape>
+                  </w:pict>
+                </mc:Fallback>
+              </mc:AlternateContent>
+            </w:r>
+            <w:r>
+              <w:rPr>
+                <w:lang w:val="es-US"/>
+              </w:rPr>
+            </w:r>
+            <w:r>
               <w:rPr>
                 <w:lang w:val="es-US"/>
               </w:rPr>
@@ -8721,6 +9461,80 @@
               </w:rPr>
             </w:r>
             <w:r>
+              <mc:AlternateContent>
+                <mc:Choice Requires="wpg">
+                  <w:drawing>
+                    <wp:inline xmlns:wp="http://schemas.openxmlformats.org/drawingml/2006/wordprocessingDrawing" distT="0" distB="0" distL="0" distR="0">
+                      <wp:extent cx="3404609" cy="1412811"/>
+                      <wp:effectExtent l="0" t="0" r="0" b="0"/>
+                      <wp:docPr id="15" name=""/>
+                      <wp:cNvGraphicFramePr>
+                        <a:graphicFrameLocks xmlns:a="http://schemas.openxmlformats.org/drawingml/2006/main" noChangeAspect="1"/>
+                      </wp:cNvGraphicFramePr>
+                      <a:graphic xmlns:a="http://schemas.openxmlformats.org/drawingml/2006/main">
+                        <a:graphicData uri="http://schemas.openxmlformats.org/drawingml/2006/picture">
+                          <pic:pic xmlns:pic="http://schemas.openxmlformats.org/drawingml/2006/picture">
+                            <pic:nvPicPr>
+                              <pic:cNvPr id="402423096" name=""/>
+                              <pic:cNvPicPr>
+                                <a:picLocks noChangeAspect="1"/>
+                              </pic:cNvPicPr>
+                              <pic:nvPr/>
+                            </pic:nvPicPr>
+                            <pic:blipFill rotWithShape="1">
+                              <a:blip r:embed="rId25"/>
+                              <a:stretch/>
+                            </pic:blipFill>
+                            <pic:spPr bwMode="auto">
+                              <a:xfrm flipH="0" flipV="0">
+                                <a:off x="0" y="0"/>
+                                <a:ext cx="3404608" cy="1412810"/>
+                              </a:xfrm>
+                              <a:prstGeom prst="rect">
+                                <a:avLst/>
+                              </a:prstGeom>
+                            </pic:spPr>
+                          </pic:pic>
+                        </a:graphicData>
+                      </a:graphic>
+                    </wp:inline>
+                  </w:drawing>
+                </mc:Choice>
+                <mc:Fallback>
+                  <w:pict>
+                    <v:shapetype id="_x0000_t75" coordsize="21600,21600" o:spt="75" o:preferrelative="t" path="m@4@5l@4@11@9@11@9@5xe" filled="f" stroked="f">
+                      <v:stroke joinstyle="miter"/>
+                      <v:formulas>
+                        <v:f eqn="if lineDrawn pixelLineWidth 0"/>
+                        <v:f eqn="sum @0 1 0"/>
+                        <v:f eqn="sum 0 0 @1"/>
+                        <v:f eqn="prod @2 1 2"/>
+                        <v:f eqn="prod @3 21600 pixelWidth"/>
+                        <v:f eqn="prod @3 21600 pixelHeight"/>
+                        <v:f eqn="sum @0 0 1"/>
+                        <v:f eqn="prod @6 1 2"/>
+                        <v:f eqn="prod @7 21600 pixelWidth"/>
+                        <v:f eqn="sum @8 21600 0"/>
+                        <v:f eqn="prod @7 21600 pixelHeight"/>
+                        <v:f eqn="sum @10 21600 0"/>
+                      </v:formulas>
+                      <v:path o:extrusionok="f" gradientshapeok="t" o:connecttype="rect"/>
+                      <o:lock v:ext="edit" aspectratio="t"/>
+                    </v:shapetype>
+                    <v:shape id="_x0000_i14" o:spid="_x0000_s14" type="#_x0000_t75" style="width:268.08pt;height:111.24pt;mso-wrap-distance-left:0.00pt;mso-wrap-distance-top:0.00pt;mso-wrap-distance-right:0.00pt;mso-wrap-distance-bottom:0.00pt;z-index:1;" stroked="false">
+                      <v:imagedata r:id="rId25" o:title=""/>
+                      <o:lock v:ext="edit" rotation="t"/>
+                    </v:shape>
+                  </w:pict>
+                </mc:Fallback>
+              </mc:AlternateContent>
+            </w:r>
+            <w:r>
+              <w:rPr>
+                <w:lang w:val="es-US"/>
+              </w:rPr>
+            </w:r>
+            <w:r>
               <w:rPr>
                 <w:lang w:val="es-US"/>
               </w:rPr>
@@ -8838,6 +9652,7 @@
               <w:rPr>
                 <w:lang w:val="es-US"/>
               </w:rPr>
+              <w:t xml:space="preserve">PENDIENTE</w:t>
             </w:r>
             <w:r>
               <w:rPr>
@@ -8957,6 +9772,7 @@
               <w:rPr>
                 <w:lang w:val="es-US"/>
               </w:rPr>
+              <w:t xml:space="preserve">PENDIENTE</w:t>
             </w:r>
             <w:r>
               <w:rPr>
@@ -15573,7 +16389,7 @@
                     <wp:inline xmlns:wp="http://schemas.openxmlformats.org/drawingml/2006/wordprocessingDrawing" distT="0" distB="0" distL="0" distR="0">
                       <wp:extent cx="3204000" cy="1376484"/>
                       <wp:effectExtent l="0" t="0" r="0" b="0"/>
-                      <wp:docPr id="5" name="Picture 6"/>
+                      <wp:docPr id="16" name="Picture 6"/>
                       <wp:cNvGraphicFramePr>
                         <a:graphicFrameLocks xmlns:a="http://schemas.openxmlformats.org/drawingml/2006/main" noChangeAspect="1"/>
                       </wp:cNvGraphicFramePr>
@@ -15588,7 +16404,7 @@
                               <pic:nvPr/>
                             </pic:nvPicPr>
                             <pic:blipFill rotWithShape="1">
-                              <a:blip r:embed="rId15"/>
+                              <a:blip r:embed="rId26"/>
                               <a:stretch/>
                             </pic:blipFill>
                             <pic:spPr bwMode="auto">
@@ -15627,8 +16443,8 @@
                       <v:path o:extrusionok="f" gradientshapeok="t" o:connecttype="rect"/>
                       <o:lock v:ext="edit" aspectratio="t"/>
                     </v:shapetype>
-                    <v:shape id="_x0000_i4" o:spid="_x0000_s4" type="#_x0000_t75" style="width:252.28pt;height:108.38pt;mso-wrap-distance-left:0.00pt;mso-wrap-distance-top:0.00pt;mso-wrap-distance-right:0.00pt;mso-wrap-distance-bottom:0.00pt;z-index:1;" stroked="false">
-                      <v:imagedata r:id="rId15" o:title=""/>
+                    <v:shape id="_x0000_i15" o:spid="_x0000_s15" type="#_x0000_t75" style="width:252.28pt;height:108.38pt;mso-wrap-distance-left:0.00pt;mso-wrap-distance-top:0.00pt;mso-wrap-distance-right:0.00pt;mso-wrap-distance-bottom:0.00pt;z-index:1;" stroked="false">
+                      <v:imagedata r:id="rId26" o:title=""/>
                       <o:lock v:ext="edit" rotation="t"/>
                     </v:shape>
                   </w:pict>
@@ -15756,7 +16572,7 @@
                     <wp:inline xmlns:wp="http://schemas.openxmlformats.org/drawingml/2006/wordprocessingDrawing" distT="0" distB="0" distL="0" distR="0">
                       <wp:extent cx="3204000" cy="1376484"/>
                       <wp:effectExtent l="0" t="0" r="0" b="0"/>
-                      <wp:docPr id="6" name="Picture 7"/>
+                      <wp:docPr id="17" name="Picture 7"/>
                       <wp:cNvGraphicFramePr>
                         <a:graphicFrameLocks xmlns:a="http://schemas.openxmlformats.org/drawingml/2006/main" noChangeAspect="1"/>
                       </wp:cNvGraphicFramePr>
@@ -15771,7 +16587,7 @@
                               <pic:nvPr/>
                             </pic:nvPicPr>
                             <pic:blipFill rotWithShape="1">
-                              <a:blip r:embed="rId16"/>
+                              <a:blip r:embed="rId27"/>
                               <a:stretch/>
                             </pic:blipFill>
                             <pic:spPr bwMode="auto">
@@ -15810,8 +16626,8 @@
                       <v:path o:extrusionok="f" gradientshapeok="t" o:connecttype="rect"/>
                       <o:lock v:ext="edit" aspectratio="t"/>
                     </v:shapetype>
-                    <v:shape id="_x0000_i5" o:spid="_x0000_s5" type="#_x0000_t75" style="width:252.28pt;height:108.38pt;mso-wrap-distance-left:0.00pt;mso-wrap-distance-top:0.00pt;mso-wrap-distance-right:0.00pt;mso-wrap-distance-bottom:0.00pt;z-index:1;" stroked="false">
-                      <v:imagedata r:id="rId16" o:title=""/>
+                    <v:shape id="_x0000_i16" o:spid="_x0000_s16" type="#_x0000_t75" style="width:252.28pt;height:108.38pt;mso-wrap-distance-left:0.00pt;mso-wrap-distance-top:0.00pt;mso-wrap-distance-right:0.00pt;mso-wrap-distance-bottom:0.00pt;z-index:1;" stroked="false">
+                      <v:imagedata r:id="rId27" o:title=""/>
                       <o:lock v:ext="edit" rotation="t"/>
                     </v:shape>
                   </w:pict>
@@ -15838,7 +16654,7 @@
                     <wp:inline xmlns:wp="http://schemas.openxmlformats.org/drawingml/2006/wordprocessingDrawing" distT="0" distB="0" distL="0" distR="0">
                       <wp:extent cx="3204000" cy="1376484"/>
                       <wp:effectExtent l="0" t="0" r="0" b="0"/>
-                      <wp:docPr id="7" name="Picture 8"/>
+                      <wp:docPr id="18" name="Picture 8"/>
                       <wp:cNvGraphicFramePr>
                         <a:graphicFrameLocks xmlns:a="http://schemas.openxmlformats.org/drawingml/2006/main" noChangeAspect="1"/>
                       </wp:cNvGraphicFramePr>
@@ -15853,7 +16669,7 @@
                               <pic:nvPr/>
                             </pic:nvPicPr>
                             <pic:blipFill rotWithShape="1">
-                              <a:blip r:embed="rId17"/>
+                              <a:blip r:embed="rId28"/>
                               <a:stretch/>
                             </pic:blipFill>
                             <pic:spPr bwMode="auto">
@@ -15892,8 +16708,8 @@
                       <v:path o:extrusionok="f" gradientshapeok="t" o:connecttype="rect"/>
                       <o:lock v:ext="edit" aspectratio="t"/>
                     </v:shapetype>
-                    <v:shape id="_x0000_i6" o:spid="_x0000_s6" type="#_x0000_t75" style="width:252.28pt;height:108.38pt;mso-wrap-distance-left:0.00pt;mso-wrap-distance-top:0.00pt;mso-wrap-distance-right:0.00pt;mso-wrap-distance-bottom:0.00pt;z-index:1;" stroked="false">
-                      <v:imagedata r:id="rId17" o:title=""/>
+                    <v:shape id="_x0000_i17" o:spid="_x0000_s17" type="#_x0000_t75" style="width:252.28pt;height:108.38pt;mso-wrap-distance-left:0.00pt;mso-wrap-distance-top:0.00pt;mso-wrap-distance-right:0.00pt;mso-wrap-distance-bottom:0.00pt;z-index:1;" stroked="false">
+                      <v:imagedata r:id="rId28" o:title=""/>
                       <o:lock v:ext="edit" rotation="t"/>
                     </v:shape>
                   </w:pict>
@@ -16025,7 +16841,7 @@
                     <wp:inline xmlns:wp="http://schemas.openxmlformats.org/drawingml/2006/wordprocessingDrawing" distT="0" distB="0" distL="0" distR="0">
                       <wp:extent cx="3204000" cy="1376484"/>
                       <wp:effectExtent l="0" t="0" r="0" b="0"/>
-                      <wp:docPr id="8" name="Picture 9"/>
+                      <wp:docPr id="19" name="Picture 9"/>
                       <wp:cNvGraphicFramePr>
                         <a:graphicFrameLocks xmlns:a="http://schemas.openxmlformats.org/drawingml/2006/main" noChangeAspect="1"/>
                       </wp:cNvGraphicFramePr>
@@ -16040,7 +16856,7 @@
                               <pic:nvPr/>
                             </pic:nvPicPr>
                             <pic:blipFill rotWithShape="1">
-                              <a:blip r:embed="rId18"/>
+                              <a:blip r:embed="rId29"/>
                               <a:stretch/>
                             </pic:blipFill>
                             <pic:spPr bwMode="auto">
@@ -16079,8 +16895,8 @@
                       <v:path o:extrusionok="f" gradientshapeok="t" o:connecttype="rect"/>
                       <o:lock v:ext="edit" aspectratio="t"/>
                     </v:shapetype>
-                    <v:shape id="_x0000_i7" o:spid="_x0000_s7" type="#_x0000_t75" style="width:252.28pt;height:108.38pt;mso-wrap-distance-left:0.00pt;mso-wrap-distance-top:0.00pt;mso-wrap-distance-right:0.00pt;mso-wrap-distance-bottom:0.00pt;z-index:1;" stroked="false">
-                      <v:imagedata r:id="rId18" o:title=""/>
+                    <v:shape id="_x0000_i18" o:spid="_x0000_s18" type="#_x0000_t75" style="width:252.28pt;height:108.38pt;mso-wrap-distance-left:0.00pt;mso-wrap-distance-top:0.00pt;mso-wrap-distance-right:0.00pt;mso-wrap-distance-bottom:0.00pt;z-index:1;" stroked="false">
+                      <v:imagedata r:id="rId29" o:title=""/>
                       <o:lock v:ext="edit" rotation="t"/>
                     </v:shape>
                   </w:pict>
@@ -16216,7 +17032,7 @@
                     <wp:inline xmlns:wp="http://schemas.openxmlformats.org/drawingml/2006/wordprocessingDrawing" distT="0" distB="0" distL="0" distR="0">
                       <wp:extent cx="3204000" cy="1376484"/>
                       <wp:effectExtent l="0" t="0" r="0" b="0"/>
-                      <wp:docPr id="9" name="Picture 10"/>
+                      <wp:docPr id="20" name="Picture 10"/>
                       <wp:cNvGraphicFramePr>
                         <a:graphicFrameLocks xmlns:a="http://schemas.openxmlformats.org/drawingml/2006/main" noChangeAspect="1"/>
                       </wp:cNvGraphicFramePr>
@@ -16231,7 +17047,7 @@
                               <pic:nvPr/>
                             </pic:nvPicPr>
                             <pic:blipFill rotWithShape="1">
-                              <a:blip r:embed="rId19"/>
+                              <a:blip r:embed="rId30"/>
                               <a:stretch/>
                             </pic:blipFill>
                             <pic:spPr bwMode="auto">
@@ -16270,8 +17086,8 @@
                       <v:path o:extrusionok="f" gradientshapeok="t" o:connecttype="rect"/>
                       <o:lock v:ext="edit" aspectratio="t"/>
                     </v:shapetype>
-                    <v:shape id="_x0000_i8" o:spid="_x0000_s8" type="#_x0000_t75" style="width:252.28pt;height:108.38pt;mso-wrap-distance-left:0.00pt;mso-wrap-distance-top:0.00pt;mso-wrap-distance-right:0.00pt;mso-wrap-distance-bottom:0.00pt;z-index:1;" stroked="false">
-                      <v:imagedata r:id="rId19" o:title=""/>
+                    <v:shape id="_x0000_i19" o:spid="_x0000_s19" type="#_x0000_t75" style="width:252.28pt;height:108.38pt;mso-wrap-distance-left:0.00pt;mso-wrap-distance-top:0.00pt;mso-wrap-distance-right:0.00pt;mso-wrap-distance-bottom:0.00pt;z-index:1;" stroked="false">
+                      <v:imagedata r:id="rId30" o:title=""/>
                       <o:lock v:ext="edit" rotation="t"/>
                     </v:shape>
                   </w:pict>
@@ -16298,7 +17114,7 @@
                     <wp:inline xmlns:wp="http://schemas.openxmlformats.org/drawingml/2006/wordprocessingDrawing" distT="0" distB="0" distL="0" distR="0">
                       <wp:extent cx="3204000" cy="1377202"/>
                       <wp:effectExtent l="0" t="0" r="0" b="0"/>
-                      <wp:docPr id="10" name="Picture 11"/>
+                      <wp:docPr id="21" name="Picture 11"/>
                       <wp:cNvGraphicFramePr>
                         <a:graphicFrameLocks xmlns:a="http://schemas.openxmlformats.org/drawingml/2006/main" noChangeAspect="1"/>
                       </wp:cNvGraphicFramePr>
@@ -16313,7 +17129,7 @@
                               <pic:nvPr/>
                             </pic:nvPicPr>
                             <pic:blipFill rotWithShape="1">
-                              <a:blip r:embed="rId20"/>
+                              <a:blip r:embed="rId31"/>
                               <a:stretch/>
                             </pic:blipFill>
                             <pic:spPr bwMode="auto">
@@ -16352,8 +17168,8 @@
                       <v:path o:extrusionok="f" gradientshapeok="t" o:connecttype="rect"/>
                       <o:lock v:ext="edit" aspectratio="t"/>
                     </v:shapetype>
-                    <v:shape id="_x0000_i9" o:spid="_x0000_s9" type="#_x0000_t75" style="width:252.28pt;height:108.44pt;mso-wrap-distance-left:0.00pt;mso-wrap-distance-top:0.00pt;mso-wrap-distance-right:0.00pt;mso-wrap-distance-bottom:0.00pt;z-index:1;" stroked="false">
-                      <v:imagedata r:id="rId20" o:title=""/>
+                    <v:shape id="_x0000_i20" o:spid="_x0000_s20" type="#_x0000_t75" style="width:252.28pt;height:108.44pt;mso-wrap-distance-left:0.00pt;mso-wrap-distance-top:0.00pt;mso-wrap-distance-right:0.00pt;mso-wrap-distance-bottom:0.00pt;z-index:1;" stroked="false">
+                      <v:imagedata r:id="rId31" o:title=""/>
                       <o:lock v:ext="edit" rotation="t"/>
                     </v:shape>
                   </w:pict>
@@ -16477,7 +17293,7 @@
                     <wp:inline xmlns:wp="http://schemas.openxmlformats.org/drawingml/2006/wordprocessingDrawing" distT="0" distB="0" distL="0" distR="0">
                       <wp:extent cx="3204000" cy="1376484"/>
                       <wp:effectExtent l="0" t="0" r="0" b="0"/>
-                      <wp:docPr id="11" name="Picture 12"/>
+                      <wp:docPr id="22" name="Picture 12"/>
                       <wp:cNvGraphicFramePr>
                         <a:graphicFrameLocks xmlns:a="http://schemas.openxmlformats.org/drawingml/2006/main" noChangeAspect="1"/>
                       </wp:cNvGraphicFramePr>
@@ -16492,7 +17308,7 @@
                               <pic:nvPr/>
                             </pic:nvPicPr>
                             <pic:blipFill rotWithShape="1">
-                              <a:blip r:embed="rId16"/>
+                              <a:blip r:embed="rId27"/>
                               <a:stretch/>
                             </pic:blipFill>
                             <pic:spPr bwMode="auto">
@@ -16531,8 +17347,8 @@
                       <v:path o:extrusionok="f" gradientshapeok="t" o:connecttype="rect"/>
                       <o:lock v:ext="edit" aspectratio="t"/>
                     </v:shapetype>
-                    <v:shape id="_x0000_i10" o:spid="_x0000_s10" type="#_x0000_t75" style="width:252.28pt;height:108.38pt;mso-wrap-distance-left:0.00pt;mso-wrap-distance-top:0.00pt;mso-wrap-distance-right:0.00pt;mso-wrap-distance-bottom:0.00pt;z-index:1;" stroked="false">
-                      <v:imagedata r:id="rId16" o:title=""/>
+                    <v:shape id="_x0000_i21" o:spid="_x0000_s21" type="#_x0000_t75" style="width:252.28pt;height:108.38pt;mso-wrap-distance-left:0.00pt;mso-wrap-distance-top:0.00pt;mso-wrap-distance-right:0.00pt;mso-wrap-distance-bottom:0.00pt;z-index:1;" stroked="false">
+                      <v:imagedata r:id="rId27" o:title=""/>
                       <o:lock v:ext="edit" rotation="t"/>
                     </v:shape>
                   </w:pict>
@@ -16660,7 +17476,7 @@
                     <wp:inline xmlns:wp="http://schemas.openxmlformats.org/drawingml/2006/wordprocessingDrawing" distT="0" distB="0" distL="0" distR="0">
                       <wp:extent cx="3204000" cy="2747238"/>
                       <wp:effectExtent l="0" t="0" r="0" b="0"/>
-                      <wp:docPr id="12" name="Picture 13"/>
+                      <wp:docPr id="23" name="Picture 13"/>
                       <wp:cNvGraphicFramePr>
                         <a:graphicFrameLocks xmlns:a="http://schemas.openxmlformats.org/drawingml/2006/main" noChangeAspect="1"/>
                       </wp:cNvGraphicFramePr>
@@ -16675,7 +17491,7 @@
                               <pic:nvPr/>
                             </pic:nvPicPr>
                             <pic:blipFill rotWithShape="1">
-                              <a:blip r:embed="rId21"/>
+                              <a:blip r:embed="rId32"/>
                               <a:stretch/>
                             </pic:blipFill>
                             <pic:spPr bwMode="auto">
@@ -16714,8 +17530,8 @@
                       <v:path o:extrusionok="f" gradientshapeok="t" o:connecttype="rect"/>
                       <o:lock v:ext="edit" aspectratio="t"/>
                     </v:shapetype>
-                    <v:shape id="_x0000_i11" o:spid="_x0000_s11" type="#_x0000_t75" style="width:252.28pt;height:216.32pt;mso-wrap-distance-left:0.00pt;mso-wrap-distance-top:0.00pt;mso-wrap-distance-right:0.00pt;mso-wrap-distance-bottom:0.00pt;z-index:1;" stroked="false">
-                      <v:imagedata r:id="rId21" o:title=""/>
+                    <v:shape id="_x0000_i22" o:spid="_x0000_s22" type="#_x0000_t75" style="width:252.28pt;height:216.32pt;mso-wrap-distance-left:0.00pt;mso-wrap-distance-top:0.00pt;mso-wrap-distance-right:0.00pt;mso-wrap-distance-bottom:0.00pt;z-index:1;" stroked="false">
+                      <v:imagedata r:id="rId32" o:title=""/>
                       <o:lock v:ext="edit" rotation="t"/>
                     </v:shape>
                   </w:pict>
@@ -16843,7 +17659,7 @@
                     <wp:inline xmlns:wp="http://schemas.openxmlformats.org/drawingml/2006/wordprocessingDrawing" distT="0" distB="0" distL="0" distR="0">
                       <wp:extent cx="3204000" cy="2022693"/>
                       <wp:effectExtent l="0" t="0" r="0" b="0"/>
-                      <wp:docPr id="13" name="Picture 14"/>
+                      <wp:docPr id="24" name="Picture 14"/>
                       <wp:cNvGraphicFramePr>
                         <a:graphicFrameLocks xmlns:a="http://schemas.openxmlformats.org/drawingml/2006/main" noChangeAspect="1"/>
                       </wp:cNvGraphicFramePr>
@@ -16858,7 +17674,7 @@
                               <pic:nvPr/>
                             </pic:nvPicPr>
                             <pic:blipFill rotWithShape="1">
-                              <a:blip r:embed="rId22"/>
+                              <a:blip r:embed="rId33"/>
                               <a:stretch/>
                             </pic:blipFill>
                             <pic:spPr bwMode="auto">
@@ -16897,8 +17713,8 @@
                       <v:path o:extrusionok="f" gradientshapeok="t" o:connecttype="rect"/>
                       <o:lock v:ext="edit" aspectratio="t"/>
                     </v:shapetype>
-                    <v:shape id="_x0000_i12" o:spid="_x0000_s12" type="#_x0000_t75" style="width:252.28pt;height:159.27pt;mso-wrap-distance-left:0.00pt;mso-wrap-distance-top:0.00pt;mso-wrap-distance-right:0.00pt;mso-wrap-distance-bottom:0.00pt;z-index:1;" stroked="false">
-                      <v:imagedata r:id="rId22" o:title=""/>
+                    <v:shape id="_x0000_i23" o:spid="_x0000_s23" type="#_x0000_t75" style="width:252.28pt;height:159.27pt;mso-wrap-distance-left:0.00pt;mso-wrap-distance-top:0.00pt;mso-wrap-distance-right:0.00pt;mso-wrap-distance-bottom:0.00pt;z-index:1;" stroked="false">
+                      <v:imagedata r:id="rId33" o:title=""/>
                       <o:lock v:ext="edit" rotation="t"/>
                     </v:shape>
                   </w:pict>
@@ -19691,7 +20507,7 @@
                     <wp:inline xmlns:wp="http://schemas.openxmlformats.org/drawingml/2006/wordprocessingDrawing" distT="0" distB="0" distL="0" distR="0">
                       <wp:extent cx="3176880" cy="2438420"/>
                       <wp:effectExtent l="0" t="0" r="0" b="0"/>
-                      <wp:docPr id="14" name="drawing"/>
+                      <wp:docPr id="25" name="drawing"/>
                       <wp:cNvGraphicFramePr>
                         <a:graphicFrameLocks xmlns:a="http://schemas.openxmlformats.org/drawingml/2006/main" noChangeAspect="1"/>
                       </wp:cNvGraphicFramePr>
@@ -19706,7 +20522,7 @@
                               <pic:nvPr/>
                             </pic:nvPicPr>
                             <pic:blipFill rotWithShape="1">
-                              <a:blip r:embed="rId23"/>
+                              <a:blip r:embed="rId34"/>
                               <a:stretch/>
                             </pic:blipFill>
                             <pic:spPr bwMode="auto">
@@ -19745,8 +20561,8 @@
                       <v:path o:extrusionok="f" gradientshapeok="t" o:connecttype="rect"/>
                       <o:lock v:ext="edit" aspectratio="t"/>
                     </v:shapetype>
-                    <v:shape id="_x0000_i13" o:spid="_x0000_s13" type="#_x0000_t75" style="width:250.15pt;height:192.00pt;mso-wrap-distance-left:0.00pt;mso-wrap-distance-top:0.00pt;mso-wrap-distance-right:0.00pt;mso-wrap-distance-bottom:0.00pt;rotation:0;z-index:1;" stroked="false">
-                      <v:imagedata r:id="rId23" o:title=""/>
+                    <v:shape id="_x0000_i24" o:spid="_x0000_s24" type="#_x0000_t75" style="width:250.15pt;height:192.00pt;mso-wrap-distance-left:0.00pt;mso-wrap-distance-top:0.00pt;mso-wrap-distance-right:0.00pt;mso-wrap-distance-bottom:0.00pt;rotation:0;z-index:1;" stroked="false">
+                      <v:imagedata r:id="rId34" o:title=""/>
                       <o:lock v:ext="edit" rotation="t"/>
                     </v:shape>
                   </w:pict>
@@ -19926,7 +20742,7 @@
                     <wp:inline xmlns:wp="http://schemas.openxmlformats.org/drawingml/2006/wordprocessingDrawing" distT="0" distB="0" distL="0" distR="0">
                       <wp:extent cx="3305175" cy="2038350"/>
                       <wp:effectExtent l="0" t="0" r="0" b="0"/>
-                      <wp:docPr id="15" name="drawing"/>
+                      <wp:docPr id="26" name="drawing"/>
                       <wp:cNvGraphicFramePr>
                         <a:graphicFrameLocks xmlns:a="http://schemas.openxmlformats.org/drawingml/2006/main" noChangeAspect="1"/>
                       </wp:cNvGraphicFramePr>
@@ -19941,7 +20757,7 @@
                               <pic:nvPr/>
                             </pic:nvPicPr>
                             <pic:blipFill rotWithShape="1">
-                              <a:blip r:embed="rId24"/>
+                              <a:blip r:embed="rId35"/>
                               <a:stretch/>
                             </pic:blipFill>
                             <pic:spPr bwMode="auto">
@@ -19980,8 +20796,8 @@
                       <v:path o:extrusionok="f" gradientshapeok="t" o:connecttype="rect"/>
                       <o:lock v:ext="edit" aspectratio="t"/>
                     </v:shapetype>
-                    <v:shape id="_x0000_i14" o:spid="_x0000_s14" type="#_x0000_t75" style="width:260.25pt;height:160.50pt;mso-wrap-distance-left:0.00pt;mso-wrap-distance-top:0.00pt;mso-wrap-distance-right:0.00pt;mso-wrap-distance-bottom:0.00pt;rotation:0;z-index:1;" stroked="false">
-                      <v:imagedata r:id="rId24" o:title=""/>
+                    <v:shape id="_x0000_i25" o:spid="_x0000_s25" type="#_x0000_t75" style="width:260.25pt;height:160.50pt;mso-wrap-distance-left:0.00pt;mso-wrap-distance-top:0.00pt;mso-wrap-distance-right:0.00pt;mso-wrap-distance-bottom:0.00pt;rotation:0;z-index:1;" stroked="false">
+                      <v:imagedata r:id="rId35" o:title=""/>
                       <o:lock v:ext="edit" rotation="t"/>
                     </v:shape>
                   </w:pict>
@@ -20161,7 +20977,7 @@
                     <wp:inline xmlns:wp="http://schemas.openxmlformats.org/drawingml/2006/wordprocessingDrawing" distT="0" distB="0" distL="0" distR="0">
                       <wp:extent cx="3305175" cy="2171700"/>
                       <wp:effectExtent l="0" t="0" r="0" b="0"/>
-                      <wp:docPr id="16" name="drawing"/>
+                      <wp:docPr id="27" name="drawing"/>
                       <wp:cNvGraphicFramePr>
                         <a:graphicFrameLocks xmlns:a="http://schemas.openxmlformats.org/drawingml/2006/main" noChangeAspect="1"/>
                       </wp:cNvGraphicFramePr>
@@ -20176,7 +20992,7 @@
                               <pic:nvPr/>
                             </pic:nvPicPr>
                             <pic:blipFill rotWithShape="1">
-                              <a:blip r:embed="rId25"/>
+                              <a:blip r:embed="rId36"/>
                               <a:stretch/>
                             </pic:blipFill>
                             <pic:spPr bwMode="auto">
@@ -20215,8 +21031,8 @@
                       <v:path o:extrusionok="f" gradientshapeok="t" o:connecttype="rect"/>
                       <o:lock v:ext="edit" aspectratio="t"/>
                     </v:shapetype>
-                    <v:shape id="_x0000_i15" o:spid="_x0000_s15" type="#_x0000_t75" style="width:260.25pt;height:171.00pt;mso-wrap-distance-left:0.00pt;mso-wrap-distance-top:0.00pt;mso-wrap-distance-right:0.00pt;mso-wrap-distance-bottom:0.00pt;rotation:0;z-index:1;" stroked="false">
-                      <v:imagedata r:id="rId25" o:title=""/>
+                    <v:shape id="_x0000_i26" o:spid="_x0000_s26" type="#_x0000_t75" style="width:260.25pt;height:171.00pt;mso-wrap-distance-left:0.00pt;mso-wrap-distance-top:0.00pt;mso-wrap-distance-right:0.00pt;mso-wrap-distance-bottom:0.00pt;rotation:0;z-index:1;" stroked="false">
+                      <v:imagedata r:id="rId36" o:title=""/>
                       <o:lock v:ext="edit" rotation="t"/>
                     </v:shape>
                   </w:pict>
@@ -22328,7 +23144,7 @@
                     <wp:inline xmlns:wp="http://schemas.openxmlformats.org/drawingml/2006/wordprocessingDrawing" distT="0" distB="0" distL="0" distR="0">
                       <wp:extent cx="3305175" cy="2495550"/>
                       <wp:effectExtent l="0" t="0" r="0" b="0"/>
-                      <wp:docPr id="17" name="drawing"/>
+                      <wp:docPr id="28" name="drawing"/>
                       <wp:cNvGraphicFramePr>
                         <a:graphicFrameLocks xmlns:a="http://schemas.openxmlformats.org/drawingml/2006/main" noChangeAspect="1"/>
                       </wp:cNvGraphicFramePr>
@@ -22343,7 +23159,7 @@
                               <pic:nvPr/>
                             </pic:nvPicPr>
                             <pic:blipFill rotWithShape="1">
-                              <a:blip r:embed="rId26"/>
+                              <a:blip r:embed="rId37"/>
                               <a:stretch/>
                             </pic:blipFill>
                             <pic:spPr bwMode="auto">
@@ -22382,8 +23198,8 @@
                       <v:path o:extrusionok="f" gradientshapeok="t" o:connecttype="rect"/>
                       <o:lock v:ext="edit" aspectratio="t"/>
                     </v:shapetype>
-                    <v:shape id="_x0000_i16" o:spid="_x0000_s16" type="#_x0000_t75" style="width:260.25pt;height:196.50pt;mso-wrap-distance-left:0.00pt;mso-wrap-distance-top:0.00pt;mso-wrap-distance-right:0.00pt;mso-wrap-distance-bottom:0.00pt;rotation:0;z-index:1;" stroked="false">
-                      <v:imagedata r:id="rId26" o:title=""/>
+                    <v:shape id="_x0000_i27" o:spid="_x0000_s27" type="#_x0000_t75" style="width:260.25pt;height:196.50pt;mso-wrap-distance-left:0.00pt;mso-wrap-distance-top:0.00pt;mso-wrap-distance-right:0.00pt;mso-wrap-distance-bottom:0.00pt;rotation:0;z-index:1;" stroked="false">
+                      <v:imagedata r:id="rId37" o:title=""/>
                       <o:lock v:ext="edit" rotation="t"/>
                     </v:shape>
                   </w:pict>
@@ -22563,7 +23379,7 @@
                     <wp:inline xmlns:wp="http://schemas.openxmlformats.org/drawingml/2006/wordprocessingDrawing" distT="0" distB="0" distL="0" distR="0">
                       <wp:extent cx="3305175" cy="2495550"/>
                       <wp:effectExtent l="0" t="0" r="0" b="0"/>
-                      <wp:docPr id="18" name="drawing"/>
+                      <wp:docPr id="29" name="drawing"/>
                       <wp:cNvGraphicFramePr>
                         <a:graphicFrameLocks xmlns:a="http://schemas.openxmlformats.org/drawingml/2006/main" noChangeAspect="1"/>
                       </wp:cNvGraphicFramePr>
@@ -22578,7 +23394,7 @@
                               <pic:nvPr/>
                             </pic:nvPicPr>
                             <pic:blipFill rotWithShape="1">
-                              <a:blip r:embed="rId26"/>
+                              <a:blip r:embed="rId37"/>
                               <a:stretch/>
                             </pic:blipFill>
                             <pic:spPr bwMode="auto">
@@ -22617,8 +23433,8 @@
                       <v:path o:extrusionok="f" gradientshapeok="t" o:connecttype="rect"/>
                       <o:lock v:ext="edit" aspectratio="t"/>
                     </v:shapetype>
-                    <v:shape id="_x0000_i17" o:spid="_x0000_s17" type="#_x0000_t75" style="width:260.25pt;height:196.50pt;mso-wrap-distance-left:0.00pt;mso-wrap-distance-top:0.00pt;mso-wrap-distance-right:0.00pt;mso-wrap-distance-bottom:0.00pt;rotation:0;z-index:1;" stroked="false">
-                      <v:imagedata r:id="rId26" o:title=""/>
+                    <v:shape id="_x0000_i28" o:spid="_x0000_s28" type="#_x0000_t75" style="width:260.25pt;height:196.50pt;mso-wrap-distance-left:0.00pt;mso-wrap-distance-top:0.00pt;mso-wrap-distance-right:0.00pt;mso-wrap-distance-bottom:0.00pt;rotation:0;z-index:1;" stroked="false">
+                      <v:imagedata r:id="rId37" o:title=""/>
                       <o:lock v:ext="edit" rotation="t"/>
                     </v:shape>
                   </w:pict>
@@ -22798,7 +23614,7 @@
                     <wp:inline xmlns:wp="http://schemas.openxmlformats.org/drawingml/2006/wordprocessingDrawing" distT="0" distB="0" distL="0" distR="0">
                       <wp:extent cx="2862580" cy="1905635"/>
                       <wp:effectExtent l="0" t="0" r="0" b="0"/>
-                      <wp:docPr id="19" name="Grupo 1"/>
+                      <wp:docPr id="30" name="Grupo 1"/>
                       <wp:cNvGraphicFramePr/>
                       <a:graphic xmlns:a="http://schemas.openxmlformats.org/drawingml/2006/main">
                         <a:graphicData uri="http://schemas.microsoft.com/office/word/2010/wordprocessingGroup">
@@ -22821,7 +23637,7 @@
                                 <pic:nvPr/>
                               </pic:nvPicPr>
                               <pic:blipFill rotWithShape="1">
-                                <a:blip r:embed="rId26"/>
+                                <a:blip r:embed="rId37"/>
                                 <a:stretch/>
                               </pic:blipFill>
                               <pic:spPr bwMode="auto">
@@ -22842,7 +23658,7 @@
                 </mc:Choice>
                 <mc:Fallback>
                   <w:pict>
-                    <v:group id="group 18" o:spid="_x0000_s0000" style="width:225.40pt;height:150.05pt;mso-wrap-distance-left:0.00pt;mso-wrap-distance-top:0.00pt;mso-wrap-distance-right:0.00pt;mso-wrap-distance-bottom:0.00pt;rotation:0;" coordorigin="0,0" coordsize="34566,24955">
+                    <v:group id="group 29" o:spid="_x0000_s0000" style="width:225.40pt;height:150.05pt;mso-wrap-distance-left:0.00pt;mso-wrap-distance-top:0.00pt;mso-wrap-distance-right:0.00pt;mso-wrap-distance-bottom:0.00pt;rotation:0;" coordorigin="0,0" coordsize="34566,24955">
                       <v:shapetype id="_x0000_t75" coordsize="21600,21600" o:spt="75" o:preferrelative="t" path="m@4@5l@4@11@9@11@9@5xe" filled="f" stroked="f">
                         <v:stroke joinstyle="miter"/>
                         <v:formulas>
@@ -22862,8 +23678,8 @@
                         <v:path o:extrusionok="f" gradientshapeok="t" o:connecttype="rect"/>
                         <o:lock v:ext="edit" aspectratio="t"/>
                       </v:shapetype>
-                      <v:shape id="_x0000_i19" o:spid="_x0000_s19" type="#_x0000_t75" style="position:absolute;left:1096;top:0;width:33051;height:24955;z-index:1;" stroked="false">
-                        <v:imagedata r:id="rId26" o:title=""/>
+                      <v:shape id="_x0000_i30" o:spid="_x0000_s30" type="#_x0000_t75" style="position:absolute;left:1096;top:0;width:33051;height:24955;z-index:1;" stroked="false">
+                        <v:imagedata r:id="rId37" o:title=""/>
                         <o:lock v:ext="edit" rotation="t"/>
                       </v:shape>
                     </v:group>
@@ -23044,7 +23860,7 @@
                     <wp:inline xmlns:wp="http://schemas.openxmlformats.org/drawingml/2006/wordprocessingDrawing" distT="0" distB="0" distL="0" distR="0">
                       <wp:extent cx="3176270" cy="2334260"/>
                       <wp:effectExtent l="0" t="0" r="0" b="0"/>
-                      <wp:docPr id="20" name="Grupo 1"/>
+                      <wp:docPr id="31" name="Grupo 1"/>
                       <wp:cNvGraphicFramePr/>
                       <a:graphic xmlns:a="http://schemas.openxmlformats.org/drawingml/2006/main">
                         <a:graphicData uri="http://schemas.microsoft.com/office/word/2010/wordprocessingGroup">
@@ -23067,7 +23883,7 @@
                                 <pic:nvPr/>
                               </pic:nvPicPr>
                               <pic:blipFill rotWithShape="1">
-                                <a:blip r:embed="rId26"/>
+                                <a:blip r:embed="rId37"/>
                                 <a:stretch/>
                               </pic:blipFill>
                               <pic:spPr bwMode="auto">
@@ -23088,7 +23904,7 @@
                 </mc:Choice>
                 <mc:Fallback>
                   <w:pict>
-                    <v:group id="group 20" o:spid="_x0000_s0000" style="width:250.10pt;height:183.80pt;mso-wrap-distance-left:0.00pt;mso-wrap-distance-top:0.00pt;mso-wrap-distance-right:0.00pt;mso-wrap-distance-bottom:0.00pt;rotation:0;" coordorigin="0,0" coordsize="33960,24955">
+                    <v:group id="group 31" o:spid="_x0000_s0000" style="width:250.10pt;height:183.80pt;mso-wrap-distance-left:0.00pt;mso-wrap-distance-top:0.00pt;mso-wrap-distance-right:0.00pt;mso-wrap-distance-bottom:0.00pt;rotation:0;" coordorigin="0,0" coordsize="33960,24955">
                       <v:shapetype id="_x0000_t75" coordsize="21600,21600" o:spt="75" o:preferrelative="t" path="m@4@5l@4@11@9@11@9@5xe" filled="f" stroked="f">
                         <v:stroke joinstyle="miter"/>
                         <v:formulas>
@@ -23108,8 +23924,8 @@
                         <v:path o:extrusionok="f" gradientshapeok="t" o:connecttype="rect"/>
                         <o:lock v:ext="edit" aspectratio="t"/>
                       </v:shapetype>
-                      <v:shape id="_x0000_i21" o:spid="_x0000_s21" type="#_x0000_t75" style="position:absolute;left:0;top:0;width:33051;height:24955;z-index:1;" stroked="false">
-                        <v:imagedata r:id="rId26" o:title=""/>
+                      <v:shape id="_x0000_i32" o:spid="_x0000_s32" type="#_x0000_t75" style="position:absolute;left:0;top:0;width:33051;height:24955;z-index:1;" stroked="false">
+                        <v:imagedata r:id="rId37" o:title=""/>
                         <o:lock v:ext="edit" rotation="t"/>
                       </v:shape>
                     </v:group>
@@ -24259,7 +25075,7 @@
                     <wp:inline xmlns:wp="http://schemas.openxmlformats.org/drawingml/2006/wordprocessingDrawing" distT="0" distB="0" distL="0" distR="0">
                       <wp:extent cx="3095625" cy="3112928"/>
                       <wp:effectExtent l="0" t="0" r="0" b="0"/>
-                      <wp:docPr id="21" name="drawing"/>
+                      <wp:docPr id="32" name="drawing"/>
                       <wp:cNvGraphicFramePr>
                         <a:graphicFrameLocks xmlns:a="http://schemas.openxmlformats.org/drawingml/2006/main" noChangeAspect="1"/>
                       </wp:cNvGraphicFramePr>
@@ -24274,7 +25090,7 @@
                               <pic:nvPr/>
                             </pic:nvPicPr>
                             <pic:blipFill rotWithShape="1">
-                              <a:blip r:embed="rId27"/>
+                              <a:blip r:embed="rId38"/>
                               <a:stretch/>
                             </pic:blipFill>
                             <pic:spPr bwMode="auto">
@@ -24313,8 +25129,8 @@
                       <v:path o:extrusionok="f" gradientshapeok="t" o:connecttype="rect"/>
                       <o:lock v:ext="edit" aspectratio="t"/>
                     </v:shapetype>
-                    <v:shape id="_x0000_i22" o:spid="_x0000_s22" type="#_x0000_t75" style="width:243.75pt;height:245.11pt;mso-wrap-distance-left:0.00pt;mso-wrap-distance-top:0.00pt;mso-wrap-distance-right:0.00pt;mso-wrap-distance-bottom:0.00pt;rotation:0;z-index:1;" stroked="false">
-                      <v:imagedata r:id="rId27" o:title=""/>
+                    <v:shape id="_x0000_i33" o:spid="_x0000_s33" type="#_x0000_t75" style="width:243.75pt;height:245.11pt;mso-wrap-distance-left:0.00pt;mso-wrap-distance-top:0.00pt;mso-wrap-distance-right:0.00pt;mso-wrap-distance-bottom:0.00pt;rotation:0;z-index:1;" stroked="false">
+                      <v:imagedata r:id="rId38" o:title=""/>
                       <o:lock v:ext="edit" rotation="t"/>
                     </v:shape>
                   </w:pict>
@@ -24494,7 +25310,7 @@
                     <wp:inline xmlns:wp="http://schemas.openxmlformats.org/drawingml/2006/wordprocessingDrawing" distT="0" distB="0" distL="0" distR="0">
                       <wp:extent cx="3171825" cy="2449709"/>
                       <wp:effectExtent l="0" t="0" r="0" b="0"/>
-                      <wp:docPr id="22" name="drawing"/>
+                      <wp:docPr id="33" name="drawing"/>
                       <wp:cNvGraphicFramePr>
                         <a:graphicFrameLocks xmlns:a="http://schemas.openxmlformats.org/drawingml/2006/main" noChangeAspect="1"/>
                       </wp:cNvGraphicFramePr>
@@ -24509,7 +25325,7 @@
                               <pic:nvPr/>
                             </pic:nvPicPr>
                             <pic:blipFill rotWithShape="1">
-                              <a:blip r:embed="rId28"/>
+                              <a:blip r:embed="rId39"/>
                               <a:stretch/>
                             </pic:blipFill>
                             <pic:spPr bwMode="auto">
@@ -24548,8 +25364,8 @@
                       <v:path o:extrusionok="f" gradientshapeok="t" o:connecttype="rect"/>
                       <o:lock v:ext="edit" aspectratio="t"/>
                     </v:shapetype>
-                    <v:shape id="_x0000_i23" o:spid="_x0000_s23" type="#_x0000_t75" style="width:249.75pt;height:192.89pt;mso-wrap-distance-left:0.00pt;mso-wrap-distance-top:0.00pt;mso-wrap-distance-right:0.00pt;mso-wrap-distance-bottom:0.00pt;rotation:0;z-index:1;" stroked="false">
-                      <v:imagedata r:id="rId28" o:title=""/>
+                    <v:shape id="_x0000_i34" o:spid="_x0000_s34" type="#_x0000_t75" style="width:249.75pt;height:192.89pt;mso-wrap-distance-left:0.00pt;mso-wrap-distance-top:0.00pt;mso-wrap-distance-right:0.00pt;mso-wrap-distance-bottom:0.00pt;rotation:0;z-index:1;" stroked="false">
+                      <v:imagedata r:id="rId39" o:title=""/>
                       <o:lock v:ext="edit" rotation="t"/>
                     </v:shape>
                   </w:pict>
@@ -24745,7 +25561,7 @@
                     <wp:inline xmlns:wp="http://schemas.openxmlformats.org/drawingml/2006/wordprocessingDrawing" distT="0" distB="0" distL="0" distR="0">
                       <wp:extent cx="3305175" cy="1914525"/>
                       <wp:effectExtent l="0" t="0" r="0" b="0"/>
-                      <wp:docPr id="23" name="drawing"/>
+                      <wp:docPr id="34" name="drawing"/>
                       <wp:cNvGraphicFramePr>
                         <a:graphicFrameLocks xmlns:a="http://schemas.openxmlformats.org/drawingml/2006/main" noChangeAspect="1"/>
                       </wp:cNvGraphicFramePr>
@@ -24760,7 +25576,7 @@
                               <pic:nvPr/>
                             </pic:nvPicPr>
                             <pic:blipFill rotWithShape="1">
-                              <a:blip r:embed="rId29"/>
+                              <a:blip r:embed="rId40"/>
                               <a:stretch/>
                             </pic:blipFill>
                             <pic:spPr bwMode="auto">
@@ -24799,8 +25615,8 @@
                       <v:path o:extrusionok="f" gradientshapeok="t" o:connecttype="rect"/>
                       <o:lock v:ext="edit" aspectratio="t"/>
                     </v:shapetype>
-                    <v:shape id="_x0000_i24" o:spid="_x0000_s24" type="#_x0000_t75" style="width:260.25pt;height:150.75pt;mso-wrap-distance-left:0.00pt;mso-wrap-distance-top:0.00pt;mso-wrap-distance-right:0.00pt;mso-wrap-distance-bottom:0.00pt;rotation:0;z-index:1;" stroked="false">
-                      <v:imagedata r:id="rId29" o:title=""/>
+                    <v:shape id="_x0000_i35" o:spid="_x0000_s35" type="#_x0000_t75" style="width:260.25pt;height:150.75pt;mso-wrap-distance-left:0.00pt;mso-wrap-distance-top:0.00pt;mso-wrap-distance-right:0.00pt;mso-wrap-distance-bottom:0.00pt;rotation:0;z-index:1;" stroked="false">
+                      <v:imagedata r:id="rId40" o:title=""/>
                       <o:lock v:ext="edit" rotation="t"/>
                     </v:shape>
                   </w:pict>
@@ -24988,7 +25804,7 @@
                     <wp:inline xmlns:wp="http://schemas.openxmlformats.org/drawingml/2006/wordprocessingDrawing" distT="0" distB="0" distL="0" distR="0">
                       <wp:extent cx="3305175" cy="1943100"/>
                       <wp:effectExtent l="0" t="0" r="0" b="0"/>
-                      <wp:docPr id="24" name="drawing"/>
+                      <wp:docPr id="35" name="drawing"/>
                       <wp:cNvGraphicFramePr>
                         <a:graphicFrameLocks xmlns:a="http://schemas.openxmlformats.org/drawingml/2006/main" noChangeAspect="1"/>
                       </wp:cNvGraphicFramePr>
@@ -25003,7 +25819,7 @@
                               <pic:nvPr/>
                             </pic:nvPicPr>
                             <pic:blipFill rotWithShape="1">
-                              <a:blip r:embed="rId30"/>
+                              <a:blip r:embed="rId41"/>
                               <a:stretch/>
                             </pic:blipFill>
                             <pic:spPr bwMode="auto">
@@ -25042,8 +25858,8 @@
                       <v:path o:extrusionok="f" gradientshapeok="t" o:connecttype="rect"/>
                       <o:lock v:ext="edit" aspectratio="t"/>
                     </v:shapetype>
-                    <v:shape id="_x0000_i25" o:spid="_x0000_s25" type="#_x0000_t75" style="width:260.25pt;height:153.00pt;mso-wrap-distance-left:0.00pt;mso-wrap-distance-top:0.00pt;mso-wrap-distance-right:0.00pt;mso-wrap-distance-bottom:0.00pt;rotation:0;z-index:1;" stroked="false">
-                      <v:imagedata r:id="rId30" o:title=""/>
+                    <v:shape id="_x0000_i36" o:spid="_x0000_s36" type="#_x0000_t75" style="width:260.25pt;height:153.00pt;mso-wrap-distance-left:0.00pt;mso-wrap-distance-top:0.00pt;mso-wrap-distance-right:0.00pt;mso-wrap-distance-bottom:0.00pt;rotation:0;z-index:1;" stroked="false">
+                      <v:imagedata r:id="rId41" o:title=""/>
                       <o:lock v:ext="edit" rotation="t"/>
                     </v:shape>
                   </w:pict>
@@ -25182,7 +25998,7 @@
                     <wp:inline xmlns:wp="http://schemas.openxmlformats.org/drawingml/2006/wordprocessingDrawing" distT="0" distB="0" distL="0" distR="0">
                       <wp:extent cx="3305175" cy="3133725"/>
                       <wp:effectExtent l="0" t="0" r="0" b="0"/>
-                      <wp:docPr id="25" name="drawing"/>
+                      <wp:docPr id="36" name="drawing"/>
                       <wp:cNvGraphicFramePr>
                         <a:graphicFrameLocks xmlns:a="http://schemas.openxmlformats.org/drawingml/2006/main" noChangeAspect="1"/>
                       </wp:cNvGraphicFramePr>
@@ -25197,7 +26013,7 @@
                               <pic:nvPr/>
                             </pic:nvPicPr>
                             <pic:blipFill rotWithShape="1">
-                              <a:blip r:embed="rId31"/>
+                              <a:blip r:embed="rId42"/>
                               <a:stretch/>
                             </pic:blipFill>
                             <pic:spPr bwMode="auto">
@@ -25236,8 +26052,8 @@
                       <v:path o:extrusionok="f" gradientshapeok="t" o:connecttype="rect"/>
                       <o:lock v:ext="edit" aspectratio="t"/>
                     </v:shapetype>
-                    <v:shape id="_x0000_i26" o:spid="_x0000_s26" type="#_x0000_t75" style="width:260.25pt;height:246.75pt;mso-wrap-distance-left:0.00pt;mso-wrap-distance-top:0.00pt;mso-wrap-distance-right:0.00pt;mso-wrap-distance-bottom:0.00pt;rotation:0;z-index:1;" stroked="false">
-                      <v:imagedata r:id="rId31" o:title=""/>
+                    <v:shape id="_x0000_i37" o:spid="_x0000_s37" type="#_x0000_t75" style="width:260.25pt;height:246.75pt;mso-wrap-distance-left:0.00pt;mso-wrap-distance-top:0.00pt;mso-wrap-distance-right:0.00pt;mso-wrap-distance-bottom:0.00pt;rotation:0;z-index:1;" stroked="false">
+                      <v:imagedata r:id="rId42" o:title=""/>
                       <o:lock v:ext="edit" rotation="t"/>
                     </v:shape>
                   </w:pict>
@@ -25385,7 +26201,7 @@
                     <wp:inline xmlns:wp="http://schemas.openxmlformats.org/drawingml/2006/wordprocessingDrawing" distT="0" distB="0" distL="0" distR="0">
                       <wp:extent cx="3305175" cy="2905125"/>
                       <wp:effectExtent l="0" t="0" r="0" b="0"/>
-                      <wp:docPr id="26" name="drawing"/>
+                      <wp:docPr id="37" name="drawing"/>
                       <wp:cNvGraphicFramePr>
                         <a:graphicFrameLocks xmlns:a="http://schemas.openxmlformats.org/drawingml/2006/main" noChangeAspect="1"/>
                       </wp:cNvGraphicFramePr>
@@ -25400,7 +26216,7 @@
                               <pic:nvPr/>
                             </pic:nvPicPr>
                             <pic:blipFill rotWithShape="1">
-                              <a:blip r:embed="rId32"/>
+                              <a:blip r:embed="rId43"/>
                               <a:stretch/>
                             </pic:blipFill>
                             <pic:spPr bwMode="auto">
@@ -25439,8 +26255,8 @@
                       <v:path o:extrusionok="f" gradientshapeok="t" o:connecttype="rect"/>
                       <o:lock v:ext="edit" aspectratio="t"/>
                     </v:shapetype>
-                    <v:shape id="_x0000_i27" o:spid="_x0000_s27" type="#_x0000_t75" style="width:260.25pt;height:228.75pt;mso-wrap-distance-left:0.00pt;mso-wrap-distance-top:0.00pt;mso-wrap-distance-right:0.00pt;mso-wrap-distance-bottom:0.00pt;rotation:0;z-index:1;" stroked="false">
-                      <v:imagedata r:id="rId32" o:title=""/>
+                    <v:shape id="_x0000_i38" o:spid="_x0000_s38" type="#_x0000_t75" style="width:260.25pt;height:228.75pt;mso-wrap-distance-left:0.00pt;mso-wrap-distance-top:0.00pt;mso-wrap-distance-right:0.00pt;mso-wrap-distance-bottom:0.00pt;rotation:0;z-index:1;" stroked="false">
+                      <v:imagedata r:id="rId43" o:title=""/>
                       <o:lock v:ext="edit" rotation="t"/>
                     </v:shape>
                   </w:pict>
@@ -25579,7 +26395,7 @@
                     <wp:inline xmlns:wp="http://schemas.openxmlformats.org/drawingml/2006/wordprocessingDrawing" distT="0" distB="0" distL="0" distR="0">
                       <wp:extent cx="3305175" cy="2905125"/>
                       <wp:effectExtent l="0" t="0" r="0" b="0"/>
-                      <wp:docPr id="27" name="Grupo 1"/>
+                      <wp:docPr id="38" name="Grupo 1"/>
                       <wp:cNvGraphicFramePr/>
                       <a:graphic xmlns:a="http://schemas.openxmlformats.org/drawingml/2006/main">
                         <a:graphicData uri="http://schemas.microsoft.com/office/word/2010/wordprocessingGroup">
@@ -25602,7 +26418,7 @@
                                 <pic:nvPr/>
                               </pic:nvPicPr>
                               <pic:blipFill rotWithShape="1">
-                                <a:blip r:embed="rId32"/>
+                                <a:blip r:embed="rId43"/>
                                 <a:stretch/>
                               </pic:blipFill>
                               <pic:spPr bwMode="auto">
@@ -25623,7 +26439,7 @@
                 </mc:Choice>
                 <mc:Fallback>
                   <w:pict>
-                    <v:group id="group 28" o:spid="_x0000_s0000" style="width:260.25pt;height:228.75pt;mso-wrap-distance-left:0.00pt;mso-wrap-distance-top:0.00pt;mso-wrap-distance-right:0.00pt;mso-wrap-distance-bottom:0.00pt;rotation:0;" coordorigin="0,0" coordsize="33051,29051">
+                    <v:group id="group 39" o:spid="_x0000_s0000" style="width:260.25pt;height:228.75pt;mso-wrap-distance-left:0.00pt;mso-wrap-distance-top:0.00pt;mso-wrap-distance-right:0.00pt;mso-wrap-distance-bottom:0.00pt;rotation:0;" coordorigin="0,0" coordsize="33051,29051">
                       <v:shapetype id="_x0000_t75" coordsize="21600,21600" o:spt="75" o:preferrelative="t" path="m@4@5l@4@11@9@11@9@5xe" filled="f" stroked="f">
                         <v:stroke joinstyle="miter"/>
                         <v:formulas>
@@ -25643,8 +26459,8 @@
                         <v:path o:extrusionok="f" gradientshapeok="t" o:connecttype="rect"/>
                         <o:lock v:ext="edit" aspectratio="t"/>
                       </v:shapetype>
-                      <v:shape id="_x0000_i29" o:spid="_x0000_s29" type="#_x0000_t75" style="position:absolute;left:0;top:0;width:33051;height:29051;z-index:1;" stroked="false">
-                        <v:imagedata r:id="rId32" o:title=""/>
+                      <v:shape id="_x0000_i40" o:spid="_x0000_s40" type="#_x0000_t75" style="position:absolute;left:0;top:0;width:33051;height:29051;z-index:1;" stroked="false">
+                        <v:imagedata r:id="rId43" o:title=""/>
                         <o:lock v:ext="edit" rotation="t"/>
                       </v:shape>
                     </v:group>
@@ -25784,7 +26600,7 @@
                     <wp:inline xmlns:wp="http://schemas.openxmlformats.org/drawingml/2006/wordprocessingDrawing" distT="0" distB="0" distL="0" distR="0">
                       <wp:extent cx="3305175" cy="1819275"/>
                       <wp:effectExtent l="0" t="0" r="0" b="0"/>
-                      <wp:docPr id="28" name="drawing"/>
+                      <wp:docPr id="39" name="drawing"/>
                       <wp:cNvGraphicFramePr>
                         <a:graphicFrameLocks xmlns:a="http://schemas.openxmlformats.org/drawingml/2006/main" noChangeAspect="1"/>
                       </wp:cNvGraphicFramePr>
@@ -25799,7 +26615,7 @@
                               <pic:nvPr/>
                             </pic:nvPicPr>
                             <pic:blipFill rotWithShape="1">
-                              <a:blip r:embed="rId33"/>
+                              <a:blip r:embed="rId44"/>
                               <a:stretch/>
                             </pic:blipFill>
                             <pic:spPr bwMode="auto">
@@ -25838,8 +26654,8 @@
                       <v:path o:extrusionok="f" gradientshapeok="t" o:connecttype="rect"/>
                       <o:lock v:ext="edit" aspectratio="t"/>
                     </v:shapetype>
-                    <v:shape id="_x0000_i30" o:spid="_x0000_s30" type="#_x0000_t75" style="width:260.25pt;height:143.25pt;mso-wrap-distance-left:0.00pt;mso-wrap-distance-top:0.00pt;mso-wrap-distance-right:0.00pt;mso-wrap-distance-bottom:0.00pt;rotation:0;z-index:1;" stroked="false">
-                      <v:imagedata r:id="rId33" o:title=""/>
+                    <v:shape id="_x0000_i41" o:spid="_x0000_s41" type="#_x0000_t75" style="width:260.25pt;height:143.25pt;mso-wrap-distance-left:0.00pt;mso-wrap-distance-top:0.00pt;mso-wrap-distance-right:0.00pt;mso-wrap-distance-bottom:0.00pt;rotation:0;z-index:1;" stroked="false">
+                      <v:imagedata r:id="rId44" o:title=""/>
                       <o:lock v:ext="edit" rotation="t"/>
                     </v:shape>
                   </w:pict>
@@ -25986,7 +26802,7 @@
                     <wp:inline xmlns:wp="http://schemas.openxmlformats.org/drawingml/2006/wordprocessingDrawing" distT="0" distB="0" distL="0" distR="0">
                       <wp:extent cx="3305175" cy="2085975"/>
                       <wp:effectExtent l="0" t="0" r="0" b="0"/>
-                      <wp:docPr id="29" name="drawing"/>
+                      <wp:docPr id="40" name="drawing"/>
                       <wp:cNvGraphicFramePr>
                         <a:graphicFrameLocks xmlns:a="http://schemas.openxmlformats.org/drawingml/2006/main" noChangeAspect="1"/>
                       </wp:cNvGraphicFramePr>
@@ -26001,7 +26817,7 @@
                               <pic:nvPr/>
                             </pic:nvPicPr>
                             <pic:blipFill rotWithShape="1">
-                              <a:blip r:embed="rId34"/>
+                              <a:blip r:embed="rId45"/>
                               <a:stretch/>
                             </pic:blipFill>
                             <pic:spPr bwMode="auto">
@@ -26040,8 +26856,8 @@
                       <v:path o:extrusionok="f" gradientshapeok="t" o:connecttype="rect"/>
                       <o:lock v:ext="edit" aspectratio="t"/>
                     </v:shapetype>
-                    <v:shape id="_x0000_i31" o:spid="_x0000_s31" type="#_x0000_t75" style="width:260.25pt;height:164.25pt;mso-wrap-distance-left:0.00pt;mso-wrap-distance-top:0.00pt;mso-wrap-distance-right:0.00pt;mso-wrap-distance-bottom:0.00pt;rotation:0;z-index:1;" stroked="false">
-                      <v:imagedata r:id="rId34" o:title=""/>
+                    <v:shape id="_x0000_i42" o:spid="_x0000_s42" type="#_x0000_t75" style="width:260.25pt;height:164.25pt;mso-wrap-distance-left:0.00pt;mso-wrap-distance-top:0.00pt;mso-wrap-distance-right:0.00pt;mso-wrap-distance-bottom:0.00pt;rotation:0;z-index:1;" stroked="false">
+                      <v:imagedata r:id="rId45" o:title=""/>
                       <o:lock v:ext="edit" rotation="t"/>
                     </v:shape>
                   </w:pict>
@@ -27022,7 +27838,7 @@
                     <wp:inline xmlns:wp="http://schemas.openxmlformats.org/drawingml/2006/wordprocessingDrawing" distT="0" distB="0" distL="0" distR="0">
                       <wp:extent cx="3204000" cy="1377202"/>
                       <wp:effectExtent l="0" t="0" r="0" b="0"/>
-                      <wp:docPr id="30" name="Picture 15"/>
+                      <wp:docPr id="41" name="Picture 15"/>
                       <wp:cNvGraphicFramePr>
                         <a:graphicFrameLocks xmlns:a="http://schemas.openxmlformats.org/drawingml/2006/main" noChangeAspect="1"/>
                       </wp:cNvGraphicFramePr>
@@ -27037,7 +27853,7 @@
                               <pic:nvPr/>
                             </pic:nvPicPr>
                             <pic:blipFill rotWithShape="1">
-                              <a:blip r:embed="rId35"/>
+                              <a:blip r:embed="rId46"/>
                               <a:stretch/>
                             </pic:blipFill>
                             <pic:spPr bwMode="auto">
@@ -27076,8 +27892,8 @@
                       <v:path o:extrusionok="f" gradientshapeok="t" o:connecttype="rect"/>
                       <o:lock v:ext="edit" aspectratio="t"/>
                     </v:shapetype>
-                    <v:shape id="_x0000_i32" o:spid="_x0000_s32" type="#_x0000_t75" style="width:252.28pt;height:108.44pt;mso-wrap-distance-left:0.00pt;mso-wrap-distance-top:0.00pt;mso-wrap-distance-right:0.00pt;mso-wrap-distance-bottom:0.00pt;z-index:1;" stroked="false">
-                      <v:imagedata r:id="rId35" o:title=""/>
+                    <v:shape id="_x0000_i43" o:spid="_x0000_s43" type="#_x0000_t75" style="width:252.28pt;height:108.44pt;mso-wrap-distance-left:0.00pt;mso-wrap-distance-top:0.00pt;mso-wrap-distance-right:0.00pt;mso-wrap-distance-bottom:0.00pt;z-index:1;" stroked="false">
+                      <v:imagedata r:id="rId46" o:title=""/>
                       <o:lock v:ext="edit" rotation="t"/>
                     </v:shape>
                   </w:pict>
@@ -27205,7 +28021,7 @@
                     <wp:inline xmlns:wp="http://schemas.openxmlformats.org/drawingml/2006/wordprocessingDrawing" distT="0" distB="0" distL="0" distR="0">
                       <wp:extent cx="3204000" cy="1377202"/>
                       <wp:effectExtent l="0" t="0" r="0" b="0"/>
-                      <wp:docPr id="31" name="Picture 16"/>
+                      <wp:docPr id="42" name="Picture 16"/>
                       <wp:cNvGraphicFramePr>
                         <a:graphicFrameLocks xmlns:a="http://schemas.openxmlformats.org/drawingml/2006/main" noChangeAspect="1"/>
                       </wp:cNvGraphicFramePr>
@@ -27220,7 +28036,7 @@
                               <pic:nvPr/>
                             </pic:nvPicPr>
                             <pic:blipFill rotWithShape="1">
-                              <a:blip r:embed="rId35"/>
+                              <a:blip r:embed="rId46"/>
                               <a:stretch/>
                             </pic:blipFill>
                             <pic:spPr bwMode="auto">
@@ -27259,8 +28075,8 @@
                       <v:path o:extrusionok="f" gradientshapeok="t" o:connecttype="rect"/>
                       <o:lock v:ext="edit" aspectratio="t"/>
                     </v:shapetype>
-                    <v:shape id="_x0000_i33" o:spid="_x0000_s33" type="#_x0000_t75" style="width:252.28pt;height:108.44pt;mso-wrap-distance-left:0.00pt;mso-wrap-distance-top:0.00pt;mso-wrap-distance-right:0.00pt;mso-wrap-distance-bottom:0.00pt;z-index:1;" stroked="false">
-                      <v:imagedata r:id="rId35" o:title=""/>
+                    <v:shape id="_x0000_i44" o:spid="_x0000_s44" type="#_x0000_t75" style="width:252.28pt;height:108.44pt;mso-wrap-distance-left:0.00pt;mso-wrap-distance-top:0.00pt;mso-wrap-distance-right:0.00pt;mso-wrap-distance-bottom:0.00pt;z-index:1;" stroked="false">
+                      <v:imagedata r:id="rId46" o:title=""/>
                       <o:lock v:ext="edit" rotation="t"/>
                     </v:shape>
                   </w:pict>
@@ -27388,7 +28204,7 @@
                     <wp:inline xmlns:wp="http://schemas.openxmlformats.org/drawingml/2006/wordprocessingDrawing" distT="0" distB="0" distL="0" distR="0">
                       <wp:extent cx="3204000" cy="1377202"/>
                       <wp:effectExtent l="0" t="0" r="0" b="0"/>
-                      <wp:docPr id="32" name="Picture 17"/>
+                      <wp:docPr id="43" name="Picture 17"/>
                       <wp:cNvGraphicFramePr>
                         <a:graphicFrameLocks xmlns:a="http://schemas.openxmlformats.org/drawingml/2006/main" noChangeAspect="1"/>
                       </wp:cNvGraphicFramePr>
@@ -27403,7 +28219,7 @@
                               <pic:nvPr/>
                             </pic:nvPicPr>
                             <pic:blipFill rotWithShape="1">
-                              <a:blip r:embed="rId35"/>
+                              <a:blip r:embed="rId46"/>
                               <a:stretch/>
                             </pic:blipFill>
                             <pic:spPr bwMode="auto">
@@ -27442,8 +28258,8 @@
                       <v:path o:extrusionok="f" gradientshapeok="t" o:connecttype="rect"/>
                       <o:lock v:ext="edit" aspectratio="t"/>
                     </v:shapetype>
-                    <v:shape id="_x0000_i34" o:spid="_x0000_s34" type="#_x0000_t75" style="width:252.28pt;height:108.44pt;mso-wrap-distance-left:0.00pt;mso-wrap-distance-top:0.00pt;mso-wrap-distance-right:0.00pt;mso-wrap-distance-bottom:0.00pt;z-index:1;" stroked="false">
-                      <v:imagedata r:id="rId35" o:title=""/>
+                    <v:shape id="_x0000_i45" o:spid="_x0000_s45" type="#_x0000_t75" style="width:252.28pt;height:108.44pt;mso-wrap-distance-left:0.00pt;mso-wrap-distance-top:0.00pt;mso-wrap-distance-right:0.00pt;mso-wrap-distance-bottom:0.00pt;z-index:1;" stroked="false">
+                      <v:imagedata r:id="rId46" o:title=""/>
                       <o:lock v:ext="edit" rotation="t"/>
                     </v:shape>
                   </w:pict>
@@ -27571,7 +28387,7 @@
                     <wp:inline xmlns:wp="http://schemas.openxmlformats.org/drawingml/2006/wordprocessingDrawing" distT="0" distB="0" distL="0" distR="0">
                       <wp:extent cx="3204000" cy="1377202"/>
                       <wp:effectExtent l="0" t="0" r="0" b="0"/>
-                      <wp:docPr id="33" name="Picture 18"/>
+                      <wp:docPr id="44" name="Picture 18"/>
                       <wp:cNvGraphicFramePr>
                         <a:graphicFrameLocks xmlns:a="http://schemas.openxmlformats.org/drawingml/2006/main" noChangeAspect="1"/>
                       </wp:cNvGraphicFramePr>
@@ -27586,7 +28402,7 @@
                               <pic:nvPr/>
                             </pic:nvPicPr>
                             <pic:blipFill rotWithShape="1">
-                              <a:blip r:embed="rId35"/>
+                              <a:blip r:embed="rId46"/>
                               <a:stretch/>
                             </pic:blipFill>
                             <pic:spPr bwMode="auto">
@@ -27625,8 +28441,8 @@
                       <v:path o:extrusionok="f" gradientshapeok="t" o:connecttype="rect"/>
                       <o:lock v:ext="edit" aspectratio="t"/>
                     </v:shapetype>
-                    <v:shape id="_x0000_i35" o:spid="_x0000_s35" type="#_x0000_t75" style="width:252.28pt;height:108.44pt;mso-wrap-distance-left:0.00pt;mso-wrap-distance-top:0.00pt;mso-wrap-distance-right:0.00pt;mso-wrap-distance-bottom:0.00pt;z-index:1;" stroked="false">
-                      <v:imagedata r:id="rId35" o:title=""/>
+                    <v:shape id="_x0000_i46" o:spid="_x0000_s46" type="#_x0000_t75" style="width:252.28pt;height:108.44pt;mso-wrap-distance-left:0.00pt;mso-wrap-distance-top:0.00pt;mso-wrap-distance-right:0.00pt;mso-wrap-distance-bottom:0.00pt;z-index:1;" stroked="false">
+                      <v:imagedata r:id="rId46" o:title=""/>
                       <o:lock v:ext="edit" rotation="t"/>
                     </v:shape>
                   </w:pict>
@@ -28558,7 +29374,7 @@
                     <wp:inline xmlns:wp="http://schemas.openxmlformats.org/drawingml/2006/wordprocessingDrawing" distT="0" distB="0" distL="0" distR="0">
                       <wp:extent cx="3204000" cy="1376484"/>
                       <wp:effectExtent l="0" t="0" r="0" b="0"/>
-                      <wp:docPr id="34" name="Picture 19"/>
+                      <wp:docPr id="45" name="Picture 19"/>
                       <wp:cNvGraphicFramePr>
                         <a:graphicFrameLocks xmlns:a="http://schemas.openxmlformats.org/drawingml/2006/main" noChangeAspect="1"/>
                       </wp:cNvGraphicFramePr>
@@ -28573,7 +29389,7 @@
                               <pic:nvPr/>
                             </pic:nvPicPr>
                             <pic:blipFill rotWithShape="1">
-                              <a:blip r:embed="rId36"/>
+                              <a:blip r:embed="rId47"/>
                               <a:stretch/>
                             </pic:blipFill>
                             <pic:spPr bwMode="auto">
@@ -28612,8 +29428,8 @@
                       <v:path o:extrusionok="f" gradientshapeok="t" o:connecttype="rect"/>
                       <o:lock v:ext="edit" aspectratio="t"/>
                     </v:shapetype>
-                    <v:shape id="_x0000_i36" o:spid="_x0000_s36" type="#_x0000_t75" style="width:252.28pt;height:108.38pt;mso-wrap-distance-left:0.00pt;mso-wrap-distance-top:0.00pt;mso-wrap-distance-right:0.00pt;mso-wrap-distance-bottom:0.00pt;z-index:1;" stroked="false">
-                      <v:imagedata r:id="rId36" o:title=""/>
+                    <v:shape id="_x0000_i47" o:spid="_x0000_s47" type="#_x0000_t75" style="width:252.28pt;height:108.38pt;mso-wrap-distance-left:0.00pt;mso-wrap-distance-top:0.00pt;mso-wrap-distance-right:0.00pt;mso-wrap-distance-bottom:0.00pt;z-index:1;" stroked="false">
+                      <v:imagedata r:id="rId47" o:title=""/>
                       <o:lock v:ext="edit" rotation="t"/>
                     </v:shape>
                   </w:pict>
@@ -28741,7 +29557,7 @@
                     <wp:inline xmlns:wp="http://schemas.openxmlformats.org/drawingml/2006/wordprocessingDrawing" distT="0" distB="0" distL="0" distR="0">
                       <wp:extent cx="3204000" cy="1376484"/>
                       <wp:effectExtent l="0" t="0" r="0" b="0"/>
-                      <wp:docPr id="35" name="Picture 20"/>
+                      <wp:docPr id="46" name="Picture 20"/>
                       <wp:cNvGraphicFramePr>
                         <a:graphicFrameLocks xmlns:a="http://schemas.openxmlformats.org/drawingml/2006/main" noChangeAspect="1"/>
                       </wp:cNvGraphicFramePr>
@@ -28756,7 +29572,7 @@
                               <pic:nvPr/>
                             </pic:nvPicPr>
                             <pic:blipFill rotWithShape="1">
-                              <a:blip r:embed="rId36"/>
+                              <a:blip r:embed="rId47"/>
                               <a:stretch/>
                             </pic:blipFill>
                             <pic:spPr bwMode="auto">
@@ -28795,8 +29611,8 @@
                       <v:path o:extrusionok="f" gradientshapeok="t" o:connecttype="rect"/>
                       <o:lock v:ext="edit" aspectratio="t"/>
                     </v:shapetype>
-                    <v:shape id="_x0000_i37" o:spid="_x0000_s37" type="#_x0000_t75" style="width:252.28pt;height:108.38pt;mso-wrap-distance-left:0.00pt;mso-wrap-distance-top:0.00pt;mso-wrap-distance-right:0.00pt;mso-wrap-distance-bottom:0.00pt;z-index:1;" stroked="false">
-                      <v:imagedata r:id="rId36" o:title=""/>
+                    <v:shape id="_x0000_i48" o:spid="_x0000_s48" type="#_x0000_t75" style="width:252.28pt;height:108.38pt;mso-wrap-distance-left:0.00pt;mso-wrap-distance-top:0.00pt;mso-wrap-distance-right:0.00pt;mso-wrap-distance-bottom:0.00pt;z-index:1;" stroked="false">
+                      <v:imagedata r:id="rId47" o:title=""/>
                       <o:lock v:ext="edit" rotation="t"/>
                     </v:shape>
                   </w:pict>
@@ -28924,7 +29740,7 @@
                     <wp:inline xmlns:wp="http://schemas.openxmlformats.org/drawingml/2006/wordprocessingDrawing" distT="0" distB="0" distL="0" distR="0">
                       <wp:extent cx="3204000" cy="1376484"/>
                       <wp:effectExtent l="0" t="0" r="0" b="0"/>
-                      <wp:docPr id="36" name="Picture 21"/>
+                      <wp:docPr id="47" name="Picture 21"/>
                       <wp:cNvGraphicFramePr>
                         <a:graphicFrameLocks xmlns:a="http://schemas.openxmlformats.org/drawingml/2006/main" noChangeAspect="1"/>
                       </wp:cNvGraphicFramePr>
@@ -28939,7 +29755,7 @@
                               <pic:nvPr/>
                             </pic:nvPicPr>
                             <pic:blipFill rotWithShape="1">
-                              <a:blip r:embed="rId36"/>
+                              <a:blip r:embed="rId47"/>
                               <a:stretch/>
                             </pic:blipFill>
                             <pic:spPr bwMode="auto">
@@ -28978,8 +29794,8 @@
                       <v:path o:extrusionok="f" gradientshapeok="t" o:connecttype="rect"/>
                       <o:lock v:ext="edit" aspectratio="t"/>
                     </v:shapetype>
-                    <v:shape id="_x0000_i38" o:spid="_x0000_s38" type="#_x0000_t75" style="width:252.28pt;height:108.38pt;mso-wrap-distance-left:0.00pt;mso-wrap-distance-top:0.00pt;mso-wrap-distance-right:0.00pt;mso-wrap-distance-bottom:0.00pt;z-index:1;" stroked="false">
-                      <v:imagedata r:id="rId36" o:title=""/>
+                    <v:shape id="_x0000_i49" o:spid="_x0000_s49" type="#_x0000_t75" style="width:252.28pt;height:108.38pt;mso-wrap-distance-left:0.00pt;mso-wrap-distance-top:0.00pt;mso-wrap-distance-right:0.00pt;mso-wrap-distance-bottom:0.00pt;z-index:1;" stroked="false">
+                      <v:imagedata r:id="rId47" o:title=""/>
                       <o:lock v:ext="edit" rotation="t"/>
                     </v:shape>
                   </w:pict>
@@ -29115,7 +29931,7 @@
                     <wp:inline xmlns:wp="http://schemas.openxmlformats.org/drawingml/2006/wordprocessingDrawing" distT="0" distB="0" distL="0" distR="0">
                       <wp:extent cx="3204000" cy="1376484"/>
                       <wp:effectExtent l="0" t="0" r="0" b="0"/>
-                      <wp:docPr id="37" name="Picture 22"/>
+                      <wp:docPr id="48" name="Picture 22"/>
                       <wp:cNvGraphicFramePr>
                         <a:graphicFrameLocks xmlns:a="http://schemas.openxmlformats.org/drawingml/2006/main" noChangeAspect="1"/>
                       </wp:cNvGraphicFramePr>
@@ -29130,7 +29946,7 @@
                               <pic:nvPr/>
                             </pic:nvPicPr>
                             <pic:blipFill rotWithShape="1">
-                              <a:blip r:embed="rId36"/>
+                              <a:blip r:embed="rId47"/>
                               <a:stretch/>
                             </pic:blipFill>
                             <pic:spPr bwMode="auto">
@@ -29169,8 +29985,8 @@
                       <v:path o:extrusionok="f" gradientshapeok="t" o:connecttype="rect"/>
                       <o:lock v:ext="edit" aspectratio="t"/>
                     </v:shapetype>
-                    <v:shape id="_x0000_i39" o:spid="_x0000_s39" type="#_x0000_t75" style="width:252.28pt;height:108.38pt;mso-wrap-distance-left:0.00pt;mso-wrap-distance-top:0.00pt;mso-wrap-distance-right:0.00pt;mso-wrap-distance-bottom:0.00pt;z-index:1;" stroked="false">
-                      <v:imagedata r:id="rId36" o:title=""/>
+                    <v:shape id="_x0000_i50" o:spid="_x0000_s50" type="#_x0000_t75" style="width:252.28pt;height:108.38pt;mso-wrap-distance-left:0.00pt;mso-wrap-distance-top:0.00pt;mso-wrap-distance-right:0.00pt;mso-wrap-distance-bottom:0.00pt;z-index:1;" stroked="false">
+                      <v:imagedata r:id="rId47" o:title=""/>
                       <o:lock v:ext="edit" rotation="t"/>
                     </v:shape>
                   </w:pict>

</xml_diff>

<commit_message>
docs: actualizar evidencias de SOL3, TAR2 y TAR3 con el diseño nuevo
</commit_message>
<xml_diff>
--- a/Pruebas Tecnicas/1. Documento_de_Evidencia_de_Pruebas_Tecnicas_Primer_Sprint.docx
+++ b/Pruebas Tecnicas/1. Documento_de_Evidencia_de_Pruebas_Tecnicas_Primer_Sprint.docx
@@ -18366,83 +18366,38 @@
               </w:rPr>
             </w:pPr>
             <w:r>
-              <mc:AlternateContent>
-                <mc:Choice Requires="wpg">
-                  <w:drawing>
-                    <wp:inline xmlns:wp="http://schemas.openxmlformats.org/drawingml/2006/wordprocessingDrawing" distT="0" distB="0" distL="0" distR="0">
-                      <wp:extent cx="3204000" cy="1376484"/>
-                      <wp:effectExtent l="0" t="0" r="0" b="0"/>
-                      <wp:docPr id="26" name="Picture 6"/>
-                      <wp:cNvGraphicFramePr>
-                        <a:graphicFrameLocks xmlns:a="http://schemas.openxmlformats.org/drawingml/2006/main" noChangeAspect="1"/>
-                      </wp:cNvGraphicFramePr>
-                      <a:graphic xmlns:a="http://schemas.openxmlformats.org/drawingml/2006/main">
-                        <a:graphicData uri="http://schemas.openxmlformats.org/drawingml/2006/picture">
-                          <pic:pic xmlns:pic="http://schemas.openxmlformats.org/drawingml/2006/picture">
-                            <pic:nvPicPr>
-                              <pic:cNvPr id="0" name="sol3_listar.png"/>
-                              <pic:cNvPicPr>
-                                <a:picLocks noChangeAspect="1"/>
-                              </pic:cNvPicPr>
-                              <pic:nvPr/>
-                            </pic:nvPicPr>
-                            <pic:blipFill rotWithShape="1">
-                              <a:blip r:embed="rId36"/>
-                              <a:stretch/>
-                            </pic:blipFill>
-                            <pic:spPr bwMode="auto">
-                              <a:xfrm>
-                                <a:off x="0" y="0"/>
-                                <a:ext cx="3204000" cy="1376484"/>
-                              </a:xfrm>
-                              <a:prstGeom prst="rect">
-                                <a:avLst/>
-                              </a:prstGeom>
-                            </pic:spPr>
-                          </pic:pic>
-                        </a:graphicData>
-                      </a:graphic>
-                    </wp:inline>
-                  </w:drawing>
-                </mc:Choice>
-                <mc:Fallback>
-                  <w:pict>
-                    <v:shapetype id="_x0000_t75" coordsize="21600,21600" o:spt="75" o:preferrelative="t" path="m@4@5l@4@11@9@11@9@5xe" filled="f" stroked="f">
-                      <v:stroke joinstyle="miter"/>
-                      <v:formulas>
-                        <v:f eqn="if lineDrawn pixelLineWidth 0"/>
-                        <v:f eqn="sum @0 1 0"/>
-                        <v:f eqn="sum 0 0 @1"/>
-                        <v:f eqn="prod @2 1 2"/>
-                        <v:f eqn="prod @3 21600 pixelWidth"/>
-                        <v:f eqn="prod @3 21600 pixelHeight"/>
-                        <v:f eqn="sum @0 0 1"/>
-                        <v:f eqn="prod @6 1 2"/>
-                        <v:f eqn="prod @7 21600 pixelWidth"/>
-                        <v:f eqn="sum @8 21600 0"/>
-                        <v:f eqn="prod @7 21600 pixelHeight"/>
-                        <v:f eqn="sum @10 21600 0"/>
-                      </v:formulas>
-                      <v:path o:extrusionok="f" gradientshapeok="t" o:connecttype="rect"/>
-                      <o:lock v:ext="edit" aspectratio="t"/>
-                    </v:shapetype>
-                    <v:shape id="_x0000_i25" o:spid="_x0000_s25" type="#_x0000_t75" style="width:252.28pt;height:108.38pt;mso-wrap-distance-left:0.00pt;mso-wrap-distance-top:0.00pt;mso-wrap-distance-right:0.00pt;mso-wrap-distance-bottom:0.00pt;z-index:1;" stroked="false">
-                      <v:imagedata r:id="rId36" o:title=""/>
-                      <o:lock v:ext="edit" rotation="t"/>
-                    </v:shape>
-                  </w:pict>
-                </mc:Fallback>
-              </mc:AlternateContent>
-            </w:r>
-            <w:r>
-              <w:rPr>
-                <w:lang w:val="es-US"/>
-              </w:rPr>
-            </w:r>
-            <w:r>
-              <w:rPr>
-                <w:lang w:val="es-US"/>
-              </w:rPr>
+              <w:drawing>
+                <wp:inline xmlns:pic="http://schemas.openxmlformats.org/drawingml/2006/picture">
+                  <wp:extent cx="3204000" cy="1685525"/>
+                  <wp:docPr id="2147119127" name="Picture 2147119127"/>
+                  <wp:cNvGraphicFramePr>
+                    <a:graphicFrameLocks noChangeAspect="1"/>
+                  </wp:cNvGraphicFramePr>
+                  <a:graphic>
+                    <a:graphicData uri="http://schemas.openxmlformats.org/drawingml/2006/picture">
+                      <pic:pic>
+                        <pic:nvPicPr>
+                          <pic:cNvPr id="0" name="sol3_listar.png"/>
+                          <pic:cNvPicPr/>
+                        </pic:nvPicPr>
+                        <pic:blipFill>
+                          <a:blip r:embed="rId58"/>
+                          <a:stretch>
+                            <a:fillRect/>
+                          </a:stretch>
+                        </pic:blipFill>
+                        <pic:spPr>
+                          <a:xfrm>
+                            <a:off x="0" y="0"/>
+                            <a:ext cx="3204000" cy="1685525"/>
+                          </a:xfrm>
+                          <a:prstGeom prst="rect"/>
+                        </pic:spPr>
+                      </pic:pic>
+                    </a:graphicData>
+                  </a:graphic>
+                </wp:inline>
+              </w:drawing>
             </w:r>
           </w:p>
         </w:tc>
@@ -18559,162 +18514,75 @@
               </w:rPr>
             </w:pPr>
             <w:r>
-              <mc:AlternateContent>
-                <mc:Choice Requires="wpg">
-                  <w:drawing>
-                    <wp:inline xmlns:wp="http://schemas.openxmlformats.org/drawingml/2006/wordprocessingDrawing" distT="0" distB="0" distL="0" distR="0">
-                      <wp:extent cx="3204000" cy="1376484"/>
-                      <wp:effectExtent l="0" t="0" r="0" b="0"/>
-                      <wp:docPr id="27" name="Picture 7"/>
-                      <wp:cNvGraphicFramePr>
-                        <a:graphicFrameLocks xmlns:a="http://schemas.openxmlformats.org/drawingml/2006/main" noChangeAspect="1"/>
-                      </wp:cNvGraphicFramePr>
-                      <a:graphic xmlns:a="http://schemas.openxmlformats.org/drawingml/2006/main">
-                        <a:graphicData uri="http://schemas.openxmlformats.org/drawingml/2006/picture">
-                          <pic:pic xmlns:pic="http://schemas.openxmlformats.org/drawingml/2006/picture">
-                            <pic:nvPicPr>
-                              <pic:cNvPr id="0" name="sol3_crear_form.png"/>
-                              <pic:cNvPicPr>
-                                <a:picLocks noChangeAspect="1"/>
-                              </pic:cNvPicPr>
-                              <pic:nvPr/>
-                            </pic:nvPicPr>
-                            <pic:blipFill rotWithShape="1">
-                              <a:blip r:embed="rId37"/>
-                              <a:stretch/>
-                            </pic:blipFill>
-                            <pic:spPr bwMode="auto">
-                              <a:xfrm>
-                                <a:off x="0" y="0"/>
-                                <a:ext cx="3204000" cy="1376484"/>
-                              </a:xfrm>
-                              <a:prstGeom prst="rect">
-                                <a:avLst/>
-                              </a:prstGeom>
-                            </pic:spPr>
-                          </pic:pic>
-                        </a:graphicData>
-                      </a:graphic>
-                    </wp:inline>
-                  </w:drawing>
-                </mc:Choice>
-                <mc:Fallback>
-                  <w:pict>
-                    <v:shapetype id="_x0000_t75" coordsize="21600,21600" o:spt="75" o:preferrelative="t" path="m@4@5l@4@11@9@11@9@5xe" filled="f" stroked="f">
-                      <v:stroke joinstyle="miter"/>
-                      <v:formulas>
-                        <v:f eqn="if lineDrawn pixelLineWidth 0"/>
-                        <v:f eqn="sum @0 1 0"/>
-                        <v:f eqn="sum 0 0 @1"/>
-                        <v:f eqn="prod @2 1 2"/>
-                        <v:f eqn="prod @3 21600 pixelWidth"/>
-                        <v:f eqn="prod @3 21600 pixelHeight"/>
-                        <v:f eqn="sum @0 0 1"/>
-                        <v:f eqn="prod @6 1 2"/>
-                        <v:f eqn="prod @7 21600 pixelWidth"/>
-                        <v:f eqn="sum @8 21600 0"/>
-                        <v:f eqn="prod @7 21600 pixelHeight"/>
-                        <v:f eqn="sum @10 21600 0"/>
-                      </v:formulas>
-                      <v:path o:extrusionok="f" gradientshapeok="t" o:connecttype="rect"/>
-                      <o:lock v:ext="edit" aspectratio="t"/>
-                    </v:shapetype>
-                    <v:shape id="_x0000_i26" o:spid="_x0000_s26" type="#_x0000_t75" style="width:252.28pt;height:108.38pt;mso-wrap-distance-left:0.00pt;mso-wrap-distance-top:0.00pt;mso-wrap-distance-right:0.00pt;mso-wrap-distance-bottom:0.00pt;z-index:1;" stroked="false">
-                      <v:imagedata r:id="rId37" o:title=""/>
-                      <o:lock v:ext="edit" rotation="t"/>
-                    </v:shape>
-                  </w:pict>
-                </mc:Fallback>
-              </mc:AlternateContent>
-            </w:r>
-            <w:r>
-              <w:rPr>
-                <w:lang w:val="es-US"/>
-              </w:rPr>
-            </w:r>
-            <w:r>
-              <w:rPr>
-                <w:lang w:val="es-US"/>
-              </w:rPr>
+              <w:drawing>
+                <wp:inline xmlns:pic="http://schemas.openxmlformats.org/drawingml/2006/picture">
+                  <wp:extent cx="3204000" cy="1690536"/>
+                  <wp:docPr id="2147119128" name="Picture 2147119128"/>
+                  <wp:cNvGraphicFramePr>
+                    <a:graphicFrameLocks noChangeAspect="1"/>
+                  </wp:cNvGraphicFramePr>
+                  <a:graphic>
+                    <a:graphicData uri="http://schemas.openxmlformats.org/drawingml/2006/picture">
+                      <pic:pic>
+                        <pic:nvPicPr>
+                          <pic:cNvPr id="0" name="sol3_crear_form.png"/>
+                          <pic:cNvPicPr/>
+                        </pic:nvPicPr>
+                        <pic:blipFill>
+                          <a:blip r:embed="rId59"/>
+                          <a:stretch>
+                            <a:fillRect/>
+                          </a:stretch>
+                        </pic:blipFill>
+                        <pic:spPr>
+                          <a:xfrm>
+                            <a:off x="0" y="0"/>
+                            <a:ext cx="3204000" cy="1690536"/>
+                          </a:xfrm>
+                          <a:prstGeom prst="rect"/>
+                        </pic:spPr>
+                      </pic:pic>
+                    </a:graphicData>
+                  </a:graphic>
+                </wp:inline>
+              </w:drawing>
             </w:r>
           </w:p>
           <w:p>
-            <w:pPr>
-              <w:pBdr/>
-              <w:spacing/>
-              <w:ind/>
-              <w:rPr/>
-            </w:pPr>
-            <w:r>
-              <mc:AlternateContent>
-                <mc:Choice Requires="wpg">
-                  <w:drawing>
-                    <wp:inline xmlns:wp="http://schemas.openxmlformats.org/drawingml/2006/wordprocessingDrawing" distT="0" distB="0" distL="0" distR="0">
-                      <wp:extent cx="3204000" cy="1376484"/>
-                      <wp:effectExtent l="0" t="0" r="0" b="0"/>
-                      <wp:docPr id="28" name="Picture 8"/>
-                      <wp:cNvGraphicFramePr>
-                        <a:graphicFrameLocks xmlns:a="http://schemas.openxmlformats.org/drawingml/2006/main" noChangeAspect="1"/>
-                      </wp:cNvGraphicFramePr>
-                      <a:graphic xmlns:a="http://schemas.openxmlformats.org/drawingml/2006/main">
-                        <a:graphicData uri="http://schemas.openxmlformats.org/drawingml/2006/picture">
-                          <pic:pic xmlns:pic="http://schemas.openxmlformats.org/drawingml/2006/picture">
-                            <pic:nvPicPr>
-                              <pic:cNvPr id="0" name="sol3_crear.png"/>
-                              <pic:cNvPicPr>
-                                <a:picLocks noChangeAspect="1"/>
-                              </pic:cNvPicPr>
-                              <pic:nvPr/>
-                            </pic:nvPicPr>
-                            <pic:blipFill rotWithShape="1">
-                              <a:blip r:embed="rId38"/>
-                              <a:stretch/>
-                            </pic:blipFill>
-                            <pic:spPr bwMode="auto">
-                              <a:xfrm>
-                                <a:off x="0" y="0"/>
-                                <a:ext cx="3204000" cy="1376484"/>
-                              </a:xfrm>
-                              <a:prstGeom prst="rect">
-                                <a:avLst/>
-                              </a:prstGeom>
-                            </pic:spPr>
-                          </pic:pic>
-                        </a:graphicData>
-                      </a:graphic>
-                    </wp:inline>
-                  </w:drawing>
-                </mc:Choice>
-                <mc:Fallback>
-                  <w:pict>
-                    <v:shapetype id="_x0000_t75" coordsize="21600,21600" o:spt="75" o:preferrelative="t" path="m@4@5l@4@11@9@11@9@5xe" filled="f" stroked="f">
-                      <v:stroke joinstyle="miter"/>
-                      <v:formulas>
-                        <v:f eqn="if lineDrawn pixelLineWidth 0"/>
-                        <v:f eqn="sum @0 1 0"/>
-                        <v:f eqn="sum 0 0 @1"/>
-                        <v:f eqn="prod @2 1 2"/>
-                        <v:f eqn="prod @3 21600 pixelWidth"/>
-                        <v:f eqn="prod @3 21600 pixelHeight"/>
-                        <v:f eqn="sum @0 0 1"/>
-                        <v:f eqn="prod @6 1 2"/>
-                        <v:f eqn="prod @7 21600 pixelWidth"/>
-                        <v:f eqn="sum @8 21600 0"/>
-                        <v:f eqn="prod @7 21600 pixelHeight"/>
-                        <v:f eqn="sum @10 21600 0"/>
-                      </v:formulas>
-                      <v:path o:extrusionok="f" gradientshapeok="t" o:connecttype="rect"/>
-                      <o:lock v:ext="edit" aspectratio="t"/>
-                    </v:shapetype>
-                    <v:shape id="_x0000_i27" o:spid="_x0000_s27" type="#_x0000_t75" style="width:252.28pt;height:108.38pt;mso-wrap-distance-left:0.00pt;mso-wrap-distance-top:0.00pt;mso-wrap-distance-right:0.00pt;mso-wrap-distance-bottom:0.00pt;z-index:1;" stroked="false">
-                      <v:imagedata r:id="rId38" o:title=""/>
-                      <o:lock v:ext="edit" rotation="t"/>
-                    </v:shape>
-                  </w:pict>
-                </mc:Fallback>
-              </mc:AlternateContent>
-            </w:r>
-            <w:r/>
+            <w:r>
+              <w:drawing>
+                <wp:inline xmlns:pic="http://schemas.openxmlformats.org/drawingml/2006/picture">
+                  <wp:extent cx="3204000" cy="1685525"/>
+                  <wp:docPr id="2147119129" name="Picture 2147119129"/>
+                  <wp:cNvGraphicFramePr>
+                    <a:graphicFrameLocks noChangeAspect="1"/>
+                  </wp:cNvGraphicFramePr>
+                  <a:graphic>
+                    <a:graphicData uri="http://schemas.openxmlformats.org/drawingml/2006/picture">
+                      <pic:pic>
+                        <pic:nvPicPr>
+                          <pic:cNvPr id="0" name="sol3_listar.png"/>
+                          <pic:cNvPicPr/>
+                        </pic:nvPicPr>
+                        <pic:blipFill>
+                          <a:blip r:embed="rId58"/>
+                          <a:stretch>
+                            <a:fillRect/>
+                          </a:stretch>
+                        </pic:blipFill>
+                        <pic:spPr>
+                          <a:xfrm>
+                            <a:off x="0" y="0"/>
+                            <a:ext cx="3204000" cy="1685525"/>
+                          </a:xfrm>
+                          <a:prstGeom prst="rect"/>
+                        </pic:spPr>
+                      </pic:pic>
+                    </a:graphicData>
+                  </a:graphic>
+                </wp:inline>
+              </w:drawing>
+            </w:r>
           </w:p>
         </w:tc>
       </w:tr>
@@ -18838,83 +18706,74 @@
               </w:rPr>
             </w:pPr>
             <w:r>
-              <mc:AlternateContent>
-                <mc:Choice Requires="wpg">
-                  <w:drawing>
-                    <wp:inline xmlns:wp="http://schemas.openxmlformats.org/drawingml/2006/wordprocessingDrawing" distT="0" distB="0" distL="0" distR="0">
-                      <wp:extent cx="3204000" cy="1376484"/>
-                      <wp:effectExtent l="0" t="0" r="0" b="0"/>
-                      <wp:docPr id="29" name="Picture 9"/>
-                      <wp:cNvGraphicFramePr>
-                        <a:graphicFrameLocks xmlns:a="http://schemas.openxmlformats.org/drawingml/2006/main" noChangeAspect="1"/>
-                      </wp:cNvGraphicFramePr>
-                      <a:graphic xmlns:a="http://schemas.openxmlformats.org/drawingml/2006/main">
-                        <a:graphicData uri="http://schemas.openxmlformats.org/drawingml/2006/picture">
-                          <pic:pic xmlns:pic="http://schemas.openxmlformats.org/drawingml/2006/picture">
-                            <pic:nvPicPr>
-                              <pic:cNvPr id="0" name="sol3_editar_ok.png"/>
-                              <pic:cNvPicPr>
-                                <a:picLocks noChangeAspect="1"/>
-                              </pic:cNvPicPr>
-                              <pic:nvPr/>
-                            </pic:nvPicPr>
-                            <pic:blipFill rotWithShape="1">
-                              <a:blip r:embed="rId39"/>
-                              <a:stretch/>
-                            </pic:blipFill>
-                            <pic:spPr bwMode="auto">
-                              <a:xfrm>
-                                <a:off x="0" y="0"/>
-                                <a:ext cx="3204000" cy="1376484"/>
-                              </a:xfrm>
-                              <a:prstGeom prst="rect">
-                                <a:avLst/>
-                              </a:prstGeom>
-                            </pic:spPr>
-                          </pic:pic>
-                        </a:graphicData>
-                      </a:graphic>
-                    </wp:inline>
-                  </w:drawing>
-                </mc:Choice>
-                <mc:Fallback>
-                  <w:pict>
-                    <v:shapetype id="_x0000_t75" coordsize="21600,21600" o:spt="75" o:preferrelative="t" path="m@4@5l@4@11@9@11@9@5xe" filled="f" stroked="f">
-                      <v:stroke joinstyle="miter"/>
-                      <v:formulas>
-                        <v:f eqn="if lineDrawn pixelLineWidth 0"/>
-                        <v:f eqn="sum @0 1 0"/>
-                        <v:f eqn="sum 0 0 @1"/>
-                        <v:f eqn="prod @2 1 2"/>
-                        <v:f eqn="prod @3 21600 pixelWidth"/>
-                        <v:f eqn="prod @3 21600 pixelHeight"/>
-                        <v:f eqn="sum @0 0 1"/>
-                        <v:f eqn="prod @6 1 2"/>
-                        <v:f eqn="prod @7 21600 pixelWidth"/>
-                        <v:f eqn="sum @8 21600 0"/>
-                        <v:f eqn="prod @7 21600 pixelHeight"/>
-                        <v:f eqn="sum @10 21600 0"/>
-                      </v:formulas>
-                      <v:path o:extrusionok="f" gradientshapeok="t" o:connecttype="rect"/>
-                      <o:lock v:ext="edit" aspectratio="t"/>
-                    </v:shapetype>
-                    <v:shape id="_x0000_i28" o:spid="_x0000_s28" type="#_x0000_t75" style="width:252.28pt;height:108.38pt;mso-wrap-distance-left:0.00pt;mso-wrap-distance-top:0.00pt;mso-wrap-distance-right:0.00pt;mso-wrap-distance-bottom:0.00pt;z-index:1;" stroked="false">
-                      <v:imagedata r:id="rId39" o:title=""/>
-                      <o:lock v:ext="edit" rotation="t"/>
-                    </v:shape>
-                  </w:pict>
-                </mc:Fallback>
-              </mc:AlternateContent>
-            </w:r>
-            <w:r>
-              <w:rPr>
-                <w:lang w:val="es-US"/>
-              </w:rPr>
-            </w:r>
-            <w:r>
-              <w:rPr>
-                <w:lang w:val="es-US"/>
-              </w:rPr>
+              <w:drawing>
+                <wp:inline xmlns:pic="http://schemas.openxmlformats.org/drawingml/2006/picture">
+                  <wp:extent cx="3204000" cy="1036701"/>
+                  <wp:docPr id="2147119130" name="Picture 2147119130"/>
+                  <wp:cNvGraphicFramePr>
+                    <a:graphicFrameLocks noChangeAspect="1"/>
+                  </wp:cNvGraphicFramePr>
+                  <a:graphic>
+                    <a:graphicData uri="http://schemas.openxmlformats.org/drawingml/2006/picture">
+                      <pic:pic>
+                        <pic:nvPicPr>
+                          <pic:cNvPr id="0" name="sol3_editar_form.png"/>
+                          <pic:cNvPicPr/>
+                        </pic:nvPicPr>
+                        <pic:blipFill>
+                          <a:blip r:embed="rId60"/>
+                          <a:stretch>
+                            <a:fillRect/>
+                          </a:stretch>
+                        </pic:blipFill>
+                        <pic:spPr>
+                          <a:xfrm>
+                            <a:off x="0" y="0"/>
+                            <a:ext cx="3204000" cy="1036701"/>
+                          </a:xfrm>
+                          <a:prstGeom prst="rect"/>
+                        </pic:spPr>
+                      </pic:pic>
+                    </a:graphicData>
+                  </a:graphic>
+                </wp:inline>
+              </w:drawing>
+            </w:r>
+          </w:p>
+          <w:p>
+            <w:r>
+              <w:drawing>
+                <wp:inline xmlns:pic="http://schemas.openxmlformats.org/drawingml/2006/picture">
+                  <wp:extent cx="3204000" cy="579427"/>
+                  <wp:docPr id="2147119131" name="Picture 2147119131"/>
+                  <wp:cNvGraphicFramePr>
+                    <a:graphicFrameLocks noChangeAspect="1"/>
+                  </wp:cNvGraphicFramePr>
+                  <a:graphic>
+                    <a:graphicData uri="http://schemas.openxmlformats.org/drawingml/2006/picture">
+                      <pic:pic>
+                        <pic:nvPicPr>
+                          <pic:cNvPr id="0" name="sol3_editar_ok.png"/>
+                          <pic:cNvPicPr/>
+                        </pic:nvPicPr>
+                        <pic:blipFill>
+                          <a:blip r:embed="rId61"/>
+                          <a:stretch>
+                            <a:fillRect/>
+                          </a:stretch>
+                        </pic:blipFill>
+                        <pic:spPr>
+                          <a:xfrm>
+                            <a:off x="0" y="0"/>
+                            <a:ext cx="3204000" cy="579427"/>
+                          </a:xfrm>
+                          <a:prstGeom prst="rect"/>
+                        </pic:spPr>
+                      </pic:pic>
+                    </a:graphicData>
+                  </a:graphic>
+                </wp:inline>
+              </w:drawing>
             </w:r>
           </w:p>
         </w:tc>
@@ -19039,162 +18898,75 @@
               </w:rPr>
             </w:pPr>
             <w:r>
-              <mc:AlternateContent>
-                <mc:Choice Requires="wpg">
-                  <w:drawing>
-                    <wp:inline xmlns:wp="http://schemas.openxmlformats.org/drawingml/2006/wordprocessingDrawing" distT="0" distB="0" distL="0" distR="0">
-                      <wp:extent cx="3204000" cy="1376484"/>
-                      <wp:effectExtent l="0" t="0" r="0" b="0"/>
-                      <wp:docPr id="30" name="Picture 10"/>
-                      <wp:cNvGraphicFramePr>
-                        <a:graphicFrameLocks xmlns:a="http://schemas.openxmlformats.org/drawingml/2006/main" noChangeAspect="1"/>
-                      </wp:cNvGraphicFramePr>
-                      <a:graphic xmlns:a="http://schemas.openxmlformats.org/drawingml/2006/main">
-                        <a:graphicData uri="http://schemas.openxmlformats.org/drawingml/2006/picture">
-                          <pic:pic xmlns:pic="http://schemas.openxmlformats.org/drawingml/2006/picture">
-                            <pic:nvPicPr>
-                              <pic:cNvPr id="0" name="sol3_eliminar_dialogo.png"/>
-                              <pic:cNvPicPr>
-                                <a:picLocks noChangeAspect="1"/>
-                              </pic:cNvPicPr>
-                              <pic:nvPr/>
-                            </pic:nvPicPr>
-                            <pic:blipFill rotWithShape="1">
-                              <a:blip r:embed="rId40"/>
-                              <a:stretch/>
-                            </pic:blipFill>
-                            <pic:spPr bwMode="auto">
-                              <a:xfrm>
-                                <a:off x="0" y="0"/>
-                                <a:ext cx="3204000" cy="1376484"/>
-                              </a:xfrm>
-                              <a:prstGeom prst="rect">
-                                <a:avLst/>
-                              </a:prstGeom>
-                            </pic:spPr>
-                          </pic:pic>
-                        </a:graphicData>
-                      </a:graphic>
-                    </wp:inline>
-                  </w:drawing>
-                </mc:Choice>
-                <mc:Fallback>
-                  <w:pict>
-                    <v:shapetype id="_x0000_t75" coordsize="21600,21600" o:spt="75" o:preferrelative="t" path="m@4@5l@4@11@9@11@9@5xe" filled="f" stroked="f">
-                      <v:stroke joinstyle="miter"/>
-                      <v:formulas>
-                        <v:f eqn="if lineDrawn pixelLineWidth 0"/>
-                        <v:f eqn="sum @0 1 0"/>
-                        <v:f eqn="sum 0 0 @1"/>
-                        <v:f eqn="prod @2 1 2"/>
-                        <v:f eqn="prod @3 21600 pixelWidth"/>
-                        <v:f eqn="prod @3 21600 pixelHeight"/>
-                        <v:f eqn="sum @0 0 1"/>
-                        <v:f eqn="prod @6 1 2"/>
-                        <v:f eqn="prod @7 21600 pixelWidth"/>
-                        <v:f eqn="sum @8 21600 0"/>
-                        <v:f eqn="prod @7 21600 pixelHeight"/>
-                        <v:f eqn="sum @10 21600 0"/>
-                      </v:formulas>
-                      <v:path o:extrusionok="f" gradientshapeok="t" o:connecttype="rect"/>
-                      <o:lock v:ext="edit" aspectratio="t"/>
-                    </v:shapetype>
-                    <v:shape id="_x0000_i29" o:spid="_x0000_s29" type="#_x0000_t75" style="width:252.28pt;height:108.38pt;mso-wrap-distance-left:0.00pt;mso-wrap-distance-top:0.00pt;mso-wrap-distance-right:0.00pt;mso-wrap-distance-bottom:0.00pt;z-index:1;" stroked="false">
-                      <v:imagedata r:id="rId40" o:title=""/>
-                      <o:lock v:ext="edit" rotation="t"/>
-                    </v:shape>
-                  </w:pict>
-                </mc:Fallback>
-              </mc:AlternateContent>
-            </w:r>
-            <w:r>
-              <w:rPr>
-                <w:lang w:val="es-US"/>
-              </w:rPr>
-            </w:r>
-            <w:r>
-              <w:rPr>
-                <w:lang w:val="es-US"/>
-              </w:rPr>
+              <w:drawing>
+                <wp:inline xmlns:pic="http://schemas.openxmlformats.org/drawingml/2006/picture">
+                  <wp:extent cx="3204000" cy="1259460"/>
+                  <wp:docPr id="2147119132" name="Picture 2147119132"/>
+                  <wp:cNvGraphicFramePr>
+                    <a:graphicFrameLocks noChangeAspect="1"/>
+                  </wp:cNvGraphicFramePr>
+                  <a:graphic>
+                    <a:graphicData uri="http://schemas.openxmlformats.org/drawingml/2006/picture">
+                      <pic:pic>
+                        <pic:nvPicPr>
+                          <pic:cNvPr id="0" name="sol3_eliminar_dialogo.png"/>
+                          <pic:cNvPicPr/>
+                        </pic:nvPicPr>
+                        <pic:blipFill>
+                          <a:blip r:embed="rId62"/>
+                          <a:stretch>
+                            <a:fillRect/>
+                          </a:stretch>
+                        </pic:blipFill>
+                        <pic:spPr>
+                          <a:xfrm>
+                            <a:off x="0" y="0"/>
+                            <a:ext cx="3204000" cy="1259460"/>
+                          </a:xfrm>
+                          <a:prstGeom prst="rect"/>
+                        </pic:spPr>
+                      </pic:pic>
+                    </a:graphicData>
+                  </a:graphic>
+                </wp:inline>
+              </w:drawing>
             </w:r>
           </w:p>
           <w:p>
-            <w:pPr>
-              <w:pBdr/>
-              <w:spacing/>
-              <w:ind/>
-              <w:rPr/>
-            </w:pPr>
-            <w:r>
-              <mc:AlternateContent>
-                <mc:Choice Requires="wpg">
-                  <w:drawing>
-                    <wp:inline xmlns:wp="http://schemas.openxmlformats.org/drawingml/2006/wordprocessingDrawing" distT="0" distB="0" distL="0" distR="0">
-                      <wp:extent cx="3204000" cy="1377202"/>
-                      <wp:effectExtent l="0" t="0" r="0" b="0"/>
-                      <wp:docPr id="31" name="Picture 11"/>
-                      <wp:cNvGraphicFramePr>
-                        <a:graphicFrameLocks xmlns:a="http://schemas.openxmlformats.org/drawingml/2006/main" noChangeAspect="1"/>
-                      </wp:cNvGraphicFramePr>
-                      <a:graphic xmlns:a="http://schemas.openxmlformats.org/drawingml/2006/main">
-                        <a:graphicData uri="http://schemas.openxmlformats.org/drawingml/2006/picture">
-                          <pic:pic xmlns:pic="http://schemas.openxmlformats.org/drawingml/2006/picture">
-                            <pic:nvPicPr>
-                              <pic:cNvPr id="0" name="sol3_eliminar_ok.png"/>
-                              <pic:cNvPicPr>
-                                <a:picLocks noChangeAspect="1"/>
-                              </pic:cNvPicPr>
-                              <pic:nvPr/>
-                            </pic:nvPicPr>
-                            <pic:blipFill rotWithShape="1">
-                              <a:blip r:embed="rId41"/>
-                              <a:stretch/>
-                            </pic:blipFill>
-                            <pic:spPr bwMode="auto">
-                              <a:xfrm>
-                                <a:off x="0" y="0"/>
-                                <a:ext cx="3204000" cy="1377202"/>
-                              </a:xfrm>
-                              <a:prstGeom prst="rect">
-                                <a:avLst/>
-                              </a:prstGeom>
-                            </pic:spPr>
-                          </pic:pic>
-                        </a:graphicData>
-                      </a:graphic>
-                    </wp:inline>
-                  </w:drawing>
-                </mc:Choice>
-                <mc:Fallback>
-                  <w:pict>
-                    <v:shapetype id="_x0000_t75" coordsize="21600,21600" o:spt="75" o:preferrelative="t" path="m@4@5l@4@11@9@11@9@5xe" filled="f" stroked="f">
-                      <v:stroke joinstyle="miter"/>
-                      <v:formulas>
-                        <v:f eqn="if lineDrawn pixelLineWidth 0"/>
-                        <v:f eqn="sum @0 1 0"/>
-                        <v:f eqn="sum 0 0 @1"/>
-                        <v:f eqn="prod @2 1 2"/>
-                        <v:f eqn="prod @3 21600 pixelWidth"/>
-                        <v:f eqn="prod @3 21600 pixelHeight"/>
-                        <v:f eqn="sum @0 0 1"/>
-                        <v:f eqn="prod @6 1 2"/>
-                        <v:f eqn="prod @7 21600 pixelWidth"/>
-                        <v:f eqn="sum @8 21600 0"/>
-                        <v:f eqn="prod @7 21600 pixelHeight"/>
-                        <v:f eqn="sum @10 21600 0"/>
-                      </v:formulas>
-                      <v:path o:extrusionok="f" gradientshapeok="t" o:connecttype="rect"/>
-                      <o:lock v:ext="edit" aspectratio="t"/>
-                    </v:shapetype>
-                    <v:shape id="_x0000_i30" o:spid="_x0000_s30" type="#_x0000_t75" style="width:252.28pt;height:108.44pt;mso-wrap-distance-left:0.00pt;mso-wrap-distance-top:0.00pt;mso-wrap-distance-right:0.00pt;mso-wrap-distance-bottom:0.00pt;z-index:1;" stroked="false">
-                      <v:imagedata r:id="rId41" o:title=""/>
-                      <o:lock v:ext="edit" rotation="t"/>
-                    </v:shape>
-                  </w:pict>
-                </mc:Fallback>
-              </mc:AlternateContent>
-            </w:r>
-            <w:r/>
+            <w:r>
+              <w:drawing>
+                <wp:inline xmlns:pic="http://schemas.openxmlformats.org/drawingml/2006/picture">
+                  <wp:extent cx="3204000" cy="774453"/>
+                  <wp:docPr id="2147119133" name="Picture 2147119133"/>
+                  <wp:cNvGraphicFramePr>
+                    <a:graphicFrameLocks noChangeAspect="1"/>
+                  </wp:cNvGraphicFramePr>
+                  <a:graphic>
+                    <a:graphicData uri="http://schemas.openxmlformats.org/drawingml/2006/picture">
+                      <pic:pic>
+                        <pic:nvPicPr>
+                          <pic:cNvPr id="0" name="sol3_eliminar_ok.png"/>
+                          <pic:cNvPicPr/>
+                        </pic:nvPicPr>
+                        <pic:blipFill>
+                          <a:blip r:embed="rId63"/>
+                          <a:stretch>
+                            <a:fillRect/>
+                          </a:stretch>
+                        </pic:blipFill>
+                        <pic:spPr>
+                          <a:xfrm>
+                            <a:off x="0" y="0"/>
+                            <a:ext cx="3204000" cy="774453"/>
+                          </a:xfrm>
+                          <a:prstGeom prst="rect"/>
+                        </pic:spPr>
+                      </pic:pic>
+                    </a:graphicData>
+                  </a:graphic>
+                </wp:inline>
+              </w:drawing>
+            </w:r>
           </w:p>
         </w:tc>
       </w:tr>
@@ -19310,83 +19082,38 @@
               </w:rPr>
             </w:pPr>
             <w:r>
-              <mc:AlternateContent>
-                <mc:Choice Requires="wpg">
-                  <w:drawing>
-                    <wp:inline xmlns:wp="http://schemas.openxmlformats.org/drawingml/2006/wordprocessingDrawing" distT="0" distB="0" distL="0" distR="0">
-                      <wp:extent cx="3204000" cy="1376484"/>
-                      <wp:effectExtent l="0" t="0" r="0" b="0"/>
-                      <wp:docPr id="32" name="Picture 12"/>
-                      <wp:cNvGraphicFramePr>
-                        <a:graphicFrameLocks xmlns:a="http://schemas.openxmlformats.org/drawingml/2006/main" noChangeAspect="1"/>
-                      </wp:cNvGraphicFramePr>
-                      <a:graphic xmlns:a="http://schemas.openxmlformats.org/drawingml/2006/main">
-                        <a:graphicData uri="http://schemas.openxmlformats.org/drawingml/2006/picture">
-                          <pic:pic xmlns:pic="http://schemas.openxmlformats.org/drawingml/2006/picture">
-                            <pic:nvPicPr>
-                              <pic:cNvPr id="0" name="sol3_crear_form.png"/>
-                              <pic:cNvPicPr>
-                                <a:picLocks noChangeAspect="1"/>
-                              </pic:cNvPicPr>
-                              <pic:nvPr/>
-                            </pic:nvPicPr>
-                            <pic:blipFill rotWithShape="1">
-                              <a:blip r:embed="rId37"/>
-                              <a:stretch/>
-                            </pic:blipFill>
-                            <pic:spPr bwMode="auto">
-                              <a:xfrm>
-                                <a:off x="0" y="0"/>
-                                <a:ext cx="3204000" cy="1376484"/>
-                              </a:xfrm>
-                              <a:prstGeom prst="rect">
-                                <a:avLst/>
-                              </a:prstGeom>
-                            </pic:spPr>
-                          </pic:pic>
-                        </a:graphicData>
-                      </a:graphic>
-                    </wp:inline>
-                  </w:drawing>
-                </mc:Choice>
-                <mc:Fallback>
-                  <w:pict>
-                    <v:shapetype id="_x0000_t75" coordsize="21600,21600" o:spt="75" o:preferrelative="t" path="m@4@5l@4@11@9@11@9@5xe" filled="f" stroked="f">
-                      <v:stroke joinstyle="miter"/>
-                      <v:formulas>
-                        <v:f eqn="if lineDrawn pixelLineWidth 0"/>
-                        <v:f eqn="sum @0 1 0"/>
-                        <v:f eqn="sum 0 0 @1"/>
-                        <v:f eqn="prod @2 1 2"/>
-                        <v:f eqn="prod @3 21600 pixelWidth"/>
-                        <v:f eqn="prod @3 21600 pixelHeight"/>
-                        <v:f eqn="sum @0 0 1"/>
-                        <v:f eqn="prod @6 1 2"/>
-                        <v:f eqn="prod @7 21600 pixelWidth"/>
-                        <v:f eqn="sum @8 21600 0"/>
-                        <v:f eqn="prod @7 21600 pixelHeight"/>
-                        <v:f eqn="sum @10 21600 0"/>
-                      </v:formulas>
-                      <v:path o:extrusionok="f" gradientshapeok="t" o:connecttype="rect"/>
-                      <o:lock v:ext="edit" aspectratio="t"/>
-                    </v:shapetype>
-                    <v:shape id="_x0000_i31" o:spid="_x0000_s31" type="#_x0000_t75" style="width:252.28pt;height:108.38pt;mso-wrap-distance-left:0.00pt;mso-wrap-distance-top:0.00pt;mso-wrap-distance-right:0.00pt;mso-wrap-distance-bottom:0.00pt;z-index:1;" stroked="false">
-                      <v:imagedata r:id="rId37" o:title=""/>
-                      <o:lock v:ext="edit" rotation="t"/>
-                    </v:shape>
-                  </w:pict>
-                </mc:Fallback>
-              </mc:AlternateContent>
-            </w:r>
-            <w:r>
-              <w:rPr>
-                <w:lang w:val="es-US"/>
-              </w:rPr>
-            </w:r>
-            <w:r>
-              <w:rPr>
-                <w:lang w:val="es-US"/>
-              </w:rPr>
+              <w:drawing>
+                <wp:inline xmlns:pic="http://schemas.openxmlformats.org/drawingml/2006/picture">
+                  <wp:extent cx="3204000" cy="1690536"/>
+                  <wp:docPr id="2147119134" name="Picture 2147119134"/>
+                  <wp:cNvGraphicFramePr>
+                    <a:graphicFrameLocks noChangeAspect="1"/>
+                  </wp:cNvGraphicFramePr>
+                  <a:graphic>
+                    <a:graphicData uri="http://schemas.openxmlformats.org/drawingml/2006/picture">
+                      <pic:pic>
+                        <pic:nvPicPr>
+                          <pic:cNvPr id="0" name="sol3_crear_form.png"/>
+                          <pic:cNvPicPr/>
+                        </pic:nvPicPr>
+                        <pic:blipFill>
+                          <a:blip r:embed="rId59"/>
+                          <a:stretch>
+                            <a:fillRect/>
+                          </a:stretch>
+                        </pic:blipFill>
+                        <pic:spPr>
+                          <a:xfrm>
+                            <a:off x="0" y="0"/>
+                            <a:ext cx="3204000" cy="1690536"/>
+                          </a:xfrm>
+                          <a:prstGeom prst="rect"/>
+                        </pic:spPr>
+                      </pic:pic>
+                    </a:graphicData>
+                  </a:graphic>
+                </wp:inline>
+              </w:drawing>
             </w:r>
           </w:p>
         </w:tc>
@@ -19503,83 +19230,38 @@
               </w:rPr>
             </w:pPr>
             <w:r>
-              <mc:AlternateContent>
-                <mc:Choice Requires="wpg">
-                  <w:drawing>
-                    <wp:inline xmlns:wp="http://schemas.openxmlformats.org/drawingml/2006/wordprocessingDrawing" distT="0" distB="0" distL="0" distR="0">
-                      <wp:extent cx="3204000" cy="2747238"/>
-                      <wp:effectExtent l="0" t="0" r="0" b="0"/>
-                      <wp:docPr id="33" name="Picture 13"/>
-                      <wp:cNvGraphicFramePr>
-                        <a:graphicFrameLocks xmlns:a="http://schemas.openxmlformats.org/drawingml/2006/main" noChangeAspect="1"/>
-                      </wp:cNvGraphicFramePr>
-                      <a:graphic xmlns:a="http://schemas.openxmlformats.org/drawingml/2006/main">
-                        <a:graphicData uri="http://schemas.openxmlformats.org/drawingml/2006/picture">
-                          <pic:pic xmlns:pic="http://schemas.openxmlformats.org/drawingml/2006/picture">
-                            <pic:nvPicPr>
-                              <pic:cNvPr id="0" name="sol3_paginacion.png"/>
-                              <pic:cNvPicPr>
-                                <a:picLocks noChangeAspect="1"/>
-                              </pic:cNvPicPr>
-                              <pic:nvPr/>
-                            </pic:nvPicPr>
-                            <pic:blipFill rotWithShape="1">
-                              <a:blip r:embed="rId42"/>
-                              <a:stretch/>
-                            </pic:blipFill>
-                            <pic:spPr bwMode="auto">
-                              <a:xfrm>
-                                <a:off x="0" y="0"/>
-                                <a:ext cx="3204000" cy="2747238"/>
-                              </a:xfrm>
-                              <a:prstGeom prst="rect">
-                                <a:avLst/>
-                              </a:prstGeom>
-                            </pic:spPr>
-                          </pic:pic>
-                        </a:graphicData>
-                      </a:graphic>
-                    </wp:inline>
-                  </w:drawing>
-                </mc:Choice>
-                <mc:Fallback>
-                  <w:pict>
-                    <v:shapetype id="_x0000_t75" coordsize="21600,21600" o:spt="75" o:preferrelative="t" path="m@4@5l@4@11@9@11@9@5xe" filled="f" stroked="f">
-                      <v:stroke joinstyle="miter"/>
-                      <v:formulas>
-                        <v:f eqn="if lineDrawn pixelLineWidth 0"/>
-                        <v:f eqn="sum @0 1 0"/>
-                        <v:f eqn="sum 0 0 @1"/>
-                        <v:f eqn="prod @2 1 2"/>
-                        <v:f eqn="prod @3 21600 pixelWidth"/>
-                        <v:f eqn="prod @3 21600 pixelHeight"/>
-                        <v:f eqn="sum @0 0 1"/>
-                        <v:f eqn="prod @6 1 2"/>
-                        <v:f eqn="prod @7 21600 pixelWidth"/>
-                        <v:f eqn="sum @8 21600 0"/>
-                        <v:f eqn="prod @7 21600 pixelHeight"/>
-                        <v:f eqn="sum @10 21600 0"/>
-                      </v:formulas>
-                      <v:path o:extrusionok="f" gradientshapeok="t" o:connecttype="rect"/>
-                      <o:lock v:ext="edit" aspectratio="t"/>
-                    </v:shapetype>
-                    <v:shape id="_x0000_i32" o:spid="_x0000_s32" type="#_x0000_t75" style="width:252.28pt;height:216.32pt;mso-wrap-distance-left:0.00pt;mso-wrap-distance-top:0.00pt;mso-wrap-distance-right:0.00pt;mso-wrap-distance-bottom:0.00pt;z-index:1;" stroked="false">
-                      <v:imagedata r:id="rId42" o:title=""/>
-                      <o:lock v:ext="edit" rotation="t"/>
-                    </v:shape>
-                  </w:pict>
-                </mc:Fallback>
-              </mc:AlternateContent>
-            </w:r>
-            <w:r>
-              <w:rPr>
-                <w:lang w:val="es-US"/>
-              </w:rPr>
-            </w:r>
-            <w:r>
-              <w:rPr>
-                <w:lang w:val="es-US"/>
-              </w:rPr>
+              <w:drawing>
+                <wp:inline xmlns:pic="http://schemas.openxmlformats.org/drawingml/2006/picture">
+                  <wp:extent cx="3204000" cy="1680513"/>
+                  <wp:docPr id="2147119135" name="Picture 2147119135"/>
+                  <wp:cNvGraphicFramePr>
+                    <a:graphicFrameLocks noChangeAspect="1"/>
+                  </wp:cNvGraphicFramePr>
+                  <a:graphic>
+                    <a:graphicData uri="http://schemas.openxmlformats.org/drawingml/2006/picture">
+                      <pic:pic>
+                        <pic:nvPicPr>
+                          <pic:cNvPr id="0" name="sol3_paginacion_2.png"/>
+                          <pic:cNvPicPr/>
+                        </pic:nvPicPr>
+                        <pic:blipFill>
+                          <a:blip r:embed="rId64"/>
+                          <a:stretch>
+                            <a:fillRect/>
+                          </a:stretch>
+                        </pic:blipFill>
+                        <pic:spPr>
+                          <a:xfrm>
+                            <a:off x="0" y="0"/>
+                            <a:ext cx="3204000" cy="1680513"/>
+                          </a:xfrm>
+                          <a:prstGeom prst="rect"/>
+                        </pic:spPr>
+                      </pic:pic>
+                    </a:graphicData>
+                  </a:graphic>
+                </wp:inline>
+              </w:drawing>
             </w:r>
           </w:p>
         </w:tc>
@@ -19696,83 +19378,38 @@
               </w:rPr>
             </w:pPr>
             <w:r>
-              <mc:AlternateContent>
-                <mc:Choice Requires="wpg">
-                  <w:drawing>
-                    <wp:inline xmlns:wp="http://schemas.openxmlformats.org/drawingml/2006/wordprocessingDrawing" distT="0" distB="0" distL="0" distR="0">
-                      <wp:extent cx="3204000" cy="2022693"/>
-                      <wp:effectExtent l="0" t="0" r="0" b="0"/>
-                      <wp:docPr id="34" name="Picture 14"/>
-                      <wp:cNvGraphicFramePr>
-                        <a:graphicFrameLocks xmlns:a="http://schemas.openxmlformats.org/drawingml/2006/main" noChangeAspect="1"/>
-                      </wp:cNvGraphicFramePr>
-                      <a:graphic xmlns:a="http://schemas.openxmlformats.org/drawingml/2006/main">
-                        <a:graphicData uri="http://schemas.openxmlformats.org/drawingml/2006/picture">
-                          <pic:pic xmlns:pic="http://schemas.openxmlformats.org/drawingml/2006/picture">
-                            <pic:nvPicPr>
-                              <pic:cNvPr id="0" name="sol3_relacionados.png"/>
-                              <pic:cNvPicPr>
-                                <a:picLocks noChangeAspect="1"/>
-                              </pic:cNvPicPr>
-                              <pic:nvPr/>
-                            </pic:nvPicPr>
-                            <pic:blipFill rotWithShape="1">
-                              <a:blip r:embed="rId43"/>
-                              <a:stretch/>
-                            </pic:blipFill>
-                            <pic:spPr bwMode="auto">
-                              <a:xfrm>
-                                <a:off x="0" y="0"/>
-                                <a:ext cx="3204000" cy="2022693"/>
-                              </a:xfrm>
-                              <a:prstGeom prst="rect">
-                                <a:avLst/>
-                              </a:prstGeom>
-                            </pic:spPr>
-                          </pic:pic>
-                        </a:graphicData>
-                      </a:graphic>
-                    </wp:inline>
-                  </w:drawing>
-                </mc:Choice>
-                <mc:Fallback>
-                  <w:pict>
-                    <v:shapetype id="_x0000_t75" coordsize="21600,21600" o:spt="75" o:preferrelative="t" path="m@4@5l@4@11@9@11@9@5xe" filled="f" stroked="f">
-                      <v:stroke joinstyle="miter"/>
-                      <v:formulas>
-                        <v:f eqn="if lineDrawn pixelLineWidth 0"/>
-                        <v:f eqn="sum @0 1 0"/>
-                        <v:f eqn="sum 0 0 @1"/>
-                        <v:f eqn="prod @2 1 2"/>
-                        <v:f eqn="prod @3 21600 pixelWidth"/>
-                        <v:f eqn="prod @3 21600 pixelHeight"/>
-                        <v:f eqn="sum @0 0 1"/>
-                        <v:f eqn="prod @6 1 2"/>
-                        <v:f eqn="prod @7 21600 pixelWidth"/>
-                        <v:f eqn="sum @8 21600 0"/>
-                        <v:f eqn="prod @7 21600 pixelHeight"/>
-                        <v:f eqn="sum @10 21600 0"/>
-                      </v:formulas>
-                      <v:path o:extrusionok="f" gradientshapeok="t" o:connecttype="rect"/>
-                      <o:lock v:ext="edit" aspectratio="t"/>
-                    </v:shapetype>
-                    <v:shape id="_x0000_i33" o:spid="_x0000_s33" type="#_x0000_t75" style="width:252.28pt;height:159.27pt;mso-wrap-distance-left:0.00pt;mso-wrap-distance-top:0.00pt;mso-wrap-distance-right:0.00pt;mso-wrap-distance-bottom:0.00pt;z-index:1;" stroked="false">
-                      <v:imagedata r:id="rId43" o:title=""/>
-                      <o:lock v:ext="edit" rotation="t"/>
-                    </v:shape>
-                  </w:pict>
-                </mc:Fallback>
-              </mc:AlternateContent>
-            </w:r>
-            <w:r>
-              <w:rPr>
-                <w:lang w:val="es-US"/>
-              </w:rPr>
-            </w:r>
-            <w:r>
-              <w:rPr>
-                <w:lang w:val="es-US"/>
-              </w:rPr>
+              <w:drawing>
+                <wp:inline xmlns:pic="http://schemas.openxmlformats.org/drawingml/2006/picture">
+                  <wp:extent cx="3204000" cy="1680513"/>
+                  <wp:docPr id="2147119136" name="Picture 2147119136"/>
+                  <wp:cNvGraphicFramePr>
+                    <a:graphicFrameLocks noChangeAspect="1"/>
+                  </wp:cNvGraphicFramePr>
+                  <a:graphic>
+                    <a:graphicData uri="http://schemas.openxmlformats.org/drawingml/2006/picture">
+                      <pic:pic>
+                        <pic:nvPicPr>
+                          <pic:cNvPr id="0" name="sol3_relacionados.png"/>
+                          <pic:cNvPicPr/>
+                        </pic:nvPicPr>
+                        <pic:blipFill>
+                          <a:blip r:embed="rId65"/>
+                          <a:stretch>
+                            <a:fillRect/>
+                          </a:stretch>
+                        </pic:blipFill>
+                        <pic:spPr>
+                          <a:xfrm>
+                            <a:off x="0" y="0"/>
+                            <a:ext cx="3204000" cy="1680513"/>
+                          </a:xfrm>
+                          <a:prstGeom prst="rect"/>
+                        </pic:spPr>
+                      </pic:pic>
+                    </a:graphicData>
+                  </a:graphic>
+                </wp:inline>
+              </w:drawing>
             </w:r>
           </w:p>
         </w:tc>
@@ -30626,83 +30263,38 @@
               </w:rPr>
             </w:pPr>
             <w:r>
-              <mc:AlternateContent>
-                <mc:Choice Requires="wpg">
-                  <w:drawing>
-                    <wp:inline xmlns:wp="http://schemas.openxmlformats.org/drawingml/2006/wordprocessingDrawing" distT="0" distB="0" distL="0" distR="0">
-                      <wp:extent cx="3204000" cy="1377202"/>
-                      <wp:effectExtent l="0" t="0" r="0" b="0"/>
-                      <wp:docPr id="51" name="Picture 15"/>
-                      <wp:cNvGraphicFramePr>
-                        <a:graphicFrameLocks xmlns:a="http://schemas.openxmlformats.org/drawingml/2006/main" noChangeAspect="1"/>
-                      </wp:cNvGraphicFramePr>
-                      <a:graphic xmlns:a="http://schemas.openxmlformats.org/drawingml/2006/main">
-                        <a:graphicData uri="http://schemas.openxmlformats.org/drawingml/2006/picture">
-                          <pic:pic xmlns:pic="http://schemas.openxmlformats.org/drawingml/2006/picture">
-                            <pic:nvPicPr>
-                              <pic:cNvPr id="0" name="tar2_reporte.png"/>
-                              <pic:cNvPicPr>
-                                <a:picLocks noChangeAspect="1"/>
-                              </pic:cNvPicPr>
-                              <pic:nvPr/>
-                            </pic:nvPicPr>
-                            <pic:blipFill rotWithShape="1">
-                              <a:blip r:embed="rId56"/>
-                              <a:stretch/>
-                            </pic:blipFill>
-                            <pic:spPr bwMode="auto">
-                              <a:xfrm>
-                                <a:off x="0" y="0"/>
-                                <a:ext cx="3204000" cy="1377202"/>
-                              </a:xfrm>
-                              <a:prstGeom prst="rect">
-                                <a:avLst/>
-                              </a:prstGeom>
-                            </pic:spPr>
-                          </pic:pic>
-                        </a:graphicData>
-                      </a:graphic>
-                    </wp:inline>
-                  </w:drawing>
-                </mc:Choice>
-                <mc:Fallback>
-                  <w:pict>
-                    <v:shapetype id="_x0000_t75" coordsize="21600,21600" o:spt="75" o:preferrelative="t" path="m@4@5l@4@11@9@11@9@5xe" filled="f" stroked="f">
-                      <v:stroke joinstyle="miter"/>
-                      <v:formulas>
-                        <v:f eqn="if lineDrawn pixelLineWidth 0"/>
-                        <v:f eqn="sum @0 1 0"/>
-                        <v:f eqn="sum 0 0 @1"/>
-                        <v:f eqn="prod @2 1 2"/>
-                        <v:f eqn="prod @3 21600 pixelWidth"/>
-                        <v:f eqn="prod @3 21600 pixelHeight"/>
-                        <v:f eqn="sum @0 0 1"/>
-                        <v:f eqn="prod @6 1 2"/>
-                        <v:f eqn="prod @7 21600 pixelWidth"/>
-                        <v:f eqn="sum @8 21600 0"/>
-                        <v:f eqn="prod @7 21600 pixelHeight"/>
-                        <v:f eqn="sum @10 21600 0"/>
-                      </v:formulas>
-                      <v:path o:extrusionok="f" gradientshapeok="t" o:connecttype="rect"/>
-                      <o:lock v:ext="edit" aspectratio="t"/>
-                    </v:shapetype>
-                    <v:shape id="_x0000_i53" o:spid="_x0000_s53" type="#_x0000_t75" style="width:252.28pt;height:108.44pt;mso-wrap-distance-left:0.00pt;mso-wrap-distance-top:0.00pt;mso-wrap-distance-right:0.00pt;mso-wrap-distance-bottom:0.00pt;z-index:1;" stroked="false">
-                      <v:imagedata r:id="rId56" o:title=""/>
-                      <o:lock v:ext="edit" rotation="t"/>
-                    </v:shape>
-                  </w:pict>
-                </mc:Fallback>
-              </mc:AlternateContent>
-            </w:r>
-            <w:r>
-              <w:rPr>
-                <w:lang w:val="es-US"/>
-              </w:rPr>
-            </w:r>
-            <w:r>
-              <w:rPr>
-                <w:lang w:val="es-US"/>
-              </w:rPr>
+              <w:drawing>
+                <wp:inline xmlns:pic="http://schemas.openxmlformats.org/drawingml/2006/picture">
+                  <wp:extent cx="3204000" cy="1683854"/>
+                  <wp:docPr id="2147119137" name="Picture 2147119137"/>
+                  <wp:cNvGraphicFramePr>
+                    <a:graphicFrameLocks noChangeAspect="1"/>
+                  </wp:cNvGraphicFramePr>
+                  <a:graphic>
+                    <a:graphicData uri="http://schemas.openxmlformats.org/drawingml/2006/picture">
+                      <pic:pic>
+                        <pic:nvPicPr>
+                          <pic:cNvPr id="0" name="tar2_reporte.png"/>
+                          <pic:cNvPicPr/>
+                        </pic:nvPicPr>
+                        <pic:blipFill>
+                          <a:blip r:embed="rId66"/>
+                          <a:stretch>
+                            <a:fillRect/>
+                          </a:stretch>
+                        </pic:blipFill>
+                        <pic:spPr>
+                          <a:xfrm>
+                            <a:off x="0" y="0"/>
+                            <a:ext cx="3204000" cy="1683854"/>
+                          </a:xfrm>
+                          <a:prstGeom prst="rect"/>
+                        </pic:spPr>
+                      </pic:pic>
+                    </a:graphicData>
+                  </a:graphic>
+                </wp:inline>
+              </w:drawing>
             </w:r>
           </w:p>
         </w:tc>
@@ -30819,83 +30411,38 @@
               </w:rPr>
             </w:pPr>
             <w:r>
-              <mc:AlternateContent>
-                <mc:Choice Requires="wpg">
-                  <w:drawing>
-                    <wp:inline xmlns:wp="http://schemas.openxmlformats.org/drawingml/2006/wordprocessingDrawing" distT="0" distB="0" distL="0" distR="0">
-                      <wp:extent cx="3204000" cy="1377202"/>
-                      <wp:effectExtent l="0" t="0" r="0" b="0"/>
-                      <wp:docPr id="52" name="Picture 16"/>
-                      <wp:cNvGraphicFramePr>
-                        <a:graphicFrameLocks xmlns:a="http://schemas.openxmlformats.org/drawingml/2006/main" noChangeAspect="1"/>
-                      </wp:cNvGraphicFramePr>
-                      <a:graphic xmlns:a="http://schemas.openxmlformats.org/drawingml/2006/main">
-                        <a:graphicData uri="http://schemas.openxmlformats.org/drawingml/2006/picture">
-                          <pic:pic xmlns:pic="http://schemas.openxmlformats.org/drawingml/2006/picture">
-                            <pic:nvPicPr>
-                              <pic:cNvPr id="0" name="tar2_reporte.png"/>
-                              <pic:cNvPicPr>
-                                <a:picLocks noChangeAspect="1"/>
-                              </pic:cNvPicPr>
-                              <pic:nvPr/>
-                            </pic:nvPicPr>
-                            <pic:blipFill rotWithShape="1">
-                              <a:blip r:embed="rId56"/>
-                              <a:stretch/>
-                            </pic:blipFill>
-                            <pic:spPr bwMode="auto">
-                              <a:xfrm>
-                                <a:off x="0" y="0"/>
-                                <a:ext cx="3204000" cy="1377202"/>
-                              </a:xfrm>
-                              <a:prstGeom prst="rect">
-                                <a:avLst/>
-                              </a:prstGeom>
-                            </pic:spPr>
-                          </pic:pic>
-                        </a:graphicData>
-                      </a:graphic>
-                    </wp:inline>
-                  </w:drawing>
-                </mc:Choice>
-                <mc:Fallback>
-                  <w:pict>
-                    <v:shapetype id="_x0000_t75" coordsize="21600,21600" o:spt="75" o:preferrelative="t" path="m@4@5l@4@11@9@11@9@5xe" filled="f" stroked="f">
-                      <v:stroke joinstyle="miter"/>
-                      <v:formulas>
-                        <v:f eqn="if lineDrawn pixelLineWidth 0"/>
-                        <v:f eqn="sum @0 1 0"/>
-                        <v:f eqn="sum 0 0 @1"/>
-                        <v:f eqn="prod @2 1 2"/>
-                        <v:f eqn="prod @3 21600 pixelWidth"/>
-                        <v:f eqn="prod @3 21600 pixelHeight"/>
-                        <v:f eqn="sum @0 0 1"/>
-                        <v:f eqn="prod @6 1 2"/>
-                        <v:f eqn="prod @7 21600 pixelWidth"/>
-                        <v:f eqn="sum @8 21600 0"/>
-                        <v:f eqn="prod @7 21600 pixelHeight"/>
-                        <v:f eqn="sum @10 21600 0"/>
-                      </v:formulas>
-                      <v:path o:extrusionok="f" gradientshapeok="t" o:connecttype="rect"/>
-                      <o:lock v:ext="edit" aspectratio="t"/>
-                    </v:shapetype>
-                    <v:shape id="_x0000_i54" o:spid="_x0000_s54" type="#_x0000_t75" style="width:252.28pt;height:108.44pt;mso-wrap-distance-left:0.00pt;mso-wrap-distance-top:0.00pt;mso-wrap-distance-right:0.00pt;mso-wrap-distance-bottom:0.00pt;z-index:1;" stroked="false">
-                      <v:imagedata r:id="rId56" o:title=""/>
-                      <o:lock v:ext="edit" rotation="t"/>
-                    </v:shape>
-                  </w:pict>
-                </mc:Fallback>
-              </mc:AlternateContent>
-            </w:r>
-            <w:r>
-              <w:rPr>
-                <w:lang w:val="es-US"/>
-              </w:rPr>
-            </w:r>
-            <w:r>
-              <w:rPr>
-                <w:lang w:val="es-US"/>
-              </w:rPr>
+              <w:drawing>
+                <wp:inline xmlns:pic="http://schemas.openxmlformats.org/drawingml/2006/picture">
+                  <wp:extent cx="3204000" cy="1683854"/>
+                  <wp:docPr id="2147119138" name="Picture 2147119138"/>
+                  <wp:cNvGraphicFramePr>
+                    <a:graphicFrameLocks noChangeAspect="1"/>
+                  </wp:cNvGraphicFramePr>
+                  <a:graphic>
+                    <a:graphicData uri="http://schemas.openxmlformats.org/drawingml/2006/picture">
+                      <pic:pic>
+                        <pic:nvPicPr>
+                          <pic:cNvPr id="0" name="tar2_reporte.png"/>
+                          <pic:cNvPicPr/>
+                        </pic:nvPicPr>
+                        <pic:blipFill>
+                          <a:blip r:embed="rId66"/>
+                          <a:stretch>
+                            <a:fillRect/>
+                          </a:stretch>
+                        </pic:blipFill>
+                        <pic:spPr>
+                          <a:xfrm>
+                            <a:off x="0" y="0"/>
+                            <a:ext cx="3204000" cy="1683854"/>
+                          </a:xfrm>
+                          <a:prstGeom prst="rect"/>
+                        </pic:spPr>
+                      </pic:pic>
+                    </a:graphicData>
+                  </a:graphic>
+                </wp:inline>
+              </w:drawing>
             </w:r>
           </w:p>
         </w:tc>
@@ -31012,83 +30559,38 @@
               </w:rPr>
             </w:pPr>
             <w:r>
-              <mc:AlternateContent>
-                <mc:Choice Requires="wpg">
-                  <w:drawing>
-                    <wp:inline xmlns:wp="http://schemas.openxmlformats.org/drawingml/2006/wordprocessingDrawing" distT="0" distB="0" distL="0" distR="0">
-                      <wp:extent cx="3204000" cy="1377202"/>
-                      <wp:effectExtent l="0" t="0" r="0" b="0"/>
-                      <wp:docPr id="53" name="Picture 17"/>
-                      <wp:cNvGraphicFramePr>
-                        <a:graphicFrameLocks xmlns:a="http://schemas.openxmlformats.org/drawingml/2006/main" noChangeAspect="1"/>
-                      </wp:cNvGraphicFramePr>
-                      <a:graphic xmlns:a="http://schemas.openxmlformats.org/drawingml/2006/main">
-                        <a:graphicData uri="http://schemas.openxmlformats.org/drawingml/2006/picture">
-                          <pic:pic xmlns:pic="http://schemas.openxmlformats.org/drawingml/2006/picture">
-                            <pic:nvPicPr>
-                              <pic:cNvPr id="0" name="tar2_reporte.png"/>
-                              <pic:cNvPicPr>
-                                <a:picLocks noChangeAspect="1"/>
-                              </pic:cNvPicPr>
-                              <pic:nvPr/>
-                            </pic:nvPicPr>
-                            <pic:blipFill rotWithShape="1">
-                              <a:blip r:embed="rId56"/>
-                              <a:stretch/>
-                            </pic:blipFill>
-                            <pic:spPr bwMode="auto">
-                              <a:xfrm>
-                                <a:off x="0" y="0"/>
-                                <a:ext cx="3204000" cy="1377202"/>
-                              </a:xfrm>
-                              <a:prstGeom prst="rect">
-                                <a:avLst/>
-                              </a:prstGeom>
-                            </pic:spPr>
-                          </pic:pic>
-                        </a:graphicData>
-                      </a:graphic>
-                    </wp:inline>
-                  </w:drawing>
-                </mc:Choice>
-                <mc:Fallback>
-                  <w:pict>
-                    <v:shapetype id="_x0000_t75" coordsize="21600,21600" o:spt="75" o:preferrelative="t" path="m@4@5l@4@11@9@11@9@5xe" filled="f" stroked="f">
-                      <v:stroke joinstyle="miter"/>
-                      <v:formulas>
-                        <v:f eqn="if lineDrawn pixelLineWidth 0"/>
-                        <v:f eqn="sum @0 1 0"/>
-                        <v:f eqn="sum 0 0 @1"/>
-                        <v:f eqn="prod @2 1 2"/>
-                        <v:f eqn="prod @3 21600 pixelWidth"/>
-                        <v:f eqn="prod @3 21600 pixelHeight"/>
-                        <v:f eqn="sum @0 0 1"/>
-                        <v:f eqn="prod @6 1 2"/>
-                        <v:f eqn="prod @7 21600 pixelWidth"/>
-                        <v:f eqn="sum @8 21600 0"/>
-                        <v:f eqn="prod @7 21600 pixelHeight"/>
-                        <v:f eqn="sum @10 21600 0"/>
-                      </v:formulas>
-                      <v:path o:extrusionok="f" gradientshapeok="t" o:connecttype="rect"/>
-                      <o:lock v:ext="edit" aspectratio="t"/>
-                    </v:shapetype>
-                    <v:shape id="_x0000_i55" o:spid="_x0000_s55" type="#_x0000_t75" style="width:252.28pt;height:108.44pt;mso-wrap-distance-left:0.00pt;mso-wrap-distance-top:0.00pt;mso-wrap-distance-right:0.00pt;mso-wrap-distance-bottom:0.00pt;z-index:1;" stroked="false">
-                      <v:imagedata r:id="rId56" o:title=""/>
-                      <o:lock v:ext="edit" rotation="t"/>
-                    </v:shape>
-                  </w:pict>
-                </mc:Fallback>
-              </mc:AlternateContent>
-            </w:r>
-            <w:r>
-              <w:rPr>
-                <w:lang w:val="es-US"/>
-              </w:rPr>
-            </w:r>
-            <w:r>
-              <w:rPr>
-                <w:lang w:val="es-US"/>
-              </w:rPr>
+              <w:drawing>
+                <wp:inline xmlns:pic="http://schemas.openxmlformats.org/drawingml/2006/picture">
+                  <wp:extent cx="3204000" cy="1683854"/>
+                  <wp:docPr id="2147119139" name="Picture 2147119139"/>
+                  <wp:cNvGraphicFramePr>
+                    <a:graphicFrameLocks noChangeAspect="1"/>
+                  </wp:cNvGraphicFramePr>
+                  <a:graphic>
+                    <a:graphicData uri="http://schemas.openxmlformats.org/drawingml/2006/picture">
+                      <pic:pic>
+                        <pic:nvPicPr>
+                          <pic:cNvPr id="0" name="tar2_reporte.png"/>
+                          <pic:cNvPicPr/>
+                        </pic:nvPicPr>
+                        <pic:blipFill>
+                          <a:blip r:embed="rId66"/>
+                          <a:stretch>
+                            <a:fillRect/>
+                          </a:stretch>
+                        </pic:blipFill>
+                        <pic:spPr>
+                          <a:xfrm>
+                            <a:off x="0" y="0"/>
+                            <a:ext cx="3204000" cy="1683854"/>
+                          </a:xfrm>
+                          <a:prstGeom prst="rect"/>
+                        </pic:spPr>
+                      </pic:pic>
+                    </a:graphicData>
+                  </a:graphic>
+                </wp:inline>
+              </w:drawing>
             </w:r>
           </w:p>
         </w:tc>
@@ -31205,83 +30707,38 @@
               </w:rPr>
             </w:pPr>
             <w:r>
-              <mc:AlternateContent>
-                <mc:Choice Requires="wpg">
-                  <w:drawing>
-                    <wp:inline xmlns:wp="http://schemas.openxmlformats.org/drawingml/2006/wordprocessingDrawing" distT="0" distB="0" distL="0" distR="0">
-                      <wp:extent cx="3204000" cy="1377202"/>
-                      <wp:effectExtent l="0" t="0" r="0" b="0"/>
-                      <wp:docPr id="54" name="Picture 18"/>
-                      <wp:cNvGraphicFramePr>
-                        <a:graphicFrameLocks xmlns:a="http://schemas.openxmlformats.org/drawingml/2006/main" noChangeAspect="1"/>
-                      </wp:cNvGraphicFramePr>
-                      <a:graphic xmlns:a="http://schemas.openxmlformats.org/drawingml/2006/main">
-                        <a:graphicData uri="http://schemas.openxmlformats.org/drawingml/2006/picture">
-                          <pic:pic xmlns:pic="http://schemas.openxmlformats.org/drawingml/2006/picture">
-                            <pic:nvPicPr>
-                              <pic:cNvPr id="0" name="tar2_reporte.png"/>
-                              <pic:cNvPicPr>
-                                <a:picLocks noChangeAspect="1"/>
-                              </pic:cNvPicPr>
-                              <pic:nvPr/>
-                            </pic:nvPicPr>
-                            <pic:blipFill rotWithShape="1">
-                              <a:blip r:embed="rId56"/>
-                              <a:stretch/>
-                            </pic:blipFill>
-                            <pic:spPr bwMode="auto">
-                              <a:xfrm>
-                                <a:off x="0" y="0"/>
-                                <a:ext cx="3204000" cy="1377202"/>
-                              </a:xfrm>
-                              <a:prstGeom prst="rect">
-                                <a:avLst/>
-                              </a:prstGeom>
-                            </pic:spPr>
-                          </pic:pic>
-                        </a:graphicData>
-                      </a:graphic>
-                    </wp:inline>
-                  </w:drawing>
-                </mc:Choice>
-                <mc:Fallback>
-                  <w:pict>
-                    <v:shapetype id="_x0000_t75" coordsize="21600,21600" o:spt="75" o:preferrelative="t" path="m@4@5l@4@11@9@11@9@5xe" filled="f" stroked="f">
-                      <v:stroke joinstyle="miter"/>
-                      <v:formulas>
-                        <v:f eqn="if lineDrawn pixelLineWidth 0"/>
-                        <v:f eqn="sum @0 1 0"/>
-                        <v:f eqn="sum 0 0 @1"/>
-                        <v:f eqn="prod @2 1 2"/>
-                        <v:f eqn="prod @3 21600 pixelWidth"/>
-                        <v:f eqn="prod @3 21600 pixelHeight"/>
-                        <v:f eqn="sum @0 0 1"/>
-                        <v:f eqn="prod @6 1 2"/>
-                        <v:f eqn="prod @7 21600 pixelWidth"/>
-                        <v:f eqn="sum @8 21600 0"/>
-                        <v:f eqn="prod @7 21600 pixelHeight"/>
-                        <v:f eqn="sum @10 21600 0"/>
-                      </v:formulas>
-                      <v:path o:extrusionok="f" gradientshapeok="t" o:connecttype="rect"/>
-                      <o:lock v:ext="edit" aspectratio="t"/>
-                    </v:shapetype>
-                    <v:shape id="_x0000_i56" o:spid="_x0000_s56" type="#_x0000_t75" style="width:252.28pt;height:108.44pt;mso-wrap-distance-left:0.00pt;mso-wrap-distance-top:0.00pt;mso-wrap-distance-right:0.00pt;mso-wrap-distance-bottom:0.00pt;z-index:1;" stroked="false">
-                      <v:imagedata r:id="rId56" o:title=""/>
-                      <o:lock v:ext="edit" rotation="t"/>
-                    </v:shape>
-                  </w:pict>
-                </mc:Fallback>
-              </mc:AlternateContent>
-            </w:r>
-            <w:r>
-              <w:rPr>
-                <w:lang w:val="es-US"/>
-              </w:rPr>
-            </w:r>
-            <w:r>
-              <w:rPr>
-                <w:lang w:val="es-US"/>
-              </w:rPr>
+              <w:drawing>
+                <wp:inline xmlns:pic="http://schemas.openxmlformats.org/drawingml/2006/picture">
+                  <wp:extent cx="3204000" cy="1683854"/>
+                  <wp:docPr id="2147119140" name="Picture 2147119140"/>
+                  <wp:cNvGraphicFramePr>
+                    <a:graphicFrameLocks noChangeAspect="1"/>
+                  </wp:cNvGraphicFramePr>
+                  <a:graphic>
+                    <a:graphicData uri="http://schemas.openxmlformats.org/drawingml/2006/picture">
+                      <pic:pic>
+                        <pic:nvPicPr>
+                          <pic:cNvPr id="0" name="tar2_reporte.png"/>
+                          <pic:cNvPicPr/>
+                        </pic:nvPicPr>
+                        <pic:blipFill>
+                          <a:blip r:embed="rId66"/>
+                          <a:stretch>
+                            <a:fillRect/>
+                          </a:stretch>
+                        </pic:blipFill>
+                        <pic:spPr>
+                          <a:xfrm>
+                            <a:off x="0" y="0"/>
+                            <a:ext cx="3204000" cy="1683854"/>
+                          </a:xfrm>
+                          <a:prstGeom prst="rect"/>
+                        </pic:spPr>
+                      </pic:pic>
+                    </a:graphicData>
+                  </a:graphic>
+                </wp:inline>
+              </w:drawing>
             </w:r>
           </w:p>
         </w:tc>
@@ -32286,83 +31743,38 @@
               </w:rPr>
             </w:pPr>
             <w:r>
-              <mc:AlternateContent>
-                <mc:Choice Requires="wpg">
-                  <w:drawing>
-                    <wp:inline xmlns:wp="http://schemas.openxmlformats.org/drawingml/2006/wordprocessingDrawing" distT="0" distB="0" distL="0" distR="0">
-                      <wp:extent cx="3204000" cy="1376484"/>
-                      <wp:effectExtent l="0" t="0" r="0" b="0"/>
-                      <wp:docPr id="55" name="Picture 19"/>
-                      <wp:cNvGraphicFramePr>
-                        <a:graphicFrameLocks xmlns:a="http://schemas.openxmlformats.org/drawingml/2006/main" noChangeAspect="1"/>
-                      </wp:cNvGraphicFramePr>
-                      <a:graphic xmlns:a="http://schemas.openxmlformats.org/drawingml/2006/main">
-                        <a:graphicData uri="http://schemas.openxmlformats.org/drawingml/2006/picture">
-                          <pic:pic xmlns:pic="http://schemas.openxmlformats.org/drawingml/2006/picture">
-                            <pic:nvPicPr>
-                              <pic:cNvPr id="0" name="tar3_reporte.png"/>
-                              <pic:cNvPicPr>
-                                <a:picLocks noChangeAspect="1"/>
-                              </pic:cNvPicPr>
-                              <pic:nvPr/>
-                            </pic:nvPicPr>
-                            <pic:blipFill rotWithShape="1">
-                              <a:blip r:embed="rId57"/>
-                              <a:stretch/>
-                            </pic:blipFill>
-                            <pic:spPr bwMode="auto">
-                              <a:xfrm>
-                                <a:off x="0" y="0"/>
-                                <a:ext cx="3204000" cy="1376484"/>
-                              </a:xfrm>
-                              <a:prstGeom prst="rect">
-                                <a:avLst/>
-                              </a:prstGeom>
-                            </pic:spPr>
-                          </pic:pic>
-                        </a:graphicData>
-                      </a:graphic>
-                    </wp:inline>
-                  </w:drawing>
-                </mc:Choice>
-                <mc:Fallback>
-                  <w:pict>
-                    <v:shapetype id="_x0000_t75" coordsize="21600,21600" o:spt="75" o:preferrelative="t" path="m@4@5l@4@11@9@11@9@5xe" filled="f" stroked="f">
-                      <v:stroke joinstyle="miter"/>
-                      <v:formulas>
-                        <v:f eqn="if lineDrawn pixelLineWidth 0"/>
-                        <v:f eqn="sum @0 1 0"/>
-                        <v:f eqn="sum 0 0 @1"/>
-                        <v:f eqn="prod @2 1 2"/>
-                        <v:f eqn="prod @3 21600 pixelWidth"/>
-                        <v:f eqn="prod @3 21600 pixelHeight"/>
-                        <v:f eqn="sum @0 0 1"/>
-                        <v:f eqn="prod @6 1 2"/>
-                        <v:f eqn="prod @7 21600 pixelWidth"/>
-                        <v:f eqn="sum @8 21600 0"/>
-                        <v:f eqn="prod @7 21600 pixelHeight"/>
-                        <v:f eqn="sum @10 21600 0"/>
-                      </v:formulas>
-                      <v:path o:extrusionok="f" gradientshapeok="t" o:connecttype="rect"/>
-                      <o:lock v:ext="edit" aspectratio="t"/>
-                    </v:shapetype>
-                    <v:shape id="_x0000_i57" o:spid="_x0000_s57" type="#_x0000_t75" style="width:252.28pt;height:108.38pt;mso-wrap-distance-left:0.00pt;mso-wrap-distance-top:0.00pt;mso-wrap-distance-right:0.00pt;mso-wrap-distance-bottom:0.00pt;z-index:1;" stroked="false">
-                      <v:imagedata r:id="rId57" o:title=""/>
-                      <o:lock v:ext="edit" rotation="t"/>
-                    </v:shape>
-                  </w:pict>
-                </mc:Fallback>
-              </mc:AlternateContent>
-            </w:r>
-            <w:r>
-              <w:rPr>
-                <w:lang w:val="es-US"/>
-              </w:rPr>
-            </w:r>
-            <w:r>
-              <w:rPr>
-                <w:lang w:val="es-US"/>
-              </w:rPr>
+              <w:drawing>
+                <wp:inline xmlns:pic="http://schemas.openxmlformats.org/drawingml/2006/picture">
+                  <wp:extent cx="3204000" cy="1688865"/>
+                  <wp:docPr id="2147119141" name="Picture 2147119141"/>
+                  <wp:cNvGraphicFramePr>
+                    <a:graphicFrameLocks noChangeAspect="1"/>
+                  </wp:cNvGraphicFramePr>
+                  <a:graphic>
+                    <a:graphicData uri="http://schemas.openxmlformats.org/drawingml/2006/picture">
+                      <pic:pic>
+                        <pic:nvPicPr>
+                          <pic:cNvPr id="0" name="tar3_reporte.png"/>
+                          <pic:cNvPicPr/>
+                        </pic:nvPicPr>
+                        <pic:blipFill>
+                          <a:blip r:embed="rId67"/>
+                          <a:stretch>
+                            <a:fillRect/>
+                          </a:stretch>
+                        </pic:blipFill>
+                        <pic:spPr>
+                          <a:xfrm>
+                            <a:off x="0" y="0"/>
+                            <a:ext cx="3204000" cy="1688865"/>
+                          </a:xfrm>
+                          <a:prstGeom prst="rect"/>
+                        </pic:spPr>
+                      </pic:pic>
+                    </a:graphicData>
+                  </a:graphic>
+                </wp:inline>
+              </w:drawing>
             </w:r>
           </w:p>
         </w:tc>
@@ -32479,83 +31891,38 @@
               </w:rPr>
             </w:pPr>
             <w:r>
-              <mc:AlternateContent>
-                <mc:Choice Requires="wpg">
-                  <w:drawing>
-                    <wp:inline xmlns:wp="http://schemas.openxmlformats.org/drawingml/2006/wordprocessingDrawing" distT="0" distB="0" distL="0" distR="0">
-                      <wp:extent cx="3204000" cy="1376484"/>
-                      <wp:effectExtent l="0" t="0" r="0" b="0"/>
-                      <wp:docPr id="56" name="Picture 20"/>
-                      <wp:cNvGraphicFramePr>
-                        <a:graphicFrameLocks xmlns:a="http://schemas.openxmlformats.org/drawingml/2006/main" noChangeAspect="1"/>
-                      </wp:cNvGraphicFramePr>
-                      <a:graphic xmlns:a="http://schemas.openxmlformats.org/drawingml/2006/main">
-                        <a:graphicData uri="http://schemas.openxmlformats.org/drawingml/2006/picture">
-                          <pic:pic xmlns:pic="http://schemas.openxmlformats.org/drawingml/2006/picture">
-                            <pic:nvPicPr>
-                              <pic:cNvPr id="0" name="tar3_reporte.png"/>
-                              <pic:cNvPicPr>
-                                <a:picLocks noChangeAspect="1"/>
-                              </pic:cNvPicPr>
-                              <pic:nvPr/>
-                            </pic:nvPicPr>
-                            <pic:blipFill rotWithShape="1">
-                              <a:blip r:embed="rId57"/>
-                              <a:stretch/>
-                            </pic:blipFill>
-                            <pic:spPr bwMode="auto">
-                              <a:xfrm>
-                                <a:off x="0" y="0"/>
-                                <a:ext cx="3204000" cy="1376484"/>
-                              </a:xfrm>
-                              <a:prstGeom prst="rect">
-                                <a:avLst/>
-                              </a:prstGeom>
-                            </pic:spPr>
-                          </pic:pic>
-                        </a:graphicData>
-                      </a:graphic>
-                    </wp:inline>
-                  </w:drawing>
-                </mc:Choice>
-                <mc:Fallback>
-                  <w:pict>
-                    <v:shapetype id="_x0000_t75" coordsize="21600,21600" o:spt="75" o:preferrelative="t" path="m@4@5l@4@11@9@11@9@5xe" filled="f" stroked="f">
-                      <v:stroke joinstyle="miter"/>
-                      <v:formulas>
-                        <v:f eqn="if lineDrawn pixelLineWidth 0"/>
-                        <v:f eqn="sum @0 1 0"/>
-                        <v:f eqn="sum 0 0 @1"/>
-                        <v:f eqn="prod @2 1 2"/>
-                        <v:f eqn="prod @3 21600 pixelWidth"/>
-                        <v:f eqn="prod @3 21600 pixelHeight"/>
-                        <v:f eqn="sum @0 0 1"/>
-                        <v:f eqn="prod @6 1 2"/>
-                        <v:f eqn="prod @7 21600 pixelWidth"/>
-                        <v:f eqn="sum @8 21600 0"/>
-                        <v:f eqn="prod @7 21600 pixelHeight"/>
-                        <v:f eqn="sum @10 21600 0"/>
-                      </v:formulas>
-                      <v:path o:extrusionok="f" gradientshapeok="t" o:connecttype="rect"/>
-                      <o:lock v:ext="edit" aspectratio="t"/>
-                    </v:shapetype>
-                    <v:shape id="_x0000_i58" o:spid="_x0000_s58" type="#_x0000_t75" style="width:252.28pt;height:108.38pt;mso-wrap-distance-left:0.00pt;mso-wrap-distance-top:0.00pt;mso-wrap-distance-right:0.00pt;mso-wrap-distance-bottom:0.00pt;z-index:1;" stroked="false">
-                      <v:imagedata r:id="rId57" o:title=""/>
-                      <o:lock v:ext="edit" rotation="t"/>
-                    </v:shape>
-                  </w:pict>
-                </mc:Fallback>
-              </mc:AlternateContent>
-            </w:r>
-            <w:r>
-              <w:rPr>
-                <w:lang w:val="es-US"/>
-              </w:rPr>
-            </w:r>
-            <w:r>
-              <w:rPr>
-                <w:lang w:val="es-US"/>
-              </w:rPr>
+              <w:drawing>
+                <wp:inline xmlns:pic="http://schemas.openxmlformats.org/drawingml/2006/picture">
+                  <wp:extent cx="3204000" cy="1688865"/>
+                  <wp:docPr id="2147119142" name="Picture 2147119142"/>
+                  <wp:cNvGraphicFramePr>
+                    <a:graphicFrameLocks noChangeAspect="1"/>
+                  </wp:cNvGraphicFramePr>
+                  <a:graphic>
+                    <a:graphicData uri="http://schemas.openxmlformats.org/drawingml/2006/picture">
+                      <pic:pic>
+                        <pic:nvPicPr>
+                          <pic:cNvPr id="0" name="tar3_reporte.png"/>
+                          <pic:cNvPicPr/>
+                        </pic:nvPicPr>
+                        <pic:blipFill>
+                          <a:blip r:embed="rId67"/>
+                          <a:stretch>
+                            <a:fillRect/>
+                          </a:stretch>
+                        </pic:blipFill>
+                        <pic:spPr>
+                          <a:xfrm>
+                            <a:off x="0" y="0"/>
+                            <a:ext cx="3204000" cy="1688865"/>
+                          </a:xfrm>
+                          <a:prstGeom prst="rect"/>
+                        </pic:spPr>
+                      </pic:pic>
+                    </a:graphicData>
+                  </a:graphic>
+                </wp:inline>
+              </w:drawing>
             </w:r>
           </w:p>
         </w:tc>
@@ -32672,83 +32039,38 @@
               </w:rPr>
             </w:pPr>
             <w:r>
-              <mc:AlternateContent>
-                <mc:Choice Requires="wpg">
-                  <w:drawing>
-                    <wp:inline xmlns:wp="http://schemas.openxmlformats.org/drawingml/2006/wordprocessingDrawing" distT="0" distB="0" distL="0" distR="0">
-                      <wp:extent cx="3204000" cy="1376484"/>
-                      <wp:effectExtent l="0" t="0" r="0" b="0"/>
-                      <wp:docPr id="57" name="Picture 21"/>
-                      <wp:cNvGraphicFramePr>
-                        <a:graphicFrameLocks xmlns:a="http://schemas.openxmlformats.org/drawingml/2006/main" noChangeAspect="1"/>
-                      </wp:cNvGraphicFramePr>
-                      <a:graphic xmlns:a="http://schemas.openxmlformats.org/drawingml/2006/main">
-                        <a:graphicData uri="http://schemas.openxmlformats.org/drawingml/2006/picture">
-                          <pic:pic xmlns:pic="http://schemas.openxmlformats.org/drawingml/2006/picture">
-                            <pic:nvPicPr>
-                              <pic:cNvPr id="0" name="tar3_reporte.png"/>
-                              <pic:cNvPicPr>
-                                <a:picLocks noChangeAspect="1"/>
-                              </pic:cNvPicPr>
-                              <pic:nvPr/>
-                            </pic:nvPicPr>
-                            <pic:blipFill rotWithShape="1">
-                              <a:blip r:embed="rId57"/>
-                              <a:stretch/>
-                            </pic:blipFill>
-                            <pic:spPr bwMode="auto">
-                              <a:xfrm>
-                                <a:off x="0" y="0"/>
-                                <a:ext cx="3204000" cy="1376484"/>
-                              </a:xfrm>
-                              <a:prstGeom prst="rect">
-                                <a:avLst/>
-                              </a:prstGeom>
-                            </pic:spPr>
-                          </pic:pic>
-                        </a:graphicData>
-                      </a:graphic>
-                    </wp:inline>
-                  </w:drawing>
-                </mc:Choice>
-                <mc:Fallback>
-                  <w:pict>
-                    <v:shapetype id="_x0000_t75" coordsize="21600,21600" o:spt="75" o:preferrelative="t" path="m@4@5l@4@11@9@11@9@5xe" filled="f" stroked="f">
-                      <v:stroke joinstyle="miter"/>
-                      <v:formulas>
-                        <v:f eqn="if lineDrawn pixelLineWidth 0"/>
-                        <v:f eqn="sum @0 1 0"/>
-                        <v:f eqn="sum 0 0 @1"/>
-                        <v:f eqn="prod @2 1 2"/>
-                        <v:f eqn="prod @3 21600 pixelWidth"/>
-                        <v:f eqn="prod @3 21600 pixelHeight"/>
-                        <v:f eqn="sum @0 0 1"/>
-                        <v:f eqn="prod @6 1 2"/>
-                        <v:f eqn="prod @7 21600 pixelWidth"/>
-                        <v:f eqn="sum @8 21600 0"/>
-                        <v:f eqn="prod @7 21600 pixelHeight"/>
-                        <v:f eqn="sum @10 21600 0"/>
-                      </v:formulas>
-                      <v:path o:extrusionok="f" gradientshapeok="t" o:connecttype="rect"/>
-                      <o:lock v:ext="edit" aspectratio="t"/>
-                    </v:shapetype>
-                    <v:shape id="_x0000_i59" o:spid="_x0000_s59" type="#_x0000_t75" style="width:252.28pt;height:108.38pt;mso-wrap-distance-left:0.00pt;mso-wrap-distance-top:0.00pt;mso-wrap-distance-right:0.00pt;mso-wrap-distance-bottom:0.00pt;z-index:1;" stroked="false">
-                      <v:imagedata r:id="rId57" o:title=""/>
-                      <o:lock v:ext="edit" rotation="t"/>
-                    </v:shape>
-                  </w:pict>
-                </mc:Fallback>
-              </mc:AlternateContent>
-            </w:r>
-            <w:r>
-              <w:rPr>
-                <w:lang w:val="es-US"/>
-              </w:rPr>
-            </w:r>
-            <w:r>
-              <w:rPr>
-                <w:lang w:val="es-US"/>
-              </w:rPr>
+              <w:drawing>
+                <wp:inline xmlns:pic="http://schemas.openxmlformats.org/drawingml/2006/picture">
+                  <wp:extent cx="3204000" cy="1688865"/>
+                  <wp:docPr id="2147119143" name="Picture 2147119143"/>
+                  <wp:cNvGraphicFramePr>
+                    <a:graphicFrameLocks noChangeAspect="1"/>
+                  </wp:cNvGraphicFramePr>
+                  <a:graphic>
+                    <a:graphicData uri="http://schemas.openxmlformats.org/drawingml/2006/picture">
+                      <pic:pic>
+                        <pic:nvPicPr>
+                          <pic:cNvPr id="0" name="tar3_reporte.png"/>
+                          <pic:cNvPicPr/>
+                        </pic:nvPicPr>
+                        <pic:blipFill>
+                          <a:blip r:embed="rId67"/>
+                          <a:stretch>
+                            <a:fillRect/>
+                          </a:stretch>
+                        </pic:blipFill>
+                        <pic:spPr>
+                          <a:xfrm>
+                            <a:off x="0" y="0"/>
+                            <a:ext cx="3204000" cy="1688865"/>
+                          </a:xfrm>
+                          <a:prstGeom prst="rect"/>
+                        </pic:spPr>
+                      </pic:pic>
+                    </a:graphicData>
+                  </a:graphic>
+                </wp:inline>
+              </w:drawing>
             </w:r>
           </w:p>
         </w:tc>
@@ -32873,83 +32195,38 @@
               </w:rPr>
             </w:pPr>
             <w:r>
-              <mc:AlternateContent>
-                <mc:Choice Requires="wpg">
-                  <w:drawing>
-                    <wp:inline xmlns:wp="http://schemas.openxmlformats.org/drawingml/2006/wordprocessingDrawing" distT="0" distB="0" distL="0" distR="0">
-                      <wp:extent cx="3204000" cy="1376484"/>
-                      <wp:effectExtent l="0" t="0" r="0" b="0"/>
-                      <wp:docPr id="58" name="Picture 22"/>
-                      <wp:cNvGraphicFramePr>
-                        <a:graphicFrameLocks xmlns:a="http://schemas.openxmlformats.org/drawingml/2006/main" noChangeAspect="1"/>
-                      </wp:cNvGraphicFramePr>
-                      <a:graphic xmlns:a="http://schemas.openxmlformats.org/drawingml/2006/main">
-                        <a:graphicData uri="http://schemas.openxmlformats.org/drawingml/2006/picture">
-                          <pic:pic xmlns:pic="http://schemas.openxmlformats.org/drawingml/2006/picture">
-                            <pic:nvPicPr>
-                              <pic:cNvPr id="0" name="tar3_reporte.png"/>
-                              <pic:cNvPicPr>
-                                <a:picLocks noChangeAspect="1"/>
-                              </pic:cNvPicPr>
-                              <pic:nvPr/>
-                            </pic:nvPicPr>
-                            <pic:blipFill rotWithShape="1">
-                              <a:blip r:embed="rId57"/>
-                              <a:stretch/>
-                            </pic:blipFill>
-                            <pic:spPr bwMode="auto">
-                              <a:xfrm>
-                                <a:off x="0" y="0"/>
-                                <a:ext cx="3204000" cy="1376484"/>
-                              </a:xfrm>
-                              <a:prstGeom prst="rect">
-                                <a:avLst/>
-                              </a:prstGeom>
-                            </pic:spPr>
-                          </pic:pic>
-                        </a:graphicData>
-                      </a:graphic>
-                    </wp:inline>
-                  </w:drawing>
-                </mc:Choice>
-                <mc:Fallback>
-                  <w:pict>
-                    <v:shapetype id="_x0000_t75" coordsize="21600,21600" o:spt="75" o:preferrelative="t" path="m@4@5l@4@11@9@11@9@5xe" filled="f" stroked="f">
-                      <v:stroke joinstyle="miter"/>
-                      <v:formulas>
-                        <v:f eqn="if lineDrawn pixelLineWidth 0"/>
-                        <v:f eqn="sum @0 1 0"/>
-                        <v:f eqn="sum 0 0 @1"/>
-                        <v:f eqn="prod @2 1 2"/>
-                        <v:f eqn="prod @3 21600 pixelWidth"/>
-                        <v:f eqn="prod @3 21600 pixelHeight"/>
-                        <v:f eqn="sum @0 0 1"/>
-                        <v:f eqn="prod @6 1 2"/>
-                        <v:f eqn="prod @7 21600 pixelWidth"/>
-                        <v:f eqn="sum @8 21600 0"/>
-                        <v:f eqn="prod @7 21600 pixelHeight"/>
-                        <v:f eqn="sum @10 21600 0"/>
-                      </v:formulas>
-                      <v:path o:extrusionok="f" gradientshapeok="t" o:connecttype="rect"/>
-                      <o:lock v:ext="edit" aspectratio="t"/>
-                    </v:shapetype>
-                    <v:shape id="_x0000_i60" o:spid="_x0000_s60" type="#_x0000_t75" style="width:252.28pt;height:108.38pt;mso-wrap-distance-left:0.00pt;mso-wrap-distance-top:0.00pt;mso-wrap-distance-right:0.00pt;mso-wrap-distance-bottom:0.00pt;z-index:1;" stroked="false">
-                      <v:imagedata r:id="rId57" o:title=""/>
-                      <o:lock v:ext="edit" rotation="t"/>
-                    </v:shape>
-                  </w:pict>
-                </mc:Fallback>
-              </mc:AlternateContent>
-            </w:r>
-            <w:r>
-              <w:rPr>
-                <w:lang w:val="es-US"/>
-              </w:rPr>
-            </w:r>
-            <w:r>
-              <w:rPr>
-                <w:lang w:val="es-US"/>
-              </w:rPr>
+              <w:drawing>
+                <wp:inline xmlns:pic="http://schemas.openxmlformats.org/drawingml/2006/picture">
+                  <wp:extent cx="3204000" cy="1688865"/>
+                  <wp:docPr id="2147119144" name="Picture 2147119144"/>
+                  <wp:cNvGraphicFramePr>
+                    <a:graphicFrameLocks noChangeAspect="1"/>
+                  </wp:cNvGraphicFramePr>
+                  <a:graphic>
+                    <a:graphicData uri="http://schemas.openxmlformats.org/drawingml/2006/picture">
+                      <pic:pic>
+                        <pic:nvPicPr>
+                          <pic:cNvPr id="0" name="tar3_reporte.png"/>
+                          <pic:cNvPicPr/>
+                        </pic:nvPicPr>
+                        <pic:blipFill>
+                          <a:blip r:embed="rId67"/>
+                          <a:stretch>
+                            <a:fillRect/>
+                          </a:stretch>
+                        </pic:blipFill>
+                        <pic:spPr>
+                          <a:xfrm>
+                            <a:off x="0" y="0"/>
+                            <a:ext cx="3204000" cy="1688865"/>
+                          </a:xfrm>
+                          <a:prstGeom prst="rect"/>
+                        </pic:spPr>
+                      </pic:pic>
+                    </a:graphicData>
+                  </a:graphic>
+                </wp:inline>
+              </w:drawing>
             </w:r>
           </w:p>
         </w:tc>

</xml_diff>